<commit_message>
drobne zmiany w raporcie
</commit_message>
<xml_diff>
--- a/raport_wstepny.docx
+++ b/raport_wstepny.docx
@@ -1,6 +1,6 @@
 
 <file path=word/document.xml><?xml version="1.0" encoding="utf-8"?>
-<w:document xmlns:wpc="http://schemas.microsoft.com/office/word/2010/wordprocessingCanvas" xmlns:cx="http://schemas.microsoft.com/office/drawing/2014/chartex" xmlns:cx1="http://schemas.microsoft.com/office/drawing/2015/9/8/chartex" xmlns:cx2="http://schemas.microsoft.com/office/drawing/2015/10/21/chartex" xmlns:cx3="http://schemas.microsoft.com/office/drawing/2016/5/9/chartex" xmlns:cx4="http://schemas.microsoft.com/office/drawing/2016/5/10/chartex" xmlns:cx5="http://schemas.microsoft.com/office/drawing/2016/5/11/chartex" xmlns:cx6="http://schemas.microsoft.com/office/drawing/2016/5/12/chartex" xmlns:cx7="http://schemas.microsoft.com/office/drawing/2016/5/13/chartex" xmlns:cx8="http://schemas.microsoft.com/office/drawing/2016/5/14/chartex" xmlns:mc="http://schemas.openxmlformats.org/markup-compatibility/2006" xmlns:aink="http://schemas.microsoft.com/office/drawing/2016/ink" xmlns:am3d="http://schemas.microsoft.com/office/drawing/2017/model3d" xmlns:o="urn:schemas-microsoft-com:office:office" xmlns:oel="http://schemas.microsoft.com/office/2019/extlst" xmlns:r="http://schemas.openxmlformats.org/officeDocument/2006/relationships" xmlns:m="http://schemas.openxmlformats.org/officeDocument/2006/math" xmlns:v="urn:schemas-microsoft-com:vml" xmlns:wp14="http://schemas.microsoft.com/office/word/2010/wordprocessingDrawing" xmlns:wp="http://schemas.openxmlformats.org/drawingml/2006/wordprocessingDrawing" xmlns:w10="urn:schemas-microsoft-com:office:word" xmlns:w="http://schemas.openxmlformats.org/wordprocessingml/2006/main" xmlns:w14="http://schemas.microsoft.com/office/word/2010/wordml" xmlns:w15="http://schemas.microsoft.com/office/word/2012/wordml" xmlns:w16cex="http://schemas.microsoft.com/office/word/2018/wordml/cex" xmlns:w16cid="http://schemas.microsoft.com/office/word/2016/wordml/cid" xmlns:w16="http://schemas.microsoft.com/office/word/2018/wordml" xmlns:w16sdtdh="http://schemas.microsoft.com/office/word/2020/wordml/sdtdatahash" xmlns:w16se="http://schemas.microsoft.com/office/word/2015/wordml/symex" xmlns:wpg="http://schemas.microsoft.com/office/word/2010/wordprocessingGroup" xmlns:wpi="http://schemas.microsoft.com/office/word/2010/wordprocessingInk" xmlns:wne="http://schemas.microsoft.com/office/word/2006/wordml" xmlns:wps="http://schemas.microsoft.com/office/word/2010/wordprocessingShape" mc:Ignorable="w14 w15 w16se w16cid w16 w16cex w16sdtdh wp14">
+<w:document xmlns:wpc="http://schemas.microsoft.com/office/word/2010/wordprocessingCanvas" xmlns:cx="http://schemas.microsoft.com/office/drawing/2014/chartex" xmlns:cx1="http://schemas.microsoft.com/office/drawing/2015/9/8/chartex" xmlns:cx2="http://schemas.microsoft.com/office/drawing/2015/10/21/chartex" xmlns:cx3="http://schemas.microsoft.com/office/drawing/2016/5/9/chartex" xmlns:cx4="http://schemas.microsoft.com/office/drawing/2016/5/10/chartex" xmlns:cx5="http://schemas.microsoft.com/office/drawing/2016/5/11/chartex" xmlns:cx6="http://schemas.microsoft.com/office/drawing/2016/5/12/chartex" xmlns:cx7="http://schemas.microsoft.com/office/drawing/2016/5/13/chartex" xmlns:cx8="http://schemas.microsoft.com/office/drawing/2016/5/14/chartex" xmlns:mc="http://schemas.openxmlformats.org/markup-compatibility/2006" xmlns:aink="http://schemas.microsoft.com/office/drawing/2016/ink" xmlns:am3d="http://schemas.microsoft.com/office/drawing/2017/model3d" xmlns:o="urn:schemas-microsoft-com:office:office" xmlns:oel="http://schemas.microsoft.com/office/2019/extlst" xmlns:r="http://schemas.openxmlformats.org/officeDocument/2006/relationships" xmlns:m="http://schemas.openxmlformats.org/officeDocument/2006/math" xmlns:v="urn:schemas-microsoft-com:vml" xmlns:wp14="http://schemas.microsoft.com/office/word/2010/wordprocessingDrawing" xmlns:wp="http://schemas.openxmlformats.org/drawingml/2006/wordprocessingDrawing" xmlns:w10="urn:schemas-microsoft-com:office:word" xmlns:w="http://schemas.openxmlformats.org/wordprocessingml/2006/main" xmlns:w14="http://schemas.microsoft.com/office/word/2010/wordml" xmlns:w15="http://schemas.microsoft.com/office/word/2012/wordml" xmlns:w16cex="http://schemas.microsoft.com/office/word/2018/wordml/cex" xmlns:w16cid="http://schemas.microsoft.com/office/word/2016/wordml/cid" xmlns:w16="http://schemas.microsoft.com/office/word/2018/wordml" xmlns:w16du="http://schemas.microsoft.com/office/word/2023/wordml/word16du" xmlns:w16sdtdh="http://schemas.microsoft.com/office/word/2020/wordml/sdtdatahash" xmlns:w16sdtfl="http://schemas.microsoft.com/office/word/2024/wordml/sdtformatlock" xmlns:w16se="http://schemas.microsoft.com/office/word/2015/wordml/symex" xmlns:wpg="http://schemas.microsoft.com/office/word/2010/wordprocessingGroup" xmlns:wpi="http://schemas.microsoft.com/office/word/2010/wordprocessingInk" xmlns:wne="http://schemas.microsoft.com/office/word/2006/wordml" xmlns:wps="http://schemas.microsoft.com/office/word/2010/wordprocessingShape" mc:Ignorable="w14 w15 w16se w16cid w16 w16cex w16sdtdh w16sdtfl w16du wp14">
   <w:body>
     <w:tbl>
       <w:tblPr>
@@ -246,41 +246,13 @@
           <w:szCs w:val="20"/>
         </w:rPr>
       </w:pPr>
-      <w:proofErr w:type="spellStart"/>
       <w:r>
         <w:rPr>
           <w:rFonts w:ascii="Arial Narrow" w:hAnsi="Arial Narrow" w:cs="Arial"/>
           <w:sz w:val="20"/>
           <w:szCs w:val="20"/>
         </w:rPr>
-        <w:t>semestr</w:t>
-      </w:r>
-      <w:proofErr w:type="spellEnd"/>
-      <w:r>
-        <w:rPr>
-          <w:rFonts w:ascii="Arial Narrow" w:hAnsi="Arial Narrow" w:cs="Arial"/>
-          <w:sz w:val="20"/>
-          <w:szCs w:val="20"/>
-        </w:rPr>
-        <w:t xml:space="preserve"> </w:t>
-      </w:r>
-      <w:proofErr w:type="spellStart"/>
-      <w:r>
-        <w:rPr>
-          <w:rFonts w:ascii="Arial Narrow" w:hAnsi="Arial Narrow" w:cs="Arial"/>
-          <w:sz w:val="20"/>
-          <w:szCs w:val="20"/>
-        </w:rPr>
-        <w:t>letni</w:t>
-      </w:r>
-      <w:proofErr w:type="spellEnd"/>
-      <w:r>
-        <w:rPr>
-          <w:rFonts w:ascii="Arial Narrow" w:hAnsi="Arial Narrow" w:cs="Arial"/>
-          <w:sz w:val="20"/>
-          <w:szCs w:val="20"/>
-        </w:rPr>
-        <w:t xml:space="preserve"> 2025/26</w:t>
+        <w:t>semestr letni 2025/26</w:t>
       </w:r>
     </w:p>
     <w:p>
@@ -355,41 +327,13 @@
           <w:szCs w:val="32"/>
         </w:rPr>
       </w:pPr>
-      <w:proofErr w:type="spellStart"/>
       <w:r>
         <w:rPr>
           <w:rFonts w:ascii="Arial Narrow" w:hAnsi="Arial Narrow" w:cs="Arial"/>
           <w:sz w:val="32"/>
           <w:szCs w:val="32"/>
         </w:rPr>
-        <w:t>Temat</w:t>
-      </w:r>
-      <w:proofErr w:type="spellEnd"/>
-      <w:r>
-        <w:rPr>
-          <w:rFonts w:ascii="Arial Narrow" w:hAnsi="Arial Narrow" w:cs="Arial"/>
-          <w:sz w:val="32"/>
-          <w:szCs w:val="32"/>
-        </w:rPr>
-        <w:t xml:space="preserve"> </w:t>
-      </w:r>
-      <w:proofErr w:type="spellStart"/>
-      <w:r>
-        <w:rPr>
-          <w:rFonts w:ascii="Arial Narrow" w:hAnsi="Arial Narrow" w:cs="Arial"/>
-          <w:sz w:val="32"/>
-          <w:szCs w:val="32"/>
-        </w:rPr>
-        <w:t>projektu</w:t>
-      </w:r>
-      <w:proofErr w:type="spellEnd"/>
-      <w:r>
-        <w:rPr>
-          <w:rFonts w:ascii="Arial Narrow" w:hAnsi="Arial Narrow" w:cs="Arial"/>
-          <w:sz w:val="32"/>
-          <w:szCs w:val="32"/>
-        </w:rPr>
-        <w:t>:</w:t>
+        <w:t>Temat projektu:</w:t>
       </w:r>
     </w:p>
     <w:p>
@@ -402,7 +346,6 @@
           <w:szCs w:val="32"/>
         </w:rPr>
       </w:pPr>
-      <w:proofErr w:type="spellStart"/>
       <w:r>
         <w:rPr>
           <w:rFonts w:ascii="Arial Narrow" w:hAnsi="Arial Narrow" w:cs="Arial"/>
@@ -410,169 +353,8 @@
           <w:sz w:val="32"/>
           <w:szCs w:val="32"/>
         </w:rPr>
-        <w:t>Porównanie</w:t>
+        <w:t>Porównanie efektywności algorytmów doboru tras rozłącznych: naiwnego i Suurballe</w:t>
       </w:r>
-      <w:proofErr w:type="spellEnd"/>
-      <w:r>
-        <w:rPr>
-          <w:rFonts w:ascii="Arial Narrow" w:hAnsi="Arial Narrow" w:cs="Arial"/>
-          <w:i/>
-          <w:sz w:val="32"/>
-          <w:szCs w:val="32"/>
-        </w:rPr>
-        <w:t xml:space="preserve"> </w:t>
-      </w:r>
-      <w:proofErr w:type="spellStart"/>
-      <w:r>
-        <w:rPr>
-          <w:rFonts w:ascii="Arial Narrow" w:hAnsi="Arial Narrow" w:cs="Arial"/>
-          <w:i/>
-          <w:sz w:val="32"/>
-          <w:szCs w:val="32"/>
-        </w:rPr>
-        <w:t>efektywności</w:t>
-      </w:r>
-      <w:proofErr w:type="spellEnd"/>
-      <w:r>
-        <w:rPr>
-          <w:rFonts w:ascii="Arial Narrow" w:hAnsi="Arial Narrow" w:cs="Arial"/>
-          <w:i/>
-          <w:sz w:val="32"/>
-          <w:szCs w:val="32"/>
-        </w:rPr>
-        <w:t xml:space="preserve"> </w:t>
-      </w:r>
-      <w:proofErr w:type="spellStart"/>
-      <w:r>
-        <w:rPr>
-          <w:rFonts w:ascii="Arial Narrow" w:hAnsi="Arial Narrow" w:cs="Arial"/>
-          <w:i/>
-          <w:sz w:val="32"/>
-          <w:szCs w:val="32"/>
-        </w:rPr>
-        <w:t>algorytmów</w:t>
-      </w:r>
-      <w:proofErr w:type="spellEnd"/>
-      <w:r>
-        <w:rPr>
-          <w:rFonts w:ascii="Arial Narrow" w:hAnsi="Arial Narrow" w:cs="Arial"/>
-          <w:i/>
-          <w:sz w:val="32"/>
-          <w:szCs w:val="32"/>
-        </w:rPr>
-        <w:t xml:space="preserve"> </w:t>
-      </w:r>
-      <w:proofErr w:type="spellStart"/>
-      <w:r>
-        <w:rPr>
-          <w:rFonts w:ascii="Arial Narrow" w:hAnsi="Arial Narrow" w:cs="Arial"/>
-          <w:i/>
-          <w:sz w:val="32"/>
-          <w:szCs w:val="32"/>
-        </w:rPr>
-        <w:t>doboru</w:t>
-      </w:r>
-      <w:proofErr w:type="spellEnd"/>
-      <w:r>
-        <w:rPr>
-          <w:rFonts w:ascii="Arial Narrow" w:hAnsi="Arial Narrow" w:cs="Arial"/>
-          <w:i/>
-          <w:sz w:val="32"/>
-          <w:szCs w:val="32"/>
-        </w:rPr>
-        <w:t xml:space="preserve"> </w:t>
-      </w:r>
-      <w:proofErr w:type="spellStart"/>
-      <w:r>
-        <w:rPr>
-          <w:rFonts w:ascii="Arial Narrow" w:hAnsi="Arial Narrow" w:cs="Arial"/>
-          <w:i/>
-          <w:sz w:val="32"/>
-          <w:szCs w:val="32"/>
-        </w:rPr>
-        <w:t>tras</w:t>
-      </w:r>
-      <w:proofErr w:type="spellEnd"/>
-      <w:r>
-        <w:rPr>
-          <w:rFonts w:ascii="Arial Narrow" w:hAnsi="Arial Narrow" w:cs="Arial"/>
-          <w:i/>
-          <w:sz w:val="32"/>
-          <w:szCs w:val="32"/>
-        </w:rPr>
-        <w:t xml:space="preserve"> </w:t>
-      </w:r>
-      <w:proofErr w:type="spellStart"/>
-      <w:r>
-        <w:rPr>
-          <w:rFonts w:ascii="Arial Narrow" w:hAnsi="Arial Narrow" w:cs="Arial"/>
-          <w:i/>
-          <w:sz w:val="32"/>
-          <w:szCs w:val="32"/>
-        </w:rPr>
-        <w:t>rozłącznych</w:t>
-      </w:r>
-      <w:proofErr w:type="spellEnd"/>
-      <w:r>
-        <w:rPr>
-          <w:rFonts w:ascii="Arial Narrow" w:hAnsi="Arial Narrow" w:cs="Arial"/>
-          <w:i/>
-          <w:sz w:val="32"/>
-          <w:szCs w:val="32"/>
-        </w:rPr>
-        <w:t xml:space="preserve">: </w:t>
-      </w:r>
-      <w:proofErr w:type="spellStart"/>
-      <w:r>
-        <w:rPr>
-          <w:rFonts w:ascii="Arial Narrow" w:hAnsi="Arial Narrow" w:cs="Arial"/>
-          <w:i/>
-          <w:sz w:val="32"/>
-          <w:szCs w:val="32"/>
-        </w:rPr>
-        <w:t>naiwnego</w:t>
-      </w:r>
-      <w:proofErr w:type="spellEnd"/>
-      <w:r>
-        <w:rPr>
-          <w:rFonts w:ascii="Arial Narrow" w:hAnsi="Arial Narrow" w:cs="Arial"/>
-          <w:i/>
-          <w:sz w:val="32"/>
-          <w:szCs w:val="32"/>
-        </w:rPr>
-        <w:t xml:space="preserve"> </w:t>
-      </w:r>
-      <w:proofErr w:type="spellStart"/>
-      <w:r>
-        <w:rPr>
-          <w:rFonts w:ascii="Arial Narrow" w:hAnsi="Arial Narrow" w:cs="Arial"/>
-          <w:i/>
-          <w:sz w:val="32"/>
-          <w:szCs w:val="32"/>
-        </w:rPr>
-        <w:t>i</w:t>
-      </w:r>
-      <w:proofErr w:type="spellEnd"/>
-      <w:r>
-        <w:rPr>
-          <w:rFonts w:ascii="Arial Narrow" w:hAnsi="Arial Narrow" w:cs="Arial"/>
-          <w:i/>
-          <w:sz w:val="32"/>
-          <w:szCs w:val="32"/>
-        </w:rPr>
-        <w:t xml:space="preserve"> </w:t>
-      </w:r>
-      <w:proofErr w:type="spellStart"/>
-      <w:r>
-        <w:rPr>
-          <w:rFonts w:ascii="Arial Narrow" w:hAnsi="Arial Narrow" w:cs="Arial"/>
-          <w:i/>
-          <w:sz w:val="32"/>
-          <w:szCs w:val="32"/>
-        </w:rPr>
-        <w:t>Suurballe</w:t>
-      </w:r>
-      <w:proofErr w:type="spellEnd"/>
     </w:p>
     <w:p>
       <w:pPr>
@@ -619,7 +401,6 @@
                 <w:u w:val="single"/>
               </w:rPr>
             </w:pPr>
-            <w:proofErr w:type="spellStart"/>
             <w:r>
               <w:rPr>
                 <w:rFonts w:ascii="Arial Narrow" w:hAnsi="Arial Narrow" w:cs="Arial"/>
@@ -627,17 +408,7 @@
                 <w:szCs w:val="24"/>
                 <w:u w:val="single"/>
               </w:rPr>
-              <w:t>Prowadzący</w:t>
-            </w:r>
-            <w:proofErr w:type="spellEnd"/>
-            <w:r>
-              <w:rPr>
-                <w:rFonts w:ascii="Arial Narrow" w:hAnsi="Arial Narrow" w:cs="Arial"/>
-                <w:sz w:val="24"/>
-                <w:szCs w:val="24"/>
-                <w:u w:val="single"/>
-              </w:rPr>
-              <w:t>:</w:t>
+              <w:t>Prowadzący:</w:t>
             </w:r>
           </w:p>
           <w:p>
@@ -655,25 +426,7 @@
                 <w:sz w:val="24"/>
                 <w:szCs w:val="24"/>
               </w:rPr>
-              <w:t xml:space="preserve">Dr hab. </w:t>
-            </w:r>
-            <w:proofErr w:type="spellStart"/>
-            <w:r>
-              <w:rPr>
-                <w:rFonts w:ascii="Arial Narrow" w:hAnsi="Arial Narrow" w:cs="Arial"/>
-                <w:sz w:val="24"/>
-                <w:szCs w:val="24"/>
-              </w:rPr>
-              <w:t>inż</w:t>
-            </w:r>
-            <w:proofErr w:type="spellEnd"/>
-            <w:r>
-              <w:rPr>
-                <w:rFonts w:ascii="Arial Narrow" w:hAnsi="Arial Narrow" w:cs="Arial"/>
-                <w:sz w:val="24"/>
-                <w:szCs w:val="24"/>
-              </w:rPr>
-              <w:t>. Jacek Rak, prof. PG</w:t>
+              <w:t>Dr hab. inż. Jacek Rak, prof. PG</w:t>
             </w:r>
           </w:p>
           <w:p>
@@ -702,7 +455,6 @@
                 <w:u w:val="single"/>
               </w:rPr>
             </w:pPr>
-            <w:proofErr w:type="spellStart"/>
             <w:r>
               <w:rPr>
                 <w:rFonts w:ascii="Arial Narrow" w:hAnsi="Arial Narrow" w:cs="Arial"/>
@@ -710,37 +462,7 @@
                 <w:szCs w:val="24"/>
                 <w:u w:val="single"/>
               </w:rPr>
-              <w:t>Skład</w:t>
-            </w:r>
-            <w:proofErr w:type="spellEnd"/>
-            <w:r>
-              <w:rPr>
-                <w:rFonts w:ascii="Arial Narrow" w:hAnsi="Arial Narrow" w:cs="Arial"/>
-                <w:sz w:val="24"/>
-                <w:szCs w:val="24"/>
-                <w:u w:val="single"/>
-              </w:rPr>
-              <w:t xml:space="preserve"> </w:t>
-            </w:r>
-            <w:proofErr w:type="spellStart"/>
-            <w:r>
-              <w:rPr>
-                <w:rFonts w:ascii="Arial Narrow" w:hAnsi="Arial Narrow" w:cs="Arial"/>
-                <w:sz w:val="24"/>
-                <w:szCs w:val="24"/>
-                <w:u w:val="single"/>
-              </w:rPr>
-              <w:t>grupy</w:t>
-            </w:r>
-            <w:proofErr w:type="spellEnd"/>
-            <w:r>
-              <w:rPr>
-                <w:rFonts w:ascii="Arial Narrow" w:hAnsi="Arial Narrow" w:cs="Arial"/>
-                <w:sz w:val="24"/>
-                <w:szCs w:val="24"/>
-                <w:u w:val="single"/>
-              </w:rPr>
-              <w:t>:</w:t>
+              <w:t>Skład grupy:</w:t>
             </w:r>
           </w:p>
           <w:p>
@@ -770,52 +492,14 @@
                 <w:szCs w:val="24"/>
               </w:rPr>
             </w:pPr>
-            <w:proofErr w:type="spellStart"/>
             <w:r>
               <w:rPr>
                 <w:rFonts w:ascii="Arial Narrow" w:hAnsi="Arial Narrow" w:cs="Arial"/>
                 <w:sz w:val="24"/>
                 <w:szCs w:val="24"/>
               </w:rPr>
-              <w:t>Nr_indeksu</w:t>
+              <w:t>188823 Przemysław Piątkiewicz</w:t>
             </w:r>
-            <w:proofErr w:type="spellEnd"/>
-            <w:r>
-              <w:rPr>
-                <w:rFonts w:ascii="Arial Narrow" w:hAnsi="Arial Narrow" w:cs="Arial"/>
-                <w:sz w:val="24"/>
-                <w:szCs w:val="24"/>
-              </w:rPr>
-              <w:t xml:space="preserve"> </w:t>
-            </w:r>
-            <w:proofErr w:type="spellStart"/>
-            <w:r>
-              <w:rPr>
-                <w:rFonts w:ascii="Arial Narrow" w:hAnsi="Arial Narrow" w:cs="Arial"/>
-                <w:sz w:val="24"/>
-                <w:szCs w:val="24"/>
-              </w:rPr>
-              <w:t>Imię</w:t>
-            </w:r>
-            <w:proofErr w:type="spellEnd"/>
-            <w:r>
-              <w:rPr>
-                <w:rFonts w:ascii="Arial Narrow" w:hAnsi="Arial Narrow" w:cs="Arial"/>
-                <w:sz w:val="24"/>
-                <w:szCs w:val="24"/>
-              </w:rPr>
-              <w:t xml:space="preserve"> </w:t>
-            </w:r>
-            <w:proofErr w:type="spellStart"/>
-            <w:r>
-              <w:rPr>
-                <w:rFonts w:ascii="Arial Narrow" w:hAnsi="Arial Narrow" w:cs="Arial"/>
-                <w:sz w:val="24"/>
-                <w:szCs w:val="24"/>
-              </w:rPr>
-              <w:t>nazwisko</w:t>
-            </w:r>
-            <w:proofErr w:type="spellEnd"/>
           </w:p>
           <w:p>
             <w:pPr>
@@ -826,16 +510,24 @@
                 <w:szCs w:val="24"/>
               </w:rPr>
             </w:pPr>
-            <w:proofErr w:type="spellStart"/>
             <w:r>
               <w:rPr>
                 <w:rFonts w:ascii="Arial Narrow" w:hAnsi="Arial Narrow" w:cs="Arial"/>
                 <w:sz w:val="24"/>
                 <w:szCs w:val="24"/>
               </w:rPr>
-              <w:t>Nr_indeksu</w:t>
+              <w:t>188868 Jakub Dobruchowski</w:t>
             </w:r>
-            <w:proofErr w:type="spellEnd"/>
+          </w:p>
+          <w:p>
+            <w:pPr>
+              <w:jc w:val="center"/>
+              <w:rPr>
+                <w:rFonts w:ascii="Arial Narrow" w:hAnsi="Arial Narrow" w:cs="Arial"/>
+                <w:sz w:val="24"/>
+                <w:szCs w:val="24"/>
+              </w:rPr>
+            </w:pPr>
             <w:r>
               <w:rPr>
                 <w:rFonts w:ascii="Arial Narrow" w:hAnsi="Arial Narrow" w:cs="Arial"/>
@@ -844,16 +536,14 @@
               </w:rPr>
               <w:t xml:space="preserve"> </w:t>
             </w:r>
-            <w:proofErr w:type="spellStart"/>
             <w:r>
               <w:rPr>
                 <w:rFonts w:ascii="Arial Narrow" w:hAnsi="Arial Narrow" w:cs="Arial"/>
                 <w:sz w:val="24"/>
                 <w:szCs w:val="24"/>
               </w:rPr>
-              <w:t>Imię</w:t>
+              <w:t>188775</w:t>
             </w:r>
-            <w:proofErr w:type="spellEnd"/>
             <w:r>
               <w:rPr>
                 <w:rFonts w:ascii="Arial Narrow" w:hAnsi="Arial Narrow" w:cs="Arial"/>
@@ -862,16 +552,14 @@
               </w:rPr>
               <w:t xml:space="preserve"> </w:t>
             </w:r>
-            <w:proofErr w:type="spellStart"/>
             <w:r>
               <w:rPr>
                 <w:rFonts w:ascii="Arial Narrow" w:hAnsi="Arial Narrow" w:cs="Arial"/>
                 <w:sz w:val="24"/>
                 <w:szCs w:val="24"/>
               </w:rPr>
-              <w:t>nazwisko</w:t>
+              <w:t>Filip Lewiński</w:t>
             </w:r>
-            <w:proofErr w:type="spellEnd"/>
           </w:p>
           <w:p>
             <w:pPr>
@@ -913,19 +601,11 @@
           <w:rFonts w:ascii="Arial Narrow" w:hAnsi="Arial Narrow" w:cs="Arial"/>
         </w:rPr>
       </w:pPr>
-      <w:proofErr w:type="spellStart"/>
       <w:r>
         <w:rPr>
           <w:rFonts w:ascii="Arial Narrow" w:hAnsi="Arial Narrow" w:cs="Arial"/>
         </w:rPr>
-        <w:t>Gdańsk</w:t>
-      </w:r>
-      <w:proofErr w:type="spellEnd"/>
-      <w:r>
-        <w:rPr>
-          <w:rFonts w:ascii="Arial Narrow" w:hAnsi="Arial Narrow" w:cs="Arial"/>
-        </w:rPr>
-        <w:t xml:space="preserve">, </w:t>
+        <w:t xml:space="preserve">Gdańsk, </w:t>
       </w:r>
       <w:r>
         <w:rPr>
@@ -980,7 +660,6 @@
           <w:sz w:val="28"/>
           <w:szCs w:val="28"/>
         </w:rPr>
-        <w:lastRenderedPageBreak/>
         <w:t>SPIS TREŚCI</w:t>
       </w:r>
     </w:p>
@@ -1244,21 +923,7 @@
             <w:rStyle w:val="Hipercze"/>
             <w:noProof/>
           </w:rPr>
-          <w:t>. Głów</w:t>
-        </w:r>
-        <w:r>
-          <w:rPr>
-            <w:rStyle w:val="Hipercze"/>
-            <w:noProof/>
-          </w:rPr>
-          <w:t>n</w:t>
-        </w:r>
-        <w:r>
-          <w:rPr>
-            <w:rStyle w:val="Hipercze"/>
-            <w:noProof/>
-          </w:rPr>
-          <w:t>e pozycje literatury</w:t>
+          <w:t>. Główne pozycje literatury</w:t>
         </w:r>
         <w:r>
           <w:rPr>
@@ -1333,46 +998,9 @@
       <w:bookmarkStart w:id="0" w:name="_Toc228201679"/>
       <w:r>
         <w:lastRenderedPageBreak/>
-        <w:t xml:space="preserve">1. </w:t>
-      </w:r>
-      <w:proofErr w:type="spellStart"/>
-      <w:r>
-        <w:t>Charakterystyka</w:t>
-      </w:r>
-      <w:proofErr w:type="spellEnd"/>
-      <w:r>
-        <w:t xml:space="preserve"> </w:t>
-      </w:r>
-      <w:proofErr w:type="spellStart"/>
-      <w:r>
-        <w:t>zagadnienia</w:t>
-      </w:r>
-      <w:proofErr w:type="spellEnd"/>
-      <w:r>
-        <w:t xml:space="preserve"> </w:t>
-      </w:r>
-      <w:proofErr w:type="spellStart"/>
-      <w:r>
-        <w:t>i</w:t>
-      </w:r>
-      <w:proofErr w:type="spellEnd"/>
-      <w:r>
-        <w:t xml:space="preserve"> </w:t>
-      </w:r>
-      <w:proofErr w:type="spellStart"/>
-      <w:r>
-        <w:t>opis</w:t>
-      </w:r>
-      <w:proofErr w:type="spellEnd"/>
-      <w:r>
-        <w:t xml:space="preserve"> </w:t>
-      </w:r>
-      <w:proofErr w:type="spellStart"/>
-      <w:r>
-        <w:t>problemu</w:t>
+        <w:t>1. Charakterystyka zagadnienia i opis problemu</w:t>
       </w:r>
       <w:bookmarkEnd w:id="0"/>
-      <w:proofErr w:type="spellEnd"/>
     </w:p>
     <w:p>
       <w:pPr>
@@ -1397,21 +1025,7 @@
         <w:rPr>
           <w:lang w:val="pl-PL"/>
         </w:rPr>
-        <w:t xml:space="preserve">W projekcie porównano dwa sposoby wyznaczania takich tras. Pierwszym z nich jest metoda naiwna, polegająca na znalezieniu najkrótszej trasy algorytmem Dijkstry, usunięciu użytych przez nią łączy, a następnie ponownym uruchomieniu algorytmu w celu znalezienia drugiej trasy. Drugim podejściem jest algorytm </w:t>
-      </w:r>
-      <w:proofErr w:type="spellStart"/>
-      <w:r>
-        <w:rPr>
-          <w:lang w:val="pl-PL"/>
-        </w:rPr>
-        <w:t>Suurballe’a</w:t>
-      </w:r>
-      <w:proofErr w:type="spellEnd"/>
-      <w:r>
-        <w:rPr>
-          <w:lang w:val="pl-PL"/>
-        </w:rPr>
-        <w:t>, który wyznacza parę tras wspólnie, dążąc do uzyskania możliwie najlepszej łącznej długości obu tras.</w:t>
+        <w:t>W projekcie porównano dwa sposoby wyznaczania takich tras. Pierwszym z nich jest metoda naiwna, polegająca na znalezieniu najkrótszej trasy algorytmem Dijkstry, usunięciu użytych przez nią łączy, a następnie ponownym uruchomieniu algorytmu w celu znalezienia drugiej trasy. Drugim podejściem jest algorytm Suurballe’a, który wyznacza parę tras wspólnie, dążąc do uzyskania możliwie najlepszej łącznej długości obu tras.</w:t>
       </w:r>
     </w:p>
     <w:tbl>
@@ -1438,7 +1052,6 @@
             <w:pPr>
               <w:spacing w:after="0"/>
             </w:pPr>
-            <w:proofErr w:type="spellStart"/>
             <w:r>
               <w:rPr>
                 <w:b/>
@@ -1447,7 +1060,6 @@
               </w:rPr>
               <w:t>Cecha</w:t>
             </w:r>
-            <w:proofErr w:type="spellEnd"/>
           </w:p>
         </w:tc>
         <w:tc>
@@ -1460,7 +1072,6 @@
             <w:pPr>
               <w:spacing w:after="0"/>
             </w:pPr>
-            <w:proofErr w:type="spellStart"/>
             <w:r>
               <w:rPr>
                 <w:b/>
@@ -1469,7 +1080,6 @@
               </w:rPr>
               <w:t>Wartość</w:t>
             </w:r>
-            <w:proofErr w:type="spellEnd"/>
           </w:p>
         </w:tc>
       </w:tr>
@@ -1484,28 +1094,12 @@
             <w:pPr>
               <w:spacing w:after="0"/>
             </w:pPr>
-            <w:proofErr w:type="spellStart"/>
             <w:r>
               <w:rPr>
                 <w:sz w:val="17"/>
               </w:rPr>
-              <w:t>Liczba</w:t>
+              <w:t>Liczba węzłów</w:t>
             </w:r>
-            <w:proofErr w:type="spellEnd"/>
-            <w:r>
-              <w:rPr>
-                <w:sz w:val="17"/>
-              </w:rPr>
-              <w:t xml:space="preserve"> </w:t>
-            </w:r>
-            <w:proofErr w:type="spellStart"/>
-            <w:r>
-              <w:rPr>
-                <w:sz w:val="17"/>
-              </w:rPr>
-              <w:t>węzłów</w:t>
-            </w:r>
-            <w:proofErr w:type="spellEnd"/>
           </w:p>
         </w:tc>
         <w:tc>
@@ -1537,28 +1131,12 @@
             <w:pPr>
               <w:spacing w:after="0"/>
             </w:pPr>
-            <w:proofErr w:type="spellStart"/>
             <w:r>
               <w:rPr>
                 <w:sz w:val="17"/>
               </w:rPr>
-              <w:t>Liczba</w:t>
+              <w:t>Liczba łączy</w:t>
             </w:r>
-            <w:proofErr w:type="spellEnd"/>
-            <w:r>
-              <w:rPr>
-                <w:sz w:val="17"/>
-              </w:rPr>
-              <w:t xml:space="preserve"> </w:t>
-            </w:r>
-            <w:proofErr w:type="spellStart"/>
-            <w:r>
-              <w:rPr>
-                <w:sz w:val="17"/>
-              </w:rPr>
-              <w:t>łączy</w:t>
-            </w:r>
-            <w:proofErr w:type="spellEnd"/>
           </w:p>
         </w:tc>
         <w:tc>
@@ -1594,16 +1172,8 @@
               <w:rPr>
                 <w:sz w:val="17"/>
               </w:rPr>
-              <w:t xml:space="preserve">Graf </w:t>
+              <w:t>Graf spójny</w:t>
             </w:r>
-            <w:proofErr w:type="spellStart"/>
-            <w:r>
-              <w:rPr>
-                <w:sz w:val="17"/>
-              </w:rPr>
-              <w:t>spójny</w:t>
-            </w:r>
-            <w:proofErr w:type="spellEnd"/>
           </w:p>
         </w:tc>
         <w:tc>
@@ -1616,14 +1186,12 @@
             <w:pPr>
               <w:spacing w:after="0"/>
             </w:pPr>
-            <w:proofErr w:type="spellStart"/>
             <w:r>
               <w:rPr>
                 <w:sz w:val="17"/>
               </w:rPr>
               <w:t>tak</w:t>
             </w:r>
-            <w:proofErr w:type="spellEnd"/>
           </w:p>
         </w:tc>
       </w:tr>
@@ -1637,28 +1205,12 @@
             <w:pPr>
               <w:spacing w:after="0"/>
             </w:pPr>
-            <w:proofErr w:type="spellStart"/>
             <w:r>
               <w:rPr>
                 <w:sz w:val="17"/>
               </w:rPr>
-              <w:t>Spójność</w:t>
+              <w:t>Spójność krawędziowa</w:t>
             </w:r>
-            <w:proofErr w:type="spellEnd"/>
-            <w:r>
-              <w:rPr>
-                <w:sz w:val="17"/>
-              </w:rPr>
-              <w:t xml:space="preserve"> </w:t>
-            </w:r>
-            <w:proofErr w:type="spellStart"/>
-            <w:r>
-              <w:rPr>
-                <w:sz w:val="17"/>
-              </w:rPr>
-              <w:t>krawędziowa</w:t>
-            </w:r>
-            <w:proofErr w:type="spellEnd"/>
           </w:p>
         </w:tc>
         <w:tc>
@@ -1690,33 +1242,11 @@
             <w:pPr>
               <w:spacing w:after="0"/>
             </w:pPr>
-            <w:proofErr w:type="spellStart"/>
             <w:r>
               <w:rPr>
                 <w:sz w:val="17"/>
               </w:rPr>
-              <w:t>Liczba</w:t>
-            </w:r>
-            <w:proofErr w:type="spellEnd"/>
-            <w:r>
-              <w:rPr>
-                <w:sz w:val="17"/>
-              </w:rPr>
-              <w:t xml:space="preserve"> </w:t>
-            </w:r>
-            <w:proofErr w:type="spellStart"/>
-            <w:r>
-              <w:rPr>
-                <w:sz w:val="17"/>
-              </w:rPr>
-              <w:t>badanych</w:t>
-            </w:r>
-            <w:proofErr w:type="spellEnd"/>
-            <w:r>
-              <w:rPr>
-                <w:sz w:val="17"/>
-              </w:rPr>
-              <w:t xml:space="preserve"> par s-t</w:t>
+              <w:t>Liczba badanych par s-t</w:t>
             </w:r>
           </w:p>
         </w:tc>
@@ -1791,182 +1321,12 @@
       </w:pPr>
       <w:r>
         <w:lastRenderedPageBreak/>
-        <w:t xml:space="preserve">Lista </w:t>
+        <w:t>Lista sąsiedztwa topologii</w:t>
       </w:r>
-      <w:proofErr w:type="spellStart"/>
-      <w:r>
-        <w:t>sąsiedztwa</w:t>
-      </w:r>
-      <w:proofErr w:type="spellEnd"/>
-      <w:r>
-        <w:t xml:space="preserve"> </w:t>
-      </w:r>
-      <w:proofErr w:type="spellStart"/>
-      <w:r>
-        <w:t>topologii</w:t>
-      </w:r>
-      <w:proofErr w:type="spellEnd"/>
     </w:p>
     <w:p>
-      <w:proofErr w:type="spellStart"/>
       <w:r>
-        <w:t>Tabela</w:t>
-      </w:r>
-      <w:proofErr w:type="spellEnd"/>
-      <w:r>
-        <w:t xml:space="preserve"> </w:t>
-      </w:r>
-      <w:proofErr w:type="spellStart"/>
-      <w:r>
-        <w:t>pokazuje</w:t>
-      </w:r>
-      <w:proofErr w:type="spellEnd"/>
-      <w:r>
-        <w:t xml:space="preserve">, z </w:t>
-      </w:r>
-      <w:proofErr w:type="spellStart"/>
-      <w:r>
-        <w:t>jakimi</w:t>
-      </w:r>
-      <w:proofErr w:type="spellEnd"/>
-      <w:r>
-        <w:t xml:space="preserve"> </w:t>
-      </w:r>
-      <w:proofErr w:type="spellStart"/>
-      <w:r>
-        <w:t>węzłami</w:t>
-      </w:r>
-      <w:proofErr w:type="spellEnd"/>
-      <w:r>
-        <w:t xml:space="preserve"> </w:t>
-      </w:r>
-      <w:proofErr w:type="spellStart"/>
-      <w:r>
-        <w:t>bezpośrednio</w:t>
-      </w:r>
-      <w:proofErr w:type="spellEnd"/>
-      <w:r>
-        <w:t xml:space="preserve"> </w:t>
-      </w:r>
-      <w:proofErr w:type="spellStart"/>
-      <w:r>
-        <w:t>połączony</w:t>
-      </w:r>
-      <w:proofErr w:type="spellEnd"/>
-      <w:r>
-        <w:t xml:space="preserve"> jest </w:t>
-      </w:r>
-      <w:proofErr w:type="spellStart"/>
-      <w:r>
-        <w:t>dany</w:t>
-      </w:r>
-      <w:proofErr w:type="spellEnd"/>
-      <w:r>
-        <w:t xml:space="preserve"> </w:t>
-      </w:r>
-      <w:proofErr w:type="spellStart"/>
-      <w:r>
-        <w:t>węzeł</w:t>
-      </w:r>
-      <w:proofErr w:type="spellEnd"/>
-      <w:r>
-        <w:t xml:space="preserve">. </w:t>
-      </w:r>
-      <w:proofErr w:type="spellStart"/>
-      <w:r>
-        <w:t>Ponieważ</w:t>
-      </w:r>
-      <w:proofErr w:type="spellEnd"/>
-      <w:r>
-        <w:t xml:space="preserve"> </w:t>
-      </w:r>
-      <w:proofErr w:type="spellStart"/>
-      <w:r>
-        <w:t>wszystkie</w:t>
-      </w:r>
-      <w:proofErr w:type="spellEnd"/>
-      <w:r>
-        <w:t xml:space="preserve"> </w:t>
-      </w:r>
-      <w:proofErr w:type="spellStart"/>
-      <w:r>
-        <w:t>łącza</w:t>
-      </w:r>
-      <w:proofErr w:type="spellEnd"/>
-      <w:r>
-        <w:t xml:space="preserve"> </w:t>
-      </w:r>
-      <w:proofErr w:type="spellStart"/>
-      <w:r>
-        <w:t>mają</w:t>
-      </w:r>
-      <w:proofErr w:type="spellEnd"/>
-      <w:r>
-        <w:t xml:space="preserve"> </w:t>
-      </w:r>
-      <w:proofErr w:type="spellStart"/>
-      <w:r>
-        <w:t>koszt</w:t>
-      </w:r>
-      <w:proofErr w:type="spellEnd"/>
-      <w:r>
-        <w:t xml:space="preserve"> 1, </w:t>
-      </w:r>
-      <w:proofErr w:type="spellStart"/>
-      <w:r>
-        <w:t>lista</w:t>
-      </w:r>
-      <w:proofErr w:type="spellEnd"/>
-      <w:r>
-        <w:t xml:space="preserve"> </w:t>
-      </w:r>
-      <w:proofErr w:type="spellStart"/>
-      <w:r>
-        <w:t>sąsiadów</w:t>
-      </w:r>
-      <w:proofErr w:type="spellEnd"/>
-      <w:r>
-        <w:t xml:space="preserve"> jest </w:t>
-      </w:r>
-      <w:proofErr w:type="spellStart"/>
-      <w:r>
-        <w:t>równoważna</w:t>
-      </w:r>
-      <w:proofErr w:type="spellEnd"/>
-      <w:r>
-        <w:t xml:space="preserve"> </w:t>
-      </w:r>
-      <w:proofErr w:type="spellStart"/>
-      <w:r>
-        <w:t>opisowi</w:t>
-      </w:r>
-      <w:proofErr w:type="spellEnd"/>
-      <w:r>
-        <w:t xml:space="preserve"> </w:t>
-      </w:r>
-      <w:proofErr w:type="spellStart"/>
-      <w:r>
-        <w:t>bezpośrednich</w:t>
-      </w:r>
-      <w:proofErr w:type="spellEnd"/>
-      <w:r>
-        <w:t xml:space="preserve"> </w:t>
-      </w:r>
-      <w:proofErr w:type="spellStart"/>
-      <w:r>
-        <w:t>połączeń</w:t>
-      </w:r>
-      <w:proofErr w:type="spellEnd"/>
-      <w:r>
-        <w:t xml:space="preserve"> w </w:t>
-      </w:r>
-      <w:proofErr w:type="spellStart"/>
-      <w:r>
-        <w:t>grafie</w:t>
-      </w:r>
-      <w:proofErr w:type="spellEnd"/>
-      <w:r>
-        <w:t>.</w:t>
+        <w:t>Tabela pokazuje, z jakimi węzłami bezpośrednio połączony jest dany węzeł. Ponieważ wszystkie łącza mają koszt 1, lista sąsiadów jest równoważna opisowi bezpośrednich połączeń w grafie.</w:t>
       </w:r>
     </w:p>
     <w:tbl>
@@ -1995,7 +1355,6 @@
             <w:pPr>
               <w:spacing w:after="0"/>
             </w:pPr>
-            <w:proofErr w:type="spellStart"/>
             <w:r>
               <w:rPr>
                 <w:b/>
@@ -2004,7 +1363,6 @@
               </w:rPr>
               <w:t>Węzeł</w:t>
             </w:r>
-            <w:proofErr w:type="spellEnd"/>
           </w:p>
         </w:tc>
         <w:tc>
@@ -2017,7 +1375,6 @@
             <w:pPr>
               <w:spacing w:after="0"/>
             </w:pPr>
-            <w:proofErr w:type="spellStart"/>
             <w:r>
               <w:rPr>
                 <w:b/>
@@ -2026,7 +1383,6 @@
               </w:rPr>
               <w:t>Sąsiedzi</w:t>
             </w:r>
-            <w:proofErr w:type="spellEnd"/>
           </w:p>
         </w:tc>
         <w:tc>
@@ -2039,7 +1395,6 @@
             <w:pPr>
               <w:spacing w:after="0"/>
             </w:pPr>
-            <w:proofErr w:type="spellStart"/>
             <w:r>
               <w:rPr>
                 <w:b/>
@@ -2048,7 +1403,6 @@
               </w:rPr>
               <w:t>Stopień</w:t>
             </w:r>
-            <w:proofErr w:type="spellEnd"/>
           </w:p>
         </w:tc>
       </w:tr>
@@ -3268,591 +2622,73 @@
       </w:pPr>
       <w:bookmarkStart w:id="1" w:name="_Toc228201680"/>
       <w:r>
-        <w:t xml:space="preserve">2. </w:t>
-      </w:r>
-      <w:proofErr w:type="spellStart"/>
-      <w:r>
-        <w:t>Opis</w:t>
-      </w:r>
-      <w:proofErr w:type="spellEnd"/>
-      <w:r>
-        <w:t xml:space="preserve"> </w:t>
-      </w:r>
-      <w:proofErr w:type="spellStart"/>
-      <w:r>
-        <w:t>proponowanej</w:t>
-      </w:r>
-      <w:proofErr w:type="spellEnd"/>
-      <w:r>
-        <w:t xml:space="preserve"> </w:t>
-      </w:r>
-      <w:proofErr w:type="spellStart"/>
-      <w:r>
-        <w:t>metody</w:t>
-      </w:r>
-      <w:proofErr w:type="spellEnd"/>
-      <w:r>
-        <w:t xml:space="preserve"> </w:t>
-      </w:r>
-      <w:proofErr w:type="spellStart"/>
-      <w:r>
-        <w:t>rozwiązania</w:t>
-      </w:r>
-      <w:proofErr w:type="spellEnd"/>
-      <w:r>
-        <w:t xml:space="preserve"> </w:t>
-      </w:r>
-      <w:proofErr w:type="spellStart"/>
-      <w:r>
-        <w:t>problemu</w:t>
+        <w:t>2. Opis proponowanej metody rozwiązania problemu</w:t>
       </w:r>
       <w:bookmarkEnd w:id="1"/>
-      <w:proofErr w:type="spellEnd"/>
     </w:p>
     <w:p>
       <w:pPr>
         <w:pStyle w:val="Nagwek2"/>
       </w:pPr>
-      <w:proofErr w:type="spellStart"/>
       <w:r>
-        <w:t>Podejście</w:t>
+        <w:t>Podejście naiwne</w:t>
       </w:r>
-      <w:proofErr w:type="spellEnd"/>
-      <w:r>
-        <w:t xml:space="preserve"> </w:t>
-      </w:r>
-      <w:proofErr w:type="spellStart"/>
-      <w:r>
-        <w:t>naiwne</w:t>
-      </w:r>
-      <w:proofErr w:type="spellEnd"/>
     </w:p>
     <w:p>
-      <w:proofErr w:type="spellStart"/>
       <w:r>
-        <w:t>Metoda</w:t>
-      </w:r>
-      <w:proofErr w:type="spellEnd"/>
-      <w:r>
-        <w:t xml:space="preserve"> </w:t>
-      </w:r>
-      <w:proofErr w:type="spellStart"/>
-      <w:r>
-        <w:t>naiwna</w:t>
-      </w:r>
-      <w:proofErr w:type="spellEnd"/>
-      <w:r>
-        <w:t xml:space="preserve"> </w:t>
-      </w:r>
-      <w:proofErr w:type="spellStart"/>
-      <w:r>
-        <w:t>wyznacza</w:t>
-      </w:r>
-      <w:proofErr w:type="spellEnd"/>
-      <w:r>
-        <w:t xml:space="preserve"> </w:t>
-      </w:r>
-      <w:proofErr w:type="spellStart"/>
-      <w:r>
-        <w:t>najkrótszą</w:t>
-      </w:r>
-      <w:proofErr w:type="spellEnd"/>
-      <w:r>
-        <w:t xml:space="preserve"> </w:t>
-      </w:r>
-      <w:proofErr w:type="spellStart"/>
-      <w:r>
-        <w:t>ścieżkę</w:t>
-      </w:r>
-      <w:proofErr w:type="spellEnd"/>
-      <w:r>
-        <w:t xml:space="preserve"> P1 </w:t>
-      </w:r>
-      <w:proofErr w:type="spellStart"/>
-      <w:r>
-        <w:t>algorytmem</w:t>
-      </w:r>
-      <w:proofErr w:type="spellEnd"/>
-      <w:r>
-        <w:t xml:space="preserve"> </w:t>
-      </w:r>
-      <w:proofErr w:type="spellStart"/>
-      <w:r>
-        <w:t>Dijkstry</w:t>
-      </w:r>
-      <w:proofErr w:type="spellEnd"/>
-      <w:r>
-        <w:t xml:space="preserve">, </w:t>
-      </w:r>
-      <w:proofErr w:type="spellStart"/>
-      <w:r>
-        <w:t>usuwa</w:t>
-      </w:r>
-      <w:proofErr w:type="spellEnd"/>
-      <w:r>
-        <w:t xml:space="preserve"> z </w:t>
-      </w:r>
-      <w:proofErr w:type="spellStart"/>
-      <w:r>
-        <w:t>kopii</w:t>
-      </w:r>
-      <w:proofErr w:type="spellEnd"/>
-      <w:r>
-        <w:t xml:space="preserve"> </w:t>
-      </w:r>
-      <w:proofErr w:type="spellStart"/>
-      <w:r>
-        <w:t>grafu</w:t>
-      </w:r>
-      <w:proofErr w:type="spellEnd"/>
-      <w:r>
-        <w:t xml:space="preserve"> </w:t>
-      </w:r>
-      <w:proofErr w:type="spellStart"/>
-      <w:r>
-        <w:t>wszystkie</w:t>
-      </w:r>
-      <w:proofErr w:type="spellEnd"/>
-      <w:r>
-        <w:t xml:space="preserve"> </w:t>
-      </w:r>
-      <w:proofErr w:type="spellStart"/>
-      <w:r>
-        <w:t>łącza</w:t>
-      </w:r>
-      <w:proofErr w:type="spellEnd"/>
-      <w:r>
-        <w:t xml:space="preserve"> </w:t>
-      </w:r>
-      <w:proofErr w:type="spellStart"/>
-      <w:r>
-        <w:t>należące</w:t>
-      </w:r>
-      <w:proofErr w:type="spellEnd"/>
-      <w:r>
-        <w:t xml:space="preserve"> do P1, a </w:t>
-      </w:r>
-      <w:proofErr w:type="spellStart"/>
-      <w:r>
-        <w:t>następnie</w:t>
-      </w:r>
-      <w:proofErr w:type="spellEnd"/>
-      <w:r>
-        <w:t xml:space="preserve"> </w:t>
-      </w:r>
-      <w:proofErr w:type="spellStart"/>
-      <w:r>
-        <w:t>ponownie</w:t>
-      </w:r>
-      <w:proofErr w:type="spellEnd"/>
-      <w:r>
-        <w:t xml:space="preserve"> </w:t>
-      </w:r>
-      <w:proofErr w:type="spellStart"/>
-      <w:r>
-        <w:t>uruchamia</w:t>
-      </w:r>
-      <w:proofErr w:type="spellEnd"/>
-      <w:r>
-        <w:t xml:space="preserve"> </w:t>
-      </w:r>
-      <w:proofErr w:type="spellStart"/>
-      <w:r>
-        <w:t>Dijkstrę</w:t>
-      </w:r>
-      <w:proofErr w:type="spellEnd"/>
-      <w:r>
-        <w:t xml:space="preserve"> w </w:t>
-      </w:r>
-      <w:proofErr w:type="spellStart"/>
-      <w:r>
-        <w:t>celu</w:t>
-      </w:r>
-      <w:proofErr w:type="spellEnd"/>
-      <w:r>
-        <w:t xml:space="preserve"> </w:t>
-      </w:r>
-      <w:proofErr w:type="spellStart"/>
-      <w:r>
-        <w:t>znalezienia</w:t>
-      </w:r>
-      <w:proofErr w:type="spellEnd"/>
-      <w:r>
-        <w:t xml:space="preserve"> P2.</w:t>
+        <w:t>Metoda naiwna wyznacza najkrótszą ścieżkę P1 algorytmem Dijkstry, usuwa z kopii grafu wszystkie łącza należące do P1, a następnie ponownie uruchamia Dijkstrę w celu znalezienia P2.</w:t>
       </w:r>
     </w:p>
     <w:p>
       <w:pPr>
         <w:pStyle w:val="Listanumerowana"/>
       </w:pPr>
-      <w:proofErr w:type="spellStart"/>
       <w:r>
-        <w:t>Utworzyć</w:t>
-      </w:r>
-      <w:proofErr w:type="spellEnd"/>
-      <w:r>
-        <w:t xml:space="preserve"> </w:t>
-      </w:r>
-      <w:proofErr w:type="spellStart"/>
-      <w:r>
-        <w:t>kopię</w:t>
-      </w:r>
-      <w:proofErr w:type="spellEnd"/>
-      <w:r>
-        <w:t xml:space="preserve"> </w:t>
-      </w:r>
-      <w:proofErr w:type="spellStart"/>
-      <w:r>
-        <w:t>grafu</w:t>
-      </w:r>
-      <w:proofErr w:type="spellEnd"/>
-      <w:r>
-        <w:t xml:space="preserve"> </w:t>
-      </w:r>
-      <w:proofErr w:type="spellStart"/>
-      <w:r>
-        <w:t>wejściowego</w:t>
-      </w:r>
-      <w:proofErr w:type="spellEnd"/>
-      <w:r>
-        <w:t>.</w:t>
+        <w:t>Utworzyć kopię grafu wejściowego.</w:t>
       </w:r>
     </w:p>
     <w:p>
       <w:pPr>
         <w:pStyle w:val="Listanumerowana"/>
       </w:pPr>
-      <w:proofErr w:type="spellStart"/>
       <w:r>
-        <w:t>Wyznaczyć</w:t>
-      </w:r>
-      <w:proofErr w:type="spellEnd"/>
-      <w:r>
-        <w:t xml:space="preserve"> </w:t>
-      </w:r>
-      <w:proofErr w:type="spellStart"/>
-      <w:r>
-        <w:t>najkrótszą</w:t>
-      </w:r>
-      <w:proofErr w:type="spellEnd"/>
-      <w:r>
-        <w:t xml:space="preserve"> </w:t>
-      </w:r>
-      <w:proofErr w:type="spellStart"/>
-      <w:r>
-        <w:t>trasę</w:t>
-      </w:r>
-      <w:proofErr w:type="spellEnd"/>
-      <w:r>
-        <w:t xml:space="preserve"> P1 </w:t>
-      </w:r>
-      <w:proofErr w:type="spellStart"/>
-      <w:r>
-        <w:t>między</w:t>
-      </w:r>
-      <w:proofErr w:type="spellEnd"/>
-      <w:r>
-        <w:t xml:space="preserve"> s </w:t>
-      </w:r>
-      <w:proofErr w:type="spellStart"/>
-      <w:r>
-        <w:t>i</w:t>
-      </w:r>
-      <w:proofErr w:type="spellEnd"/>
-      <w:r>
-        <w:t xml:space="preserve"> t.</w:t>
+        <w:t>Wyznaczyć najkrótszą trasę P1 między s i t.</w:t>
       </w:r>
     </w:p>
     <w:p>
       <w:pPr>
         <w:pStyle w:val="Listanumerowana"/>
       </w:pPr>
-      <w:proofErr w:type="spellStart"/>
       <w:r>
-        <w:t>Usunąć</w:t>
-      </w:r>
-      <w:proofErr w:type="spellEnd"/>
-      <w:r>
-        <w:t xml:space="preserve"> z </w:t>
-      </w:r>
-      <w:proofErr w:type="spellStart"/>
-      <w:r>
-        <w:t>kopii</w:t>
-      </w:r>
-      <w:proofErr w:type="spellEnd"/>
-      <w:r>
-        <w:t xml:space="preserve"> </w:t>
-      </w:r>
-      <w:proofErr w:type="spellStart"/>
-      <w:r>
-        <w:t>grafu</w:t>
-      </w:r>
-      <w:proofErr w:type="spellEnd"/>
-      <w:r>
-        <w:t xml:space="preserve"> </w:t>
-      </w:r>
-      <w:proofErr w:type="spellStart"/>
-      <w:r>
-        <w:t>łącza</w:t>
-      </w:r>
-      <w:proofErr w:type="spellEnd"/>
-      <w:r>
-        <w:t xml:space="preserve"> </w:t>
-      </w:r>
-      <w:proofErr w:type="spellStart"/>
-      <w:r>
-        <w:t>użyte</w:t>
-      </w:r>
-      <w:proofErr w:type="spellEnd"/>
-      <w:r>
-        <w:t xml:space="preserve"> w P1.</w:t>
+        <w:t>Usunąć z kopii grafu łącza użyte w P1.</w:t>
       </w:r>
     </w:p>
     <w:p>
       <w:pPr>
         <w:pStyle w:val="Listanumerowana"/>
       </w:pPr>
-      <w:proofErr w:type="spellStart"/>
       <w:r>
-        <w:t>Wyznaczyć</w:t>
-      </w:r>
-      <w:proofErr w:type="spellEnd"/>
-      <w:r>
-        <w:t xml:space="preserve"> </w:t>
-      </w:r>
-      <w:proofErr w:type="spellStart"/>
-      <w:r>
-        <w:t>trasę</w:t>
-      </w:r>
-      <w:proofErr w:type="spellEnd"/>
-      <w:r>
-        <w:t xml:space="preserve"> P2 w </w:t>
-      </w:r>
-      <w:proofErr w:type="spellStart"/>
-      <w:r>
-        <w:t>grafie</w:t>
-      </w:r>
-      <w:proofErr w:type="spellEnd"/>
-      <w:r>
-        <w:t xml:space="preserve"> po </w:t>
-      </w:r>
-      <w:proofErr w:type="spellStart"/>
-      <w:r>
-        <w:t>usunięciu</w:t>
-      </w:r>
-      <w:proofErr w:type="spellEnd"/>
-      <w:r>
-        <w:t xml:space="preserve"> </w:t>
-      </w:r>
-      <w:proofErr w:type="spellStart"/>
-      <w:r>
-        <w:t>łączy</w:t>
-      </w:r>
-      <w:proofErr w:type="spellEnd"/>
-      <w:r>
-        <w:t>.</w:t>
+        <w:t>Wyznaczyć trasę P2 w grafie po usunięciu łączy.</w:t>
       </w:r>
     </w:p>
     <w:p>
       <w:pPr>
         <w:pStyle w:val="Listanumerowana"/>
       </w:pPr>
-      <w:proofErr w:type="spellStart"/>
       <w:r>
-        <w:t>Odrzucić</w:t>
-      </w:r>
-      <w:proofErr w:type="spellEnd"/>
-      <w:r>
-        <w:t xml:space="preserve"> </w:t>
-      </w:r>
-      <w:proofErr w:type="spellStart"/>
-      <w:r>
-        <w:t>żądanie</w:t>
-      </w:r>
-      <w:proofErr w:type="spellEnd"/>
-      <w:r>
-        <w:t xml:space="preserve">, </w:t>
-      </w:r>
-      <w:proofErr w:type="spellStart"/>
-      <w:r>
-        <w:t>jeżeli</w:t>
-      </w:r>
-      <w:proofErr w:type="spellEnd"/>
-      <w:r>
-        <w:t xml:space="preserve"> </w:t>
-      </w:r>
-      <w:proofErr w:type="spellStart"/>
-      <w:r>
-        <w:t>nie</w:t>
-      </w:r>
-      <w:proofErr w:type="spellEnd"/>
-      <w:r>
-        <w:t xml:space="preserve"> </w:t>
-      </w:r>
-      <w:proofErr w:type="spellStart"/>
-      <w:r>
-        <w:t>udało</w:t>
-      </w:r>
-      <w:proofErr w:type="spellEnd"/>
-      <w:r>
-        <w:t xml:space="preserve"> </w:t>
-      </w:r>
-      <w:proofErr w:type="spellStart"/>
-      <w:r>
-        <w:t>się</w:t>
-      </w:r>
-      <w:proofErr w:type="spellEnd"/>
-      <w:r>
-        <w:t xml:space="preserve"> </w:t>
-      </w:r>
-      <w:proofErr w:type="spellStart"/>
-      <w:r>
-        <w:t>uzyskać</w:t>
-      </w:r>
-      <w:proofErr w:type="spellEnd"/>
-      <w:r>
-        <w:t xml:space="preserve"> </w:t>
-      </w:r>
-      <w:proofErr w:type="spellStart"/>
-      <w:r>
-        <w:t>dwóch</w:t>
-      </w:r>
-      <w:proofErr w:type="spellEnd"/>
-      <w:r>
-        <w:t xml:space="preserve"> </w:t>
-      </w:r>
-      <w:proofErr w:type="spellStart"/>
-      <w:r>
-        <w:t>tras</w:t>
-      </w:r>
-      <w:proofErr w:type="spellEnd"/>
-      <w:r>
-        <w:t>.</w:t>
+        <w:t>Odrzucić żądanie, jeżeli nie udało się uzyskać dwóch tras.</w:t>
       </w:r>
     </w:p>
     <w:p>
-      <w:proofErr w:type="spellStart"/>
       <w:r>
         <w:rPr>
           <w:b/>
           <w:color w:val="1F4E79"/>
         </w:rPr>
-        <w:t>Ograniczenie</w:t>
-      </w:r>
-      <w:proofErr w:type="spellEnd"/>
-      <w:r>
-        <w:rPr>
-          <w:b/>
-          <w:color w:val="1F4E79"/>
-        </w:rPr>
-        <w:t>:</w:t>
+        <w:t>Ograniczenie:</w:t>
       </w:r>
       <w:r>
-        <w:t xml:space="preserve"> </w:t>
-      </w:r>
-      <w:proofErr w:type="spellStart"/>
-      <w:r>
-        <w:t>zachłanny</w:t>
-      </w:r>
-      <w:proofErr w:type="spellEnd"/>
-      <w:r>
-        <w:t xml:space="preserve"> </w:t>
-      </w:r>
-      <w:proofErr w:type="spellStart"/>
-      <w:r>
-        <w:t>wybór</w:t>
-      </w:r>
-      <w:proofErr w:type="spellEnd"/>
-      <w:r>
-        <w:t xml:space="preserve"> P1 </w:t>
-      </w:r>
-      <w:proofErr w:type="spellStart"/>
-      <w:r>
-        <w:t>może</w:t>
-      </w:r>
-      <w:proofErr w:type="spellEnd"/>
-      <w:r>
-        <w:t xml:space="preserve"> </w:t>
-      </w:r>
-      <w:proofErr w:type="spellStart"/>
-      <w:r>
-        <w:t>wpaść</w:t>
-      </w:r>
-      <w:proofErr w:type="spellEnd"/>
-      <w:r>
-        <w:t xml:space="preserve"> w </w:t>
-      </w:r>
-      <w:proofErr w:type="spellStart"/>
-      <w:r>
-        <w:t>pułapkę</w:t>
-      </w:r>
-      <w:proofErr w:type="spellEnd"/>
-      <w:r>
-        <w:t xml:space="preserve"> </w:t>
-      </w:r>
-      <w:proofErr w:type="spellStart"/>
-      <w:r>
-        <w:t>i</w:t>
-      </w:r>
-      <w:proofErr w:type="spellEnd"/>
-      <w:r>
-        <w:t xml:space="preserve"> </w:t>
-      </w:r>
-      <w:proofErr w:type="spellStart"/>
-      <w:r>
-        <w:t>uniemożliwić</w:t>
-      </w:r>
-      <w:proofErr w:type="spellEnd"/>
-      <w:r>
-        <w:t xml:space="preserve"> </w:t>
-      </w:r>
-      <w:proofErr w:type="spellStart"/>
-      <w:r>
-        <w:t>znalezienie</w:t>
-      </w:r>
-      <w:proofErr w:type="spellEnd"/>
-      <w:r>
-        <w:t xml:space="preserve"> </w:t>
-      </w:r>
-      <w:proofErr w:type="spellStart"/>
-      <w:r>
-        <w:t>pary</w:t>
-      </w:r>
-      <w:proofErr w:type="spellEnd"/>
-      <w:r>
-        <w:t xml:space="preserve"> </w:t>
-      </w:r>
-      <w:proofErr w:type="spellStart"/>
-      <w:r>
-        <w:t>tras</w:t>
-      </w:r>
-      <w:proofErr w:type="spellEnd"/>
-      <w:r>
-        <w:t xml:space="preserve">, </w:t>
-      </w:r>
-      <w:proofErr w:type="spellStart"/>
-      <w:r>
-        <w:t>mimo</w:t>
-      </w:r>
-      <w:proofErr w:type="spellEnd"/>
-      <w:r>
-        <w:t xml:space="preserve"> </w:t>
-      </w:r>
-      <w:proofErr w:type="spellStart"/>
-      <w:r>
-        <w:t>że</w:t>
-      </w:r>
-      <w:proofErr w:type="spellEnd"/>
-      <w:r>
-        <w:t xml:space="preserve"> taka para </w:t>
-      </w:r>
-      <w:proofErr w:type="spellStart"/>
-      <w:r>
-        <w:t>istnieje</w:t>
-      </w:r>
-      <w:proofErr w:type="spellEnd"/>
-      <w:r>
-        <w:t>.</w:t>
+        <w:t xml:space="preserve"> zachłanny wybór P1 może wpaść w pułapkę i uniemożliwić znalezienie pary tras, mimo że taka para istnieje.</w:t>
       </w:r>
     </w:p>
     <w:p>
@@ -3865,197 +2701,12 @@
       </w:r>
       <w:r>
         <w:br/>
+        <w:t>Algorytm Suurballe’a</w:t>
       </w:r>
-      <w:proofErr w:type="spellStart"/>
-      <w:r>
-        <w:t>Algorytm</w:t>
-      </w:r>
-      <w:proofErr w:type="spellEnd"/>
-      <w:r>
-        <w:t xml:space="preserve"> </w:t>
-      </w:r>
-      <w:proofErr w:type="spellStart"/>
-      <w:r>
-        <w:t>Suurballe’a</w:t>
-      </w:r>
-      <w:proofErr w:type="spellEnd"/>
     </w:p>
     <w:p>
-      <w:proofErr w:type="spellStart"/>
       <w:r>
-        <w:t>Algorytm</w:t>
-      </w:r>
-      <w:proofErr w:type="spellEnd"/>
-      <w:r>
-        <w:t xml:space="preserve"> </w:t>
-      </w:r>
-      <w:proofErr w:type="spellStart"/>
-      <w:r>
-        <w:t>Suurballe’a</w:t>
-      </w:r>
-      <w:proofErr w:type="spellEnd"/>
-      <w:r>
-        <w:t xml:space="preserve"> </w:t>
-      </w:r>
-      <w:proofErr w:type="spellStart"/>
-      <w:r>
-        <w:t>wyznacza</w:t>
-      </w:r>
-      <w:proofErr w:type="spellEnd"/>
-      <w:r>
-        <w:t xml:space="preserve"> </w:t>
-      </w:r>
-      <w:proofErr w:type="spellStart"/>
-      <w:r>
-        <w:t>parę</w:t>
-      </w:r>
-      <w:proofErr w:type="spellEnd"/>
-      <w:r>
-        <w:t xml:space="preserve"> </w:t>
-      </w:r>
-      <w:proofErr w:type="spellStart"/>
-      <w:r>
-        <w:t>tras</w:t>
-      </w:r>
-      <w:proofErr w:type="spellEnd"/>
-      <w:r>
-        <w:t xml:space="preserve"> </w:t>
-      </w:r>
-      <w:proofErr w:type="spellStart"/>
-      <w:r>
-        <w:t>łączowo</w:t>
-      </w:r>
-      <w:proofErr w:type="spellEnd"/>
-      <w:r>
-        <w:t xml:space="preserve"> </w:t>
-      </w:r>
-      <w:proofErr w:type="spellStart"/>
-      <w:r>
-        <w:t>rozłącznych</w:t>
-      </w:r>
-      <w:proofErr w:type="spellEnd"/>
-      <w:r>
-        <w:t xml:space="preserve"> o </w:t>
-      </w:r>
-      <w:proofErr w:type="spellStart"/>
-      <w:r>
-        <w:t>minimalnym</w:t>
-      </w:r>
-      <w:proofErr w:type="spellEnd"/>
-      <w:r>
-        <w:t xml:space="preserve"> </w:t>
-      </w:r>
-      <w:proofErr w:type="spellStart"/>
-      <w:r>
-        <w:t>łącznym</w:t>
-      </w:r>
-      <w:proofErr w:type="spellEnd"/>
-      <w:r>
-        <w:t xml:space="preserve"> </w:t>
-      </w:r>
-      <w:proofErr w:type="spellStart"/>
-      <w:r>
-        <w:t>koszcie</w:t>
-      </w:r>
-      <w:proofErr w:type="spellEnd"/>
-      <w:r>
-        <w:t xml:space="preserve">. </w:t>
-      </w:r>
-      <w:proofErr w:type="spellStart"/>
-      <w:r>
-        <w:t>Dla</w:t>
-      </w:r>
-      <w:proofErr w:type="spellEnd"/>
-      <w:r>
-        <w:t xml:space="preserve"> </w:t>
-      </w:r>
-      <w:proofErr w:type="spellStart"/>
-      <w:r>
-        <w:t>grafu</w:t>
-      </w:r>
-      <w:proofErr w:type="spellEnd"/>
-      <w:r>
-        <w:t xml:space="preserve"> </w:t>
-      </w:r>
-      <w:proofErr w:type="spellStart"/>
-      <w:r>
-        <w:t>nieskierowanego</w:t>
-      </w:r>
-      <w:proofErr w:type="spellEnd"/>
-      <w:r>
-        <w:t xml:space="preserve"> </w:t>
-      </w:r>
-      <w:proofErr w:type="spellStart"/>
-      <w:r>
-        <w:t>każde</w:t>
-      </w:r>
-      <w:proofErr w:type="spellEnd"/>
-      <w:r>
-        <w:t xml:space="preserve"> </w:t>
-      </w:r>
-      <w:proofErr w:type="spellStart"/>
-      <w:r>
-        <w:t>łącze</w:t>
-      </w:r>
-      <w:proofErr w:type="spellEnd"/>
-      <w:r>
-        <w:t xml:space="preserve"> </w:t>
-      </w:r>
-      <w:proofErr w:type="spellStart"/>
-      <w:r>
-        <w:t>reprezentowane</w:t>
-      </w:r>
-      <w:proofErr w:type="spellEnd"/>
-      <w:r>
-        <w:t xml:space="preserve"> jest </w:t>
-      </w:r>
-      <w:proofErr w:type="spellStart"/>
-      <w:r>
-        <w:t>pomocniczo</w:t>
-      </w:r>
-      <w:proofErr w:type="spellEnd"/>
-      <w:r>
-        <w:t xml:space="preserve"> </w:t>
-      </w:r>
-      <w:proofErr w:type="spellStart"/>
-      <w:r>
-        <w:t>przez</w:t>
-      </w:r>
-      <w:proofErr w:type="spellEnd"/>
-      <w:r>
-        <w:t xml:space="preserve"> </w:t>
-      </w:r>
-      <w:proofErr w:type="spellStart"/>
-      <w:r>
-        <w:t>dwa</w:t>
-      </w:r>
-      <w:proofErr w:type="spellEnd"/>
-      <w:r>
-        <w:t xml:space="preserve"> </w:t>
-      </w:r>
-      <w:proofErr w:type="spellStart"/>
-      <w:r>
-        <w:t>łuki</w:t>
-      </w:r>
-      <w:proofErr w:type="spellEnd"/>
-      <w:r>
-        <w:t xml:space="preserve"> </w:t>
-      </w:r>
-      <w:proofErr w:type="spellStart"/>
-      <w:r>
-        <w:t>przeciwnych</w:t>
-      </w:r>
-      <w:proofErr w:type="spellEnd"/>
-      <w:r>
-        <w:t xml:space="preserve"> </w:t>
-      </w:r>
-      <w:proofErr w:type="spellStart"/>
-      <w:r>
-        <w:t>kierunków</w:t>
-      </w:r>
-      <w:proofErr w:type="spellEnd"/>
-      <w:r>
-        <w:t>.</w:t>
+        <w:t>Algorytm Suurballe’a wyznacza parę tras łączowo rozłącznych o minimalnym łącznym koszcie. Dla grafu nieskierowanego każde łącze reprezentowane jest pomocniczo przez dwa łuki przeciwnych kierunków.</w:t>
       </w:r>
     </w:p>
     <w:p>
@@ -4066,307 +2717,40 @@
           <w:numId w:val="12"/>
         </w:numPr>
       </w:pPr>
-      <w:proofErr w:type="spellStart"/>
       <w:r>
-        <w:t>Wyznaczyć</w:t>
-      </w:r>
-      <w:proofErr w:type="spellEnd"/>
-      <w:r>
-        <w:t xml:space="preserve"> </w:t>
-      </w:r>
-      <w:proofErr w:type="spellStart"/>
-      <w:r>
-        <w:t>najkrótszą</w:t>
-      </w:r>
-      <w:proofErr w:type="spellEnd"/>
-      <w:r>
-        <w:t xml:space="preserve"> </w:t>
-      </w:r>
-      <w:proofErr w:type="spellStart"/>
-      <w:r>
-        <w:t>ścieżkę</w:t>
-      </w:r>
-      <w:proofErr w:type="spellEnd"/>
-      <w:r>
-        <w:t xml:space="preserve"> P1 </w:t>
-      </w:r>
-      <w:proofErr w:type="spellStart"/>
-      <w:r>
-        <w:t>i</w:t>
-      </w:r>
-      <w:proofErr w:type="spellEnd"/>
-      <w:r>
-        <w:t xml:space="preserve"> </w:t>
-      </w:r>
-      <w:proofErr w:type="spellStart"/>
-      <w:r>
-        <w:t>odległości</w:t>
-      </w:r>
-      <w:proofErr w:type="spellEnd"/>
-      <w:r>
-        <w:t xml:space="preserve"> d(v) od </w:t>
-      </w:r>
-      <w:proofErr w:type="spellStart"/>
-      <w:r>
-        <w:t>źródła</w:t>
-      </w:r>
-      <w:proofErr w:type="spellEnd"/>
-      <w:r>
-        <w:t>.</w:t>
+        <w:t>Wyznaczyć najkrótszą ścieżkę P1 i odległości d(v) od źródła.</w:t>
       </w:r>
     </w:p>
     <w:p>
       <w:pPr>
         <w:pStyle w:val="Listanumerowana"/>
       </w:pPr>
-      <w:proofErr w:type="spellStart"/>
       <w:r>
-        <w:t>Przeważyć</w:t>
-      </w:r>
-      <w:proofErr w:type="spellEnd"/>
-      <w:r>
-        <w:t xml:space="preserve"> </w:t>
-      </w:r>
-      <w:proofErr w:type="spellStart"/>
-      <w:r>
-        <w:t>łuki</w:t>
-      </w:r>
-      <w:proofErr w:type="spellEnd"/>
-      <w:r>
-        <w:t xml:space="preserve"> </w:t>
-      </w:r>
-      <w:proofErr w:type="spellStart"/>
-      <w:r>
-        <w:t>wzorem</w:t>
-      </w:r>
-      <w:proofErr w:type="spellEnd"/>
-      <w:r>
-        <w:t xml:space="preserve"> c'(</w:t>
-      </w:r>
-      <w:proofErr w:type="spellStart"/>
-      <w:proofErr w:type="gramStart"/>
-      <w:r>
-        <w:t>u,v</w:t>
-      </w:r>
-      <w:proofErr w:type="spellEnd"/>
-      <w:proofErr w:type="gramEnd"/>
-      <w:r>
-        <w:t>)=c(</w:t>
-      </w:r>
-      <w:proofErr w:type="spellStart"/>
-      <w:r>
-        <w:t>u,v</w:t>
-      </w:r>
-      <w:proofErr w:type="spellEnd"/>
-      <w:r>
-        <w:t>)+d(u)-d(v).</w:t>
+        <w:t>Przeważyć łuki wzorem c'(u,v)=c(u,v)+d(u)-d(v).</w:t>
       </w:r>
     </w:p>
     <w:p>
       <w:pPr>
         <w:pStyle w:val="Listanumerowana"/>
       </w:pPr>
-      <w:proofErr w:type="spellStart"/>
       <w:r>
-        <w:t>Usunąć</w:t>
-      </w:r>
-      <w:proofErr w:type="spellEnd"/>
-      <w:r>
-        <w:t xml:space="preserve"> </w:t>
-      </w:r>
-      <w:proofErr w:type="spellStart"/>
-      <w:r>
-        <w:t>łuki</w:t>
-      </w:r>
-      <w:proofErr w:type="spellEnd"/>
-      <w:r>
-        <w:t xml:space="preserve"> P1 w </w:t>
-      </w:r>
-      <w:proofErr w:type="spellStart"/>
-      <w:r>
-        <w:t>kierunku</w:t>
-      </w:r>
-      <w:proofErr w:type="spellEnd"/>
-      <w:r>
-        <w:t xml:space="preserve"> </w:t>
-      </w:r>
-      <w:proofErr w:type="spellStart"/>
-      <w:r>
-        <w:t>s→t</w:t>
-      </w:r>
-      <w:proofErr w:type="spellEnd"/>
-      <w:r>
-        <w:t xml:space="preserve"> </w:t>
-      </w:r>
-      <w:proofErr w:type="spellStart"/>
-      <w:r>
-        <w:t>i</w:t>
-      </w:r>
-      <w:proofErr w:type="spellEnd"/>
-      <w:r>
-        <w:t xml:space="preserve"> </w:t>
-      </w:r>
-      <w:proofErr w:type="spellStart"/>
-      <w:r>
-        <w:t>dodać</w:t>
-      </w:r>
-      <w:proofErr w:type="spellEnd"/>
-      <w:r>
-        <w:t xml:space="preserve"> </w:t>
-      </w:r>
-      <w:proofErr w:type="spellStart"/>
-      <w:r>
-        <w:t>łuki</w:t>
-      </w:r>
-      <w:proofErr w:type="spellEnd"/>
-      <w:r>
-        <w:t xml:space="preserve"> </w:t>
-      </w:r>
-      <w:proofErr w:type="spellStart"/>
-      <w:r>
-        <w:t>odwrotne</w:t>
-      </w:r>
-      <w:proofErr w:type="spellEnd"/>
-      <w:r>
-        <w:t xml:space="preserve"> o </w:t>
-      </w:r>
-      <w:proofErr w:type="spellStart"/>
-      <w:r>
-        <w:t>koszcie</w:t>
-      </w:r>
-      <w:proofErr w:type="spellEnd"/>
-      <w:r>
-        <w:t xml:space="preserve"> 0.</w:t>
+        <w:t>Usunąć łuki P1 w kierunku s→t i dodać łuki odwrotne o koszcie 0.</w:t>
       </w:r>
     </w:p>
     <w:p>
       <w:pPr>
         <w:pStyle w:val="Listanumerowana"/>
       </w:pPr>
-      <w:proofErr w:type="spellStart"/>
       <w:r>
-        <w:t>Wyznaczyć</w:t>
-      </w:r>
-      <w:proofErr w:type="spellEnd"/>
-      <w:r>
-        <w:t xml:space="preserve"> </w:t>
-      </w:r>
-      <w:proofErr w:type="spellStart"/>
-      <w:r>
-        <w:t>drugą</w:t>
-      </w:r>
-      <w:proofErr w:type="spellEnd"/>
-      <w:r>
-        <w:t xml:space="preserve"> </w:t>
-      </w:r>
-      <w:proofErr w:type="spellStart"/>
-      <w:r>
-        <w:t>ścieżkę</w:t>
-      </w:r>
-      <w:proofErr w:type="spellEnd"/>
-      <w:r>
-        <w:t xml:space="preserve"> P2 w </w:t>
-      </w:r>
-      <w:proofErr w:type="spellStart"/>
-      <w:r>
-        <w:t>grafie</w:t>
-      </w:r>
-      <w:proofErr w:type="spellEnd"/>
-      <w:r>
-        <w:t xml:space="preserve"> </w:t>
-      </w:r>
-      <w:proofErr w:type="spellStart"/>
-      <w:r>
-        <w:t>pomocniczym</w:t>
-      </w:r>
-      <w:proofErr w:type="spellEnd"/>
-      <w:r>
-        <w:t>.</w:t>
+        <w:t>Wyznaczyć drugą ścieżkę P2 w grafie pomocniczym.</w:t>
       </w:r>
     </w:p>
     <w:p>
       <w:pPr>
         <w:pStyle w:val="Listanumerowana"/>
       </w:pPr>
-      <w:proofErr w:type="spellStart"/>
       <w:r>
-        <w:t>Usunąć</w:t>
-      </w:r>
-      <w:proofErr w:type="spellEnd"/>
-      <w:r>
-        <w:t xml:space="preserve"> </w:t>
-      </w:r>
-      <w:proofErr w:type="spellStart"/>
-      <w:r>
-        <w:t>przeciwne</w:t>
-      </w:r>
-      <w:proofErr w:type="spellEnd"/>
-      <w:r>
-        <w:t xml:space="preserve"> </w:t>
-      </w:r>
-      <w:proofErr w:type="spellStart"/>
-      <w:r>
-        <w:t>wspólne</w:t>
-      </w:r>
-      <w:proofErr w:type="spellEnd"/>
-      <w:r>
-        <w:t xml:space="preserve"> </w:t>
-      </w:r>
-      <w:proofErr w:type="spellStart"/>
-      <w:r>
-        <w:t>łuki</w:t>
-      </w:r>
-      <w:proofErr w:type="spellEnd"/>
-      <w:r>
-        <w:t xml:space="preserve"> </w:t>
-      </w:r>
-      <w:proofErr w:type="spellStart"/>
-      <w:r>
-        <w:t>i</w:t>
-      </w:r>
-      <w:proofErr w:type="spellEnd"/>
-      <w:r>
-        <w:t xml:space="preserve"> </w:t>
-      </w:r>
-      <w:proofErr w:type="spellStart"/>
-      <w:r>
-        <w:t>rozłożyć</w:t>
-      </w:r>
-      <w:proofErr w:type="spellEnd"/>
-      <w:r>
-        <w:t xml:space="preserve"> </w:t>
-      </w:r>
-      <w:proofErr w:type="spellStart"/>
-      <w:r>
-        <w:t>wynik</w:t>
-      </w:r>
-      <w:proofErr w:type="spellEnd"/>
-      <w:r>
-        <w:t xml:space="preserve"> </w:t>
-      </w:r>
-      <w:proofErr w:type="spellStart"/>
-      <w:r>
-        <w:t>na</w:t>
-      </w:r>
-      <w:proofErr w:type="spellEnd"/>
-      <w:r>
-        <w:t xml:space="preserve"> </w:t>
-      </w:r>
-      <w:proofErr w:type="spellStart"/>
-      <w:r>
-        <w:t>dwie</w:t>
-      </w:r>
-      <w:proofErr w:type="spellEnd"/>
-      <w:r>
-        <w:t xml:space="preserve"> </w:t>
-      </w:r>
-      <w:proofErr w:type="spellStart"/>
-      <w:r>
-        <w:t>trasy</w:t>
-      </w:r>
-      <w:proofErr w:type="spellEnd"/>
-      <w:r>
-        <w:t xml:space="preserve"> s-t.</w:t>
+        <w:t>Usunąć przeciwne wspólne łuki i rozłożyć wynik na dwie trasy s-t.</w:t>
       </w:r>
     </w:p>
     <w:p>
@@ -4380,297 +2764,31 @@
       </w:pPr>
     </w:p>
     <w:p>
-      <w:proofErr w:type="spellStart"/>
       <w:r>
         <w:rPr>
           <w:b/>
           <w:color w:val="1F4E79"/>
         </w:rPr>
-        <w:t>Ograniczenie</w:t>
-      </w:r>
-      <w:proofErr w:type="spellEnd"/>
-      <w:r>
-        <w:rPr>
-          <w:b/>
-          <w:color w:val="1F4E79"/>
-        </w:rPr>
-        <w:t>:</w:t>
+        <w:t>Ograniczenie:</w:t>
       </w:r>
       <w:r>
         <w:t xml:space="preserve"> </w:t>
       </w:r>
-      <w:proofErr w:type="spellStart"/>
       <w:r>
-        <w:t>algorytm</w:t>
-      </w:r>
-      <w:proofErr w:type="spellEnd"/>
-      <w:r>
-        <w:t xml:space="preserve"> </w:t>
-      </w:r>
-      <w:proofErr w:type="spellStart"/>
-      <w:r>
-        <w:t>Suurballe’a</w:t>
-      </w:r>
-      <w:proofErr w:type="spellEnd"/>
-      <w:r>
-        <w:t xml:space="preserve"> </w:t>
-      </w:r>
-      <w:proofErr w:type="spellStart"/>
-      <w:r>
-        <w:t>zakłada</w:t>
-      </w:r>
-      <w:proofErr w:type="spellEnd"/>
-      <w:r>
-        <w:t xml:space="preserve"> </w:t>
-      </w:r>
-      <w:proofErr w:type="spellStart"/>
-      <w:r>
-        <w:t>stosowanie</w:t>
-      </w:r>
-      <w:proofErr w:type="spellEnd"/>
-      <w:r>
-        <w:t xml:space="preserve"> </w:t>
-      </w:r>
-      <w:proofErr w:type="spellStart"/>
-      <w:r>
-        <w:t>tej</w:t>
-      </w:r>
-      <w:proofErr w:type="spellEnd"/>
-      <w:r>
-        <w:t xml:space="preserve"> </w:t>
-      </w:r>
-      <w:proofErr w:type="spellStart"/>
-      <w:r>
-        <w:t>samej</w:t>
-      </w:r>
-      <w:proofErr w:type="spellEnd"/>
-      <w:r>
-        <w:t xml:space="preserve"> </w:t>
-      </w:r>
-      <w:proofErr w:type="spellStart"/>
-      <w:r>
-        <w:t>metryki</w:t>
-      </w:r>
-      <w:proofErr w:type="spellEnd"/>
-      <w:r>
-        <w:t xml:space="preserve"> </w:t>
-      </w:r>
-      <w:proofErr w:type="spellStart"/>
-      <w:r>
-        <w:t>kosztu</w:t>
-      </w:r>
-      <w:proofErr w:type="spellEnd"/>
-      <w:r>
-        <w:t xml:space="preserve"> </w:t>
-      </w:r>
-      <w:proofErr w:type="spellStart"/>
-      <w:r>
-        <w:t>dla</w:t>
-      </w:r>
-      <w:proofErr w:type="spellEnd"/>
-      <w:r>
-        <w:t xml:space="preserve"> </w:t>
-      </w:r>
-      <w:proofErr w:type="spellStart"/>
-      <w:r>
-        <w:t>obu</w:t>
-      </w:r>
-      <w:proofErr w:type="spellEnd"/>
-      <w:r>
-        <w:t xml:space="preserve"> </w:t>
-      </w:r>
-      <w:proofErr w:type="spellStart"/>
-      <w:r>
-        <w:t>tras</w:t>
-      </w:r>
-      <w:proofErr w:type="spellEnd"/>
-      <w:r>
-        <w:t xml:space="preserve">. </w:t>
-      </w:r>
-      <w:proofErr w:type="spellStart"/>
-      <w:r>
-        <w:t>Jeśli</w:t>
-      </w:r>
-      <w:proofErr w:type="spellEnd"/>
-      <w:r>
-        <w:t xml:space="preserve"> </w:t>
-      </w:r>
-      <w:proofErr w:type="spellStart"/>
-      <w:r>
-        <w:t>trasa</w:t>
-      </w:r>
-      <w:proofErr w:type="spellEnd"/>
-      <w:r>
-        <w:t xml:space="preserve"> </w:t>
-      </w:r>
-      <w:proofErr w:type="spellStart"/>
-      <w:r>
-        <w:t>podstawowa</w:t>
-      </w:r>
-      <w:proofErr w:type="spellEnd"/>
-      <w:r>
-        <w:t xml:space="preserve"> </w:t>
-      </w:r>
-      <w:proofErr w:type="spellStart"/>
-      <w:r>
-        <w:t>i</w:t>
-      </w:r>
-      <w:proofErr w:type="spellEnd"/>
-      <w:r>
-        <w:t xml:space="preserve"> </w:t>
-      </w:r>
-      <w:proofErr w:type="spellStart"/>
-      <w:r>
-        <w:t>zabezpieczająca</w:t>
-      </w:r>
-      <w:proofErr w:type="spellEnd"/>
-      <w:r>
-        <w:t xml:space="preserve"> </w:t>
-      </w:r>
-      <w:proofErr w:type="spellStart"/>
-      <w:r>
-        <w:t>powinny</w:t>
-      </w:r>
-      <w:proofErr w:type="spellEnd"/>
-      <w:r>
-        <w:t xml:space="preserve"> </w:t>
-      </w:r>
-      <w:proofErr w:type="spellStart"/>
-      <w:r>
-        <w:t>być</w:t>
-      </w:r>
-      <w:proofErr w:type="spellEnd"/>
-      <w:r>
-        <w:t xml:space="preserve"> </w:t>
-      </w:r>
-      <w:proofErr w:type="spellStart"/>
-      <w:r>
-        <w:t>oceniane</w:t>
-      </w:r>
-      <w:proofErr w:type="spellEnd"/>
-      <w:r>
-        <w:t xml:space="preserve"> </w:t>
-      </w:r>
-      <w:proofErr w:type="spellStart"/>
-      <w:r>
-        <w:t>według</w:t>
-      </w:r>
-      <w:proofErr w:type="spellEnd"/>
-      <w:r>
-        <w:t xml:space="preserve"> </w:t>
-      </w:r>
-      <w:proofErr w:type="spellStart"/>
-      <w:r>
-        <w:t>różnych</w:t>
-      </w:r>
-      <w:proofErr w:type="spellEnd"/>
-      <w:r>
-        <w:t xml:space="preserve"> </w:t>
-      </w:r>
-      <w:proofErr w:type="spellStart"/>
-      <w:r>
-        <w:t>kryteriów</w:t>
-      </w:r>
-      <w:proofErr w:type="spellEnd"/>
-      <w:r>
-        <w:t xml:space="preserve">, problem </w:t>
-      </w:r>
-      <w:proofErr w:type="spellStart"/>
-      <w:r>
-        <w:t>przechodzi</w:t>
-      </w:r>
-      <w:proofErr w:type="spellEnd"/>
-      <w:r>
-        <w:t xml:space="preserve"> w </w:t>
-      </w:r>
-      <w:proofErr w:type="spellStart"/>
-      <w:r>
-        <w:t>przypadek</w:t>
-      </w:r>
-      <w:proofErr w:type="spellEnd"/>
-      <w:r>
-        <w:t xml:space="preserve"> multi-cost, </w:t>
-      </w:r>
-      <w:proofErr w:type="spellStart"/>
-      <w:r>
-        <w:t>który</w:t>
-      </w:r>
-      <w:proofErr w:type="spellEnd"/>
-      <w:r>
-        <w:t xml:space="preserve"> jest </w:t>
-      </w:r>
-      <w:proofErr w:type="spellStart"/>
-      <w:r>
-        <w:t>znacznie</w:t>
-      </w:r>
-      <w:proofErr w:type="spellEnd"/>
-      <w:r>
-        <w:t xml:space="preserve"> </w:t>
-      </w:r>
-      <w:proofErr w:type="spellStart"/>
-      <w:r>
-        <w:t>trudniejszy</w:t>
-      </w:r>
-      <w:proofErr w:type="spellEnd"/>
-      <w:r>
-        <w:t xml:space="preserve"> </w:t>
-      </w:r>
-      <w:proofErr w:type="spellStart"/>
-      <w:r>
-        <w:t>obliczeniowo</w:t>
-      </w:r>
-      <w:proofErr w:type="spellEnd"/>
-      <w:r>
-        <w:t xml:space="preserve"> </w:t>
-      </w:r>
-      <w:proofErr w:type="spellStart"/>
-      <w:r>
-        <w:t>i</w:t>
-      </w:r>
-      <w:proofErr w:type="spellEnd"/>
-      <w:r>
-        <w:t xml:space="preserve"> </w:t>
+        <w:t xml:space="preserve">algorytm Suurballe’a zakłada stosowanie tej samej metryki kosztu dla obu tras. Jeśli trasa podstawowa i zabezpieczająca powinny być oceniane według różnych kryteriów, problem przechodzi w przypadek multi-cost, który jest znacznie trudniejszy obliczeniowo i </w:t>
       </w:r>
       <w:r>
-        <w:t xml:space="preserve">z </w:t>
+        <w:t>z dużym prawdopodobieńst</w:t>
       </w:r>
-      <w:proofErr w:type="spellStart"/>
       <w:r>
-        <w:t>dużym</w:t>
+        <w:t>w</w:t>
       </w:r>
-      <w:proofErr w:type="spellEnd"/>
       <w:r>
-        <w:t xml:space="preserve"> </w:t>
+        <w:t xml:space="preserve">em </w:t>
       </w:r>
-      <w:proofErr w:type="spellStart"/>
       <w:r>
-        <w:t>prawdopodobieństem</w:t>
+        <w:t>może być NP-trudny</w:t>
       </w:r>
-      <w:proofErr w:type="spellEnd"/>
-      <w:r>
-        <w:t xml:space="preserve"> </w:t>
-      </w:r>
-      <w:proofErr w:type="spellStart"/>
-      <w:r>
-        <w:t>może</w:t>
-      </w:r>
-      <w:proofErr w:type="spellEnd"/>
-      <w:r>
-        <w:t xml:space="preserve"> </w:t>
-      </w:r>
-      <w:proofErr w:type="spellStart"/>
-      <w:r>
-        <w:t>być</w:t>
-      </w:r>
-      <w:proofErr w:type="spellEnd"/>
-      <w:r>
-        <w:t xml:space="preserve"> NP-</w:t>
-      </w:r>
-      <w:proofErr w:type="spellStart"/>
-      <w:r>
-        <w:t>trudny</w:t>
-      </w:r>
-      <w:proofErr w:type="spellEnd"/>
       <w:r>
         <w:t xml:space="preserve"> </w:t>
       </w:r>
@@ -4691,13 +2809,7 @@
           <w:rPr>
             <w:rStyle w:val="Hipercze"/>
           </w:rPr>
-          <w:t>]</w:t>
-        </w:r>
-        <w:r>
-          <w:rPr>
-            <w:rStyle w:val="Hipercze"/>
-          </w:rPr>
-          <w:t>.</w:t>
+          <w:t>].</w:t>
         </w:r>
       </w:hyperlink>
     </w:p>
@@ -4707,46 +2819,9 @@
       </w:pPr>
       <w:bookmarkStart w:id="2" w:name="_Toc228201681"/>
       <w:r>
-        <w:t xml:space="preserve">3. </w:t>
-      </w:r>
-      <w:proofErr w:type="spellStart"/>
-      <w:r>
-        <w:t>Funkcje</w:t>
-      </w:r>
-      <w:proofErr w:type="spellEnd"/>
-      <w:r>
-        <w:t xml:space="preserve"> </w:t>
-      </w:r>
-      <w:proofErr w:type="spellStart"/>
-      <w:r>
-        <w:t>biblioteki</w:t>
-      </w:r>
-      <w:proofErr w:type="spellEnd"/>
-      <w:r>
-        <w:t xml:space="preserve"> </w:t>
-      </w:r>
-      <w:proofErr w:type="spellStart"/>
-      <w:r>
-        <w:t>NetworkX</w:t>
-      </w:r>
-      <w:proofErr w:type="spellEnd"/>
-      <w:r>
-        <w:t xml:space="preserve"> </w:t>
-      </w:r>
-      <w:proofErr w:type="spellStart"/>
-      <w:r>
-        <w:t>użyte</w:t>
-      </w:r>
-      <w:proofErr w:type="spellEnd"/>
-      <w:r>
-        <w:t xml:space="preserve"> w </w:t>
-      </w:r>
-      <w:proofErr w:type="spellStart"/>
-      <w:r>
-        <w:t>rozwiązaniu</w:t>
+        <w:t>3. Funkcje biblioteki NetworkX użyte w rozwiązaniu</w:t>
       </w:r>
       <w:bookmarkEnd w:id="2"/>
-      <w:proofErr w:type="spellEnd"/>
     </w:p>
     <w:tbl>
       <w:tblPr>
@@ -4772,7 +2847,6 @@
             <w:pPr>
               <w:spacing w:after="0"/>
             </w:pPr>
-            <w:proofErr w:type="spellStart"/>
             <w:r>
               <w:rPr>
                 <w:b/>
@@ -4781,7 +2855,6 @@
               </w:rPr>
               <w:t>Funkcja</w:t>
             </w:r>
-            <w:proofErr w:type="spellEnd"/>
           </w:p>
         </w:tc>
         <w:tc>
@@ -4794,7 +2867,6 @@
             <w:pPr>
               <w:spacing w:after="0"/>
             </w:pPr>
-            <w:proofErr w:type="spellStart"/>
             <w:r>
               <w:rPr>
                 <w:b/>
@@ -4803,7 +2875,6 @@
               </w:rPr>
               <w:t>Zastosowanie</w:t>
             </w:r>
-            <w:proofErr w:type="spellEnd"/>
           </w:p>
         </w:tc>
       </w:tr>
@@ -4818,21 +2889,11 @@
             <w:pPr>
               <w:spacing w:after="0"/>
             </w:pPr>
-            <w:proofErr w:type="spellStart"/>
-            <w:proofErr w:type="gramStart"/>
             <w:r>
               <w:rPr>
                 <w:sz w:val="17"/>
               </w:rPr>
-              <w:t>nx.Graph</w:t>
-            </w:r>
-            <w:proofErr w:type="spellEnd"/>
-            <w:proofErr w:type="gramEnd"/>
-            <w:r>
-              <w:rPr>
-                <w:sz w:val="17"/>
-              </w:rPr>
-              <w:t>()</w:t>
+              <w:t>nx.Graph()</w:t>
             </w:r>
           </w:p>
         </w:tc>
@@ -4846,42 +2907,12 @@
             <w:pPr>
               <w:spacing w:after="0"/>
             </w:pPr>
-            <w:proofErr w:type="spellStart"/>
             <w:r>
               <w:rPr>
                 <w:sz w:val="17"/>
               </w:rPr>
-              <w:t>utworzenie</w:t>
+              <w:t>utworzenie grafu nieskierowanego</w:t>
             </w:r>
-            <w:proofErr w:type="spellEnd"/>
-            <w:r>
-              <w:rPr>
-                <w:sz w:val="17"/>
-              </w:rPr>
-              <w:t xml:space="preserve"> </w:t>
-            </w:r>
-            <w:proofErr w:type="spellStart"/>
-            <w:r>
-              <w:rPr>
-                <w:sz w:val="17"/>
-              </w:rPr>
-              <w:t>grafu</w:t>
-            </w:r>
-            <w:proofErr w:type="spellEnd"/>
-            <w:r>
-              <w:rPr>
-                <w:sz w:val="17"/>
-              </w:rPr>
-              <w:t xml:space="preserve"> </w:t>
-            </w:r>
-            <w:proofErr w:type="spellStart"/>
-            <w:r>
-              <w:rPr>
-                <w:sz w:val="17"/>
-              </w:rPr>
-              <w:t>nieskierowanego</w:t>
-            </w:r>
-            <w:proofErr w:type="spellEnd"/>
           </w:p>
         </w:tc>
       </w:tr>
@@ -4895,33 +2926,11 @@
             <w:pPr>
               <w:spacing w:after="0"/>
             </w:pPr>
-            <w:proofErr w:type="spellStart"/>
             <w:r>
               <w:rPr>
                 <w:sz w:val="17"/>
               </w:rPr>
-              <w:t>Graph.add_nodes_</w:t>
-            </w:r>
-            <w:proofErr w:type="gramStart"/>
-            <w:r>
-              <w:rPr>
-                <w:sz w:val="17"/>
-              </w:rPr>
-              <w:t>from</w:t>
-            </w:r>
-            <w:proofErr w:type="spellEnd"/>
-            <w:r>
-              <w:rPr>
-                <w:sz w:val="17"/>
-              </w:rPr>
-              <w:t>(</w:t>
-            </w:r>
-            <w:proofErr w:type="gramEnd"/>
-            <w:r>
-              <w:rPr>
-                <w:sz w:val="17"/>
-              </w:rPr>
-              <w:t>)</w:t>
+              <w:t>Graph.add_nodes_from()</w:t>
             </w:r>
           </w:p>
         </w:tc>
@@ -4934,42 +2943,12 @@
             <w:pPr>
               <w:spacing w:after="0"/>
             </w:pPr>
-            <w:proofErr w:type="spellStart"/>
             <w:r>
               <w:rPr>
                 <w:sz w:val="17"/>
               </w:rPr>
-              <w:t>dodanie</w:t>
+              <w:t>dodanie węzłów topologii</w:t>
             </w:r>
-            <w:proofErr w:type="spellEnd"/>
-            <w:r>
-              <w:rPr>
-                <w:sz w:val="17"/>
-              </w:rPr>
-              <w:t xml:space="preserve"> </w:t>
-            </w:r>
-            <w:proofErr w:type="spellStart"/>
-            <w:r>
-              <w:rPr>
-                <w:sz w:val="17"/>
-              </w:rPr>
-              <w:t>węzłów</w:t>
-            </w:r>
-            <w:proofErr w:type="spellEnd"/>
-            <w:r>
-              <w:rPr>
-                <w:sz w:val="17"/>
-              </w:rPr>
-              <w:t xml:space="preserve"> </w:t>
-            </w:r>
-            <w:proofErr w:type="spellStart"/>
-            <w:r>
-              <w:rPr>
-                <w:sz w:val="17"/>
-              </w:rPr>
-              <w:t>topologii</w:t>
-            </w:r>
-            <w:proofErr w:type="spellEnd"/>
           </w:p>
         </w:tc>
       </w:tr>
@@ -4984,33 +2963,11 @@
             <w:pPr>
               <w:spacing w:after="0"/>
             </w:pPr>
-            <w:proofErr w:type="spellStart"/>
             <w:r>
               <w:rPr>
                 <w:sz w:val="17"/>
               </w:rPr>
-              <w:t>Graph.add_edges_</w:t>
-            </w:r>
-            <w:proofErr w:type="gramStart"/>
-            <w:r>
-              <w:rPr>
-                <w:sz w:val="17"/>
-              </w:rPr>
-              <w:t>from</w:t>
-            </w:r>
-            <w:proofErr w:type="spellEnd"/>
-            <w:r>
-              <w:rPr>
-                <w:sz w:val="17"/>
-              </w:rPr>
-              <w:t>(</w:t>
-            </w:r>
-            <w:proofErr w:type="gramEnd"/>
-            <w:r>
-              <w:rPr>
-                <w:sz w:val="17"/>
-              </w:rPr>
-              <w:t>)</w:t>
+              <w:t>Graph.add_edges_from()</w:t>
             </w:r>
           </w:p>
         </w:tc>
@@ -5024,56 +2981,12 @@
             <w:pPr>
               <w:spacing w:after="0"/>
             </w:pPr>
-            <w:proofErr w:type="spellStart"/>
             <w:r>
               <w:rPr>
                 <w:sz w:val="17"/>
               </w:rPr>
-              <w:t>dodanie</w:t>
+              <w:t>dodanie łączy z wagą jednostkową</w:t>
             </w:r>
-            <w:proofErr w:type="spellEnd"/>
-            <w:r>
-              <w:rPr>
-                <w:sz w:val="17"/>
-              </w:rPr>
-              <w:t xml:space="preserve"> </w:t>
-            </w:r>
-            <w:proofErr w:type="spellStart"/>
-            <w:r>
-              <w:rPr>
-                <w:sz w:val="17"/>
-              </w:rPr>
-              <w:t>łączy</w:t>
-            </w:r>
-            <w:proofErr w:type="spellEnd"/>
-            <w:r>
-              <w:rPr>
-                <w:sz w:val="17"/>
-              </w:rPr>
-              <w:t xml:space="preserve"> z </w:t>
-            </w:r>
-            <w:proofErr w:type="spellStart"/>
-            <w:r>
-              <w:rPr>
-                <w:sz w:val="17"/>
-              </w:rPr>
-              <w:t>wagą</w:t>
-            </w:r>
-            <w:proofErr w:type="spellEnd"/>
-            <w:r>
-              <w:rPr>
-                <w:sz w:val="17"/>
-              </w:rPr>
-              <w:t xml:space="preserve"> </w:t>
-            </w:r>
-            <w:proofErr w:type="spellStart"/>
-            <w:r>
-              <w:rPr>
-                <w:sz w:val="17"/>
-              </w:rPr>
-              <w:t>jednostkową</w:t>
-            </w:r>
-            <w:proofErr w:type="spellEnd"/>
           </w:p>
         </w:tc>
       </w:tr>
@@ -5087,27 +3000,11 @@
             <w:pPr>
               <w:spacing w:after="0"/>
             </w:pPr>
-            <w:proofErr w:type="spellStart"/>
-            <w:proofErr w:type="gramStart"/>
             <w:r>
               <w:rPr>
                 <w:sz w:val="17"/>
               </w:rPr>
-              <w:t>nx.dijkstra</w:t>
-            </w:r>
-            <w:proofErr w:type="gramEnd"/>
-            <w:r>
-              <w:rPr>
-                <w:sz w:val="17"/>
-              </w:rPr>
-              <w:t>_path</w:t>
-            </w:r>
-            <w:proofErr w:type="spellEnd"/>
-            <w:r>
-              <w:rPr>
-                <w:sz w:val="17"/>
-              </w:rPr>
-              <w:t>()</w:t>
+              <w:t>nx.dijkstra_path()</w:t>
             </w:r>
           </w:p>
         </w:tc>
@@ -5120,42 +3017,12 @@
             <w:pPr>
               <w:spacing w:after="0"/>
             </w:pPr>
-            <w:proofErr w:type="spellStart"/>
             <w:r>
               <w:rPr>
                 <w:sz w:val="17"/>
               </w:rPr>
-              <w:t>wyznaczanie</w:t>
+              <w:t>wyznaczanie najkrótszych ścieżek</w:t>
             </w:r>
-            <w:proofErr w:type="spellEnd"/>
-            <w:r>
-              <w:rPr>
-                <w:sz w:val="17"/>
-              </w:rPr>
-              <w:t xml:space="preserve"> </w:t>
-            </w:r>
-            <w:proofErr w:type="spellStart"/>
-            <w:r>
-              <w:rPr>
-                <w:sz w:val="17"/>
-              </w:rPr>
-              <w:t>najkrótszych</w:t>
-            </w:r>
-            <w:proofErr w:type="spellEnd"/>
-            <w:r>
-              <w:rPr>
-                <w:sz w:val="17"/>
-              </w:rPr>
-              <w:t xml:space="preserve"> </w:t>
-            </w:r>
-            <w:proofErr w:type="spellStart"/>
-            <w:r>
-              <w:rPr>
-                <w:sz w:val="17"/>
-              </w:rPr>
-              <w:t>ścieżek</w:t>
-            </w:r>
-            <w:proofErr w:type="spellEnd"/>
           </w:p>
         </w:tc>
       </w:tr>
@@ -5170,27 +3037,11 @@
             <w:pPr>
               <w:spacing w:after="0"/>
             </w:pPr>
-            <w:proofErr w:type="spellStart"/>
-            <w:proofErr w:type="gramStart"/>
             <w:r>
               <w:rPr>
                 <w:sz w:val="17"/>
               </w:rPr>
-              <w:t>nx.single</w:t>
-            </w:r>
-            <w:proofErr w:type="gramEnd"/>
-            <w:r>
-              <w:rPr>
-                <w:sz w:val="17"/>
-              </w:rPr>
-              <w:t>_source_dijkstra_path_length</w:t>
-            </w:r>
-            <w:proofErr w:type="spellEnd"/>
-            <w:r>
-              <w:rPr>
-                <w:sz w:val="17"/>
-              </w:rPr>
-              <w:t>()</w:t>
+              <w:t>nx.single_source_dijkstra_path_length()</w:t>
             </w:r>
           </w:p>
         </w:tc>
@@ -5204,42 +3055,12 @@
             <w:pPr>
               <w:spacing w:after="0"/>
             </w:pPr>
-            <w:proofErr w:type="spellStart"/>
             <w:r>
               <w:rPr>
                 <w:sz w:val="17"/>
               </w:rPr>
-              <w:t>odległości</w:t>
+              <w:t>odległości d(v) użyte w Suurballe’u</w:t>
             </w:r>
-            <w:proofErr w:type="spellEnd"/>
-            <w:r>
-              <w:rPr>
-                <w:sz w:val="17"/>
-              </w:rPr>
-              <w:t xml:space="preserve"> d(v) </w:t>
-            </w:r>
-            <w:proofErr w:type="spellStart"/>
-            <w:r>
-              <w:rPr>
-                <w:sz w:val="17"/>
-              </w:rPr>
-              <w:t>użyte</w:t>
-            </w:r>
-            <w:proofErr w:type="spellEnd"/>
-            <w:r>
-              <w:rPr>
-                <w:sz w:val="17"/>
-              </w:rPr>
-              <w:t xml:space="preserve"> w </w:t>
-            </w:r>
-            <w:proofErr w:type="spellStart"/>
-            <w:r>
-              <w:rPr>
-                <w:sz w:val="17"/>
-              </w:rPr>
-              <w:t>Suurballe’u</w:t>
-            </w:r>
-            <w:proofErr w:type="spellEnd"/>
           </w:p>
         </w:tc>
       </w:tr>
@@ -5253,19 +3074,11 @@
             <w:pPr>
               <w:spacing w:after="0"/>
             </w:pPr>
-            <w:proofErr w:type="spellStart"/>
             <w:r>
               <w:rPr>
                 <w:sz w:val="17"/>
               </w:rPr>
-              <w:t>Graph.copy</w:t>
-            </w:r>
-            <w:proofErr w:type="spellEnd"/>
-            <w:r>
-              <w:rPr>
-                <w:sz w:val="17"/>
-              </w:rPr>
-              <w:t>()</w:t>
+              <w:t>Graph.copy()</w:t>
             </w:r>
           </w:p>
         </w:tc>
@@ -5278,84 +3091,12 @@
             <w:pPr>
               <w:spacing w:after="0"/>
             </w:pPr>
-            <w:proofErr w:type="spellStart"/>
             <w:r>
               <w:rPr>
                 <w:sz w:val="17"/>
               </w:rPr>
-              <w:t>modyfikacja</w:t>
+              <w:t>modyfikacja kopii grafu bez naruszania topologii bazowej</w:t>
             </w:r>
-            <w:proofErr w:type="spellEnd"/>
-            <w:r>
-              <w:rPr>
-                <w:sz w:val="17"/>
-              </w:rPr>
-              <w:t xml:space="preserve"> </w:t>
-            </w:r>
-            <w:proofErr w:type="spellStart"/>
-            <w:r>
-              <w:rPr>
-                <w:sz w:val="17"/>
-              </w:rPr>
-              <w:t>kopii</w:t>
-            </w:r>
-            <w:proofErr w:type="spellEnd"/>
-            <w:r>
-              <w:rPr>
-                <w:sz w:val="17"/>
-              </w:rPr>
-              <w:t xml:space="preserve"> </w:t>
-            </w:r>
-            <w:proofErr w:type="spellStart"/>
-            <w:r>
-              <w:rPr>
-                <w:sz w:val="17"/>
-              </w:rPr>
-              <w:t>grafu</w:t>
-            </w:r>
-            <w:proofErr w:type="spellEnd"/>
-            <w:r>
-              <w:rPr>
-                <w:sz w:val="17"/>
-              </w:rPr>
-              <w:t xml:space="preserve"> bez </w:t>
-            </w:r>
-            <w:proofErr w:type="spellStart"/>
-            <w:r>
-              <w:rPr>
-                <w:sz w:val="17"/>
-              </w:rPr>
-              <w:t>naruszania</w:t>
-            </w:r>
-            <w:proofErr w:type="spellEnd"/>
-            <w:r>
-              <w:rPr>
-                <w:sz w:val="17"/>
-              </w:rPr>
-              <w:t xml:space="preserve"> </w:t>
-            </w:r>
-            <w:proofErr w:type="spellStart"/>
-            <w:r>
-              <w:rPr>
-                <w:sz w:val="17"/>
-              </w:rPr>
-              <w:t>topologii</w:t>
-            </w:r>
-            <w:proofErr w:type="spellEnd"/>
-            <w:r>
-              <w:rPr>
-                <w:sz w:val="17"/>
-              </w:rPr>
-              <w:t xml:space="preserve"> </w:t>
-            </w:r>
-            <w:proofErr w:type="spellStart"/>
-            <w:r>
-              <w:rPr>
-                <w:sz w:val="17"/>
-              </w:rPr>
-              <w:t>bazowej</w:t>
-            </w:r>
-            <w:proofErr w:type="spellEnd"/>
           </w:p>
         </w:tc>
       </w:tr>
@@ -5370,33 +3111,11 @@
             <w:pPr>
               <w:spacing w:after="0"/>
             </w:pPr>
-            <w:proofErr w:type="spellStart"/>
             <w:r>
               <w:rPr>
                 <w:sz w:val="17"/>
               </w:rPr>
-              <w:t>Graph.remove_edges_</w:t>
-            </w:r>
-            <w:proofErr w:type="gramStart"/>
-            <w:r>
-              <w:rPr>
-                <w:sz w:val="17"/>
-              </w:rPr>
-              <w:t>from</w:t>
-            </w:r>
-            <w:proofErr w:type="spellEnd"/>
-            <w:r>
-              <w:rPr>
-                <w:sz w:val="17"/>
-              </w:rPr>
-              <w:t>(</w:t>
-            </w:r>
-            <w:proofErr w:type="gramEnd"/>
-            <w:r>
-              <w:rPr>
-                <w:sz w:val="17"/>
-              </w:rPr>
-              <w:t>)</w:t>
+              <w:t>Graph.remove_edges_from()</w:t>
             </w:r>
           </w:p>
         </w:tc>
@@ -5410,56 +3129,12 @@
             <w:pPr>
               <w:spacing w:after="0"/>
             </w:pPr>
-            <w:proofErr w:type="spellStart"/>
             <w:r>
               <w:rPr>
                 <w:sz w:val="17"/>
               </w:rPr>
-              <w:t>usuwanie</w:t>
+              <w:t>usuwanie łączy w metodzie naiwnej</w:t>
             </w:r>
-            <w:proofErr w:type="spellEnd"/>
-            <w:r>
-              <w:rPr>
-                <w:sz w:val="17"/>
-              </w:rPr>
-              <w:t xml:space="preserve"> </w:t>
-            </w:r>
-            <w:proofErr w:type="spellStart"/>
-            <w:r>
-              <w:rPr>
-                <w:sz w:val="17"/>
-              </w:rPr>
-              <w:t>łączy</w:t>
-            </w:r>
-            <w:proofErr w:type="spellEnd"/>
-            <w:r>
-              <w:rPr>
-                <w:sz w:val="17"/>
-              </w:rPr>
-              <w:t xml:space="preserve"> w </w:t>
-            </w:r>
-            <w:proofErr w:type="spellStart"/>
-            <w:r>
-              <w:rPr>
-                <w:sz w:val="17"/>
-              </w:rPr>
-              <w:t>metodzie</w:t>
-            </w:r>
-            <w:proofErr w:type="spellEnd"/>
-            <w:r>
-              <w:rPr>
-                <w:sz w:val="17"/>
-              </w:rPr>
-              <w:t xml:space="preserve"> </w:t>
-            </w:r>
-            <w:proofErr w:type="spellStart"/>
-            <w:r>
-              <w:rPr>
-                <w:sz w:val="17"/>
-              </w:rPr>
-              <w:t>naiwnej</w:t>
-            </w:r>
-            <w:proofErr w:type="spellEnd"/>
           </w:p>
         </w:tc>
       </w:tr>
@@ -5473,33 +3148,11 @@
             <w:pPr>
               <w:spacing w:after="0"/>
             </w:pPr>
-            <w:proofErr w:type="spellStart"/>
             <w:r>
               <w:rPr>
                 <w:sz w:val="17"/>
               </w:rPr>
-              <w:t>nx.min_cost_</w:t>
-            </w:r>
-            <w:proofErr w:type="gramStart"/>
-            <w:r>
-              <w:rPr>
-                <w:sz w:val="17"/>
-              </w:rPr>
-              <w:t>flow</w:t>
-            </w:r>
-            <w:proofErr w:type="spellEnd"/>
-            <w:r>
-              <w:rPr>
-                <w:sz w:val="17"/>
-              </w:rPr>
-              <w:t>(</w:t>
-            </w:r>
-            <w:proofErr w:type="gramEnd"/>
-            <w:r>
-              <w:rPr>
-                <w:sz w:val="17"/>
-              </w:rPr>
-              <w:t>)</w:t>
+              <w:t>nx.min_cost_flow()</w:t>
             </w:r>
           </w:p>
         </w:tc>
@@ -5512,56 +3165,12 @@
             <w:pPr>
               <w:spacing w:after="0"/>
             </w:pPr>
-            <w:proofErr w:type="spellStart"/>
             <w:r>
               <w:rPr>
                 <w:sz w:val="17"/>
               </w:rPr>
-              <w:t>niezależna</w:t>
+              <w:t>niezależna walidacja kosztu par tras</w:t>
             </w:r>
-            <w:proofErr w:type="spellEnd"/>
-            <w:r>
-              <w:rPr>
-                <w:sz w:val="17"/>
-              </w:rPr>
-              <w:t xml:space="preserve"> </w:t>
-            </w:r>
-            <w:proofErr w:type="spellStart"/>
-            <w:r>
-              <w:rPr>
-                <w:sz w:val="17"/>
-              </w:rPr>
-              <w:t>walidacja</w:t>
-            </w:r>
-            <w:proofErr w:type="spellEnd"/>
-            <w:r>
-              <w:rPr>
-                <w:sz w:val="17"/>
-              </w:rPr>
-              <w:t xml:space="preserve"> </w:t>
-            </w:r>
-            <w:proofErr w:type="spellStart"/>
-            <w:r>
-              <w:rPr>
-                <w:sz w:val="17"/>
-              </w:rPr>
-              <w:t>kosztu</w:t>
-            </w:r>
-            <w:proofErr w:type="spellEnd"/>
-            <w:r>
-              <w:rPr>
-                <w:sz w:val="17"/>
-              </w:rPr>
-              <w:t xml:space="preserve"> par </w:t>
-            </w:r>
-            <w:proofErr w:type="spellStart"/>
-            <w:r>
-              <w:rPr>
-                <w:sz w:val="17"/>
-              </w:rPr>
-              <w:t>tras</w:t>
-            </w:r>
-            <w:proofErr w:type="spellEnd"/>
           </w:p>
         </w:tc>
       </w:tr>
@@ -5576,27 +3185,11 @@
             <w:pPr>
               <w:spacing w:after="0"/>
             </w:pPr>
-            <w:proofErr w:type="spellStart"/>
-            <w:proofErr w:type="gramStart"/>
             <w:r>
               <w:rPr>
                 <w:sz w:val="17"/>
               </w:rPr>
-              <w:t>nx.edge</w:t>
-            </w:r>
-            <w:proofErr w:type="gramEnd"/>
-            <w:r>
-              <w:rPr>
-                <w:sz w:val="17"/>
-              </w:rPr>
-              <w:t>_connectivity</w:t>
-            </w:r>
-            <w:proofErr w:type="spellEnd"/>
-            <w:r>
-              <w:rPr>
-                <w:sz w:val="17"/>
-              </w:rPr>
-              <w:t>()</w:t>
+              <w:t>nx.edge_connectivity()</w:t>
             </w:r>
           </w:p>
         </w:tc>
@@ -5610,56 +3203,12 @@
             <w:pPr>
               <w:spacing w:after="0"/>
             </w:pPr>
-            <w:proofErr w:type="spellStart"/>
             <w:r>
               <w:rPr>
                 <w:sz w:val="17"/>
               </w:rPr>
-              <w:t>opis</w:t>
+              <w:t>opis spójności krawędziowej topologii</w:t>
             </w:r>
-            <w:proofErr w:type="spellEnd"/>
-            <w:r>
-              <w:rPr>
-                <w:sz w:val="17"/>
-              </w:rPr>
-              <w:t xml:space="preserve"> </w:t>
-            </w:r>
-            <w:proofErr w:type="spellStart"/>
-            <w:r>
-              <w:rPr>
-                <w:sz w:val="17"/>
-              </w:rPr>
-              <w:t>spójności</w:t>
-            </w:r>
-            <w:proofErr w:type="spellEnd"/>
-            <w:r>
-              <w:rPr>
-                <w:sz w:val="17"/>
-              </w:rPr>
-              <w:t xml:space="preserve"> </w:t>
-            </w:r>
-            <w:proofErr w:type="spellStart"/>
-            <w:r>
-              <w:rPr>
-                <w:sz w:val="17"/>
-              </w:rPr>
-              <w:t>krawędziowej</w:t>
-            </w:r>
-            <w:proofErr w:type="spellEnd"/>
-            <w:r>
-              <w:rPr>
-                <w:sz w:val="17"/>
-              </w:rPr>
-              <w:t xml:space="preserve"> </w:t>
-            </w:r>
-            <w:proofErr w:type="spellStart"/>
-            <w:r>
-              <w:rPr>
-                <w:sz w:val="17"/>
-              </w:rPr>
-              <w:t>topologii</w:t>
-            </w:r>
-            <w:proofErr w:type="spellEnd"/>
           </w:p>
         </w:tc>
       </w:tr>
@@ -5671,70 +3220,37 @@
       <w:bookmarkStart w:id="3" w:name="_7._Główne_pozycje"/>
       <w:bookmarkEnd w:id="3"/>
       <w:r>
-        <w:t>7</w:t>
+        <w:t>4</w:t>
       </w:r>
       <w:r>
         <w:t xml:space="preserve">. </w:t>
       </w:r>
       <w:bookmarkStart w:id="4" w:name="_Toc228201682"/>
-      <w:proofErr w:type="spellStart"/>
       <w:r>
-        <w:t>Główne</w:t>
-      </w:r>
-      <w:proofErr w:type="spellEnd"/>
-      <w:r>
-        <w:t xml:space="preserve"> </w:t>
-      </w:r>
-      <w:proofErr w:type="spellStart"/>
-      <w:r>
-        <w:t>pozycje</w:t>
-      </w:r>
-      <w:proofErr w:type="spellEnd"/>
-      <w:r>
-        <w:t xml:space="preserve"> </w:t>
-      </w:r>
-      <w:proofErr w:type="spellStart"/>
-      <w:r>
-        <w:t>literatury</w:t>
+        <w:t>Główne pozycje literatury</w:t>
       </w:r>
       <w:bookmarkEnd w:id="4"/>
-      <w:proofErr w:type="spellEnd"/>
     </w:p>
-    <w:p/>
     <w:p>
       <w:pPr>
         <w:pStyle w:val="Listanumerowana"/>
         <w:numPr>
           <w:ilvl w:val="0"/>
-          <w:numId w:val="13"/>
+          <w:numId w:val="0"/>
         </w:numPr>
+        <w:ind w:left="360" w:hanging="360"/>
       </w:pPr>
       <w:r>
-        <w:t xml:space="preserve">J. Rak: </w:t>
+        <w:t>[1]</w:t>
       </w:r>
-      <w:proofErr w:type="spellStart"/>
       <w:r>
-        <w:t>Niezawodność</w:t>
+        <w:tab/>
       </w:r>
-      <w:proofErr w:type="spellEnd"/>
       <w:r>
-        <w:t xml:space="preserve"> </w:t>
+        <w:t>J. Rak: Niezawodność systemów sieciowych – WYKŁAD 4</w:t>
       </w:r>
-      <w:proofErr w:type="spellStart"/>
       <w:r>
-        <w:t>systemów</w:t>
-      </w:r>
-      <w:proofErr w:type="spellEnd"/>
-      <w:r>
-        <w:t xml:space="preserve"> </w:t>
-      </w:r>
-      <w:proofErr w:type="spellStart"/>
-      <w:r>
-        <w:t>sieciowych</w:t>
-      </w:r>
-      <w:proofErr w:type="spellEnd"/>
-      <w:r>
-        <w:t xml:space="preserve"> – WYKŁAD 4</w:t>
+        <w:t>.</w:t>
       </w:r>
     </w:p>
     <w:p>
@@ -5742,132 +3258,113 @@
         <w:pStyle w:val="Listanumerowana"/>
         <w:numPr>
           <w:ilvl w:val="0"/>
-          <w:numId w:val="13"/>
+          <w:numId w:val="0"/>
         </w:numPr>
+        <w:ind w:left="360" w:hanging="360"/>
       </w:pPr>
-      <w:proofErr w:type="spellStart"/>
       <w:r>
-        <w:t>Suurballe</w:t>
+        <w:t>[2]</w:t>
       </w:r>
-      <w:proofErr w:type="spellEnd"/>
       <w:r>
-        <w:t>, J. W., Disjoint Paths in a Network, Networks, 4(2), 125-145, 1974.</w:t>
+        <w:tab/>
+      </w:r>
+      <w:r>
+        <w:t>Suurballe, J. W., Disjoint Paths in a Network, Networks, 4(2), 125-145, 1974.</w:t>
       </w:r>
     </w:p>
     <w:p>
       <w:pPr>
         <w:pStyle w:val="Listanumerowana"/>
+        <w:numPr>
+          <w:ilvl w:val="0"/>
+          <w:numId w:val="0"/>
+        </w:numPr>
+        <w:ind w:left="360" w:hanging="360"/>
       </w:pPr>
-      <w:proofErr w:type="spellStart"/>
       <w:r>
-        <w:t>Suurballe</w:t>
+        <w:t>[3]</w:t>
       </w:r>
-      <w:proofErr w:type="spellEnd"/>
       <w:r>
-        <w:t xml:space="preserve">, J. W., </w:t>
+        <w:tab/>
       </w:r>
-      <w:proofErr w:type="spellStart"/>
       <w:r>
-        <w:t>Tarjan</w:t>
-      </w:r>
-      <w:proofErr w:type="spellEnd"/>
-      <w:r>
-        <w:t>, R. E., A Quick Method for Finding Shortest Pairs of Disjoint Paths, Networks, 14(2), 325-336, 1984.</w:t>
+        <w:t>Suurballe, J. W., Tarjan, R. E., A Quick Method for Finding Shortest Pairs of Disjoint Paths, Networks, 14(2), 325-336, 1984.</w:t>
       </w:r>
     </w:p>
     <w:p>
       <w:pPr>
         <w:pStyle w:val="Listanumerowana"/>
+        <w:numPr>
+          <w:ilvl w:val="0"/>
+          <w:numId w:val="0"/>
+        </w:numPr>
+        <w:ind w:left="360" w:hanging="360"/>
       </w:pPr>
       <w:r>
-        <w:t xml:space="preserve">Dijkstra, E. W., A note on two problems in </w:t>
+        <w:t>[4]</w:t>
       </w:r>
-      <w:proofErr w:type="spellStart"/>
       <w:r>
-        <w:t>connexion</w:t>
+        <w:tab/>
       </w:r>
-      <w:proofErr w:type="spellEnd"/>
       <w:r>
-        <w:t xml:space="preserve"> with graphs, </w:t>
-      </w:r>
-      <w:proofErr w:type="spellStart"/>
-      <w:r>
-        <w:t>Numerische</w:t>
-      </w:r>
-      <w:proofErr w:type="spellEnd"/>
-      <w:r>
-        <w:t xml:space="preserve"> </w:t>
-      </w:r>
-      <w:proofErr w:type="spellStart"/>
-      <w:r>
-        <w:t>Mathematik</w:t>
-      </w:r>
-      <w:proofErr w:type="spellEnd"/>
-      <w:r>
-        <w:t>, 1, 269-271, 1959.</w:t>
+        <w:t>Dijkstra, E. W., A note on two problems in connexion with graphs, Numerische Mathematik, 1, 269-271, 1959.</w:t>
       </w:r>
     </w:p>
     <w:p>
       <w:pPr>
         <w:pStyle w:val="Listanumerowana"/>
+        <w:numPr>
+          <w:ilvl w:val="0"/>
+          <w:numId w:val="0"/>
+        </w:numPr>
+        <w:ind w:left="360" w:hanging="360"/>
       </w:pPr>
-      <w:proofErr w:type="spellStart"/>
       <w:r>
-        <w:t>NetworkX</w:t>
+        <w:t>[5]</w:t>
       </w:r>
-      <w:proofErr w:type="spellEnd"/>
       <w:r>
-        <w:t xml:space="preserve"> Developers, </w:t>
+        <w:tab/>
       </w:r>
-      <w:proofErr w:type="spellStart"/>
       <w:r>
-        <w:t>NetworkX</w:t>
-      </w:r>
-      <w:proofErr w:type="spellEnd"/>
-      <w:r>
-        <w:t xml:space="preserve"> documentation, https://networkx.org/documentation/stable/.</w:t>
+        <w:t>NetworkX Developers, NetworkX documentation, https://networkx.org/documentation/stable/.</w:t>
       </w:r>
     </w:p>
     <w:p>
       <w:pPr>
         <w:pStyle w:val="Listanumerowana"/>
+        <w:numPr>
+          <w:ilvl w:val="0"/>
+          <w:numId w:val="0"/>
+        </w:numPr>
+        <w:ind w:left="360" w:hanging="360"/>
       </w:pPr>
-      <w:proofErr w:type="spellStart"/>
       <w:r>
-        <w:t>NetworkX</w:t>
+        <w:t>[6]</w:t>
       </w:r>
-      <w:proofErr w:type="spellEnd"/>
       <w:r>
-        <w:t xml:space="preserve"> Developers, </w:t>
+        <w:tab/>
       </w:r>
-      <w:proofErr w:type="spellStart"/>
       <w:r>
-        <w:t>dijkstra_path</w:t>
-      </w:r>
-      <w:proofErr w:type="spellEnd"/>
-      <w:r>
-        <w:t xml:space="preserve"> reference, https://networkx.org/documentation/stable/reference/algorithms/generated/networkx.algorithms.shortest_paths.weighted.dijkstra_path.html.</w:t>
+        <w:t>NetworkX Developers, dijkstra_path reference, https://networkx.org/documentation/stable/reference/algorithms/generated/networkx.algorithms.shortest_paths.weighted.dijkstra_path.html.</w:t>
       </w:r>
     </w:p>
     <w:p>
       <w:pPr>
         <w:pStyle w:val="Listanumerowana"/>
+        <w:numPr>
+          <w:ilvl w:val="0"/>
+          <w:numId w:val="0"/>
+        </w:numPr>
+        <w:ind w:left="360" w:hanging="360"/>
       </w:pPr>
-      <w:proofErr w:type="spellStart"/>
       <w:r>
-        <w:t>NetworkX</w:t>
+        <w:t>[7]</w:t>
       </w:r>
-      <w:proofErr w:type="spellEnd"/>
       <w:r>
-        <w:t xml:space="preserve"> Developers, </w:t>
+        <w:tab/>
       </w:r>
-      <w:proofErr w:type="spellStart"/>
       <w:r>
-        <w:t>edge_disjoint_paths</w:t>
-      </w:r>
-      <w:proofErr w:type="spellEnd"/>
-      <w:r>
-        <w:t xml:space="preserve"> reference, https://networkx.org/documentation/stable/reference/algorithms/generated/networkx.algorithms.connectivity.disjoint_paths.edge_disjoint_paths.html.</w:t>
+        <w:t>NetworkX Developers, edge_disjoint_paths reference, https://networkx.org/documentation/stable/reference/algorithms/generated/networkx.algorithms.connectivity.disjoint_paths.edge_disjoint_paths.html.</w:t>
       </w:r>
     </w:p>
     <w:sectPr>
@@ -5882,7 +3379,7 @@
 </file>
 
 <file path=word/endnotes.xml><?xml version="1.0" encoding="utf-8"?>
-<w:endnotes xmlns:wpc="http://schemas.microsoft.com/office/word/2010/wordprocessingCanvas" xmlns:cx="http://schemas.microsoft.com/office/drawing/2014/chartex" xmlns:cx1="http://schemas.microsoft.com/office/drawing/2015/9/8/chartex" xmlns:cx2="http://schemas.microsoft.com/office/drawing/2015/10/21/chartex" xmlns:cx3="http://schemas.microsoft.com/office/drawing/2016/5/9/chartex" xmlns:cx4="http://schemas.microsoft.com/office/drawing/2016/5/10/chartex" xmlns:cx5="http://schemas.microsoft.com/office/drawing/2016/5/11/chartex" xmlns:cx6="http://schemas.microsoft.com/office/drawing/2016/5/12/chartex" xmlns:cx7="http://schemas.microsoft.com/office/drawing/2016/5/13/chartex" xmlns:cx8="http://schemas.microsoft.com/office/drawing/2016/5/14/chartex" xmlns:mc="http://schemas.openxmlformats.org/markup-compatibility/2006" xmlns:aink="http://schemas.microsoft.com/office/drawing/2016/ink" xmlns:am3d="http://schemas.microsoft.com/office/drawing/2017/model3d" xmlns:o="urn:schemas-microsoft-com:office:office" xmlns:oel="http://schemas.microsoft.com/office/2019/extlst" xmlns:r="http://schemas.openxmlformats.org/officeDocument/2006/relationships" xmlns:m="http://schemas.openxmlformats.org/officeDocument/2006/math" xmlns:v="urn:schemas-microsoft-com:vml" xmlns:wp14="http://schemas.microsoft.com/office/word/2010/wordprocessingDrawing" xmlns:wp="http://schemas.openxmlformats.org/drawingml/2006/wordprocessingDrawing" xmlns:w10="urn:schemas-microsoft-com:office:word" xmlns:w="http://schemas.openxmlformats.org/wordprocessingml/2006/main" xmlns:w14="http://schemas.microsoft.com/office/word/2010/wordml" xmlns:w15="http://schemas.microsoft.com/office/word/2012/wordml" xmlns:w16cex="http://schemas.microsoft.com/office/word/2018/wordml/cex" xmlns:w16cid="http://schemas.microsoft.com/office/word/2016/wordml/cid" xmlns:w16="http://schemas.microsoft.com/office/word/2018/wordml" xmlns:w16sdtdh="http://schemas.microsoft.com/office/word/2020/wordml/sdtdatahash" xmlns:w16se="http://schemas.microsoft.com/office/word/2015/wordml/symex" xmlns:wpg="http://schemas.microsoft.com/office/word/2010/wordprocessingGroup" xmlns:wpi="http://schemas.microsoft.com/office/word/2010/wordprocessingInk" xmlns:wne="http://schemas.microsoft.com/office/word/2006/wordml" xmlns:wps="http://schemas.microsoft.com/office/word/2010/wordprocessingShape" mc:Ignorable="w14 w15 w16se w16cid w16 w16cex w16sdtdh wp14">
+<w:endnotes xmlns:wpc="http://schemas.microsoft.com/office/word/2010/wordprocessingCanvas" xmlns:cx="http://schemas.microsoft.com/office/drawing/2014/chartex" xmlns:cx1="http://schemas.microsoft.com/office/drawing/2015/9/8/chartex" xmlns:cx2="http://schemas.microsoft.com/office/drawing/2015/10/21/chartex" xmlns:cx3="http://schemas.microsoft.com/office/drawing/2016/5/9/chartex" xmlns:cx4="http://schemas.microsoft.com/office/drawing/2016/5/10/chartex" xmlns:cx5="http://schemas.microsoft.com/office/drawing/2016/5/11/chartex" xmlns:cx6="http://schemas.microsoft.com/office/drawing/2016/5/12/chartex" xmlns:cx7="http://schemas.microsoft.com/office/drawing/2016/5/13/chartex" xmlns:cx8="http://schemas.microsoft.com/office/drawing/2016/5/14/chartex" xmlns:mc="http://schemas.openxmlformats.org/markup-compatibility/2006" xmlns:aink="http://schemas.microsoft.com/office/drawing/2016/ink" xmlns:am3d="http://schemas.microsoft.com/office/drawing/2017/model3d" xmlns:o="urn:schemas-microsoft-com:office:office" xmlns:oel="http://schemas.microsoft.com/office/2019/extlst" xmlns:r="http://schemas.openxmlformats.org/officeDocument/2006/relationships" xmlns:m="http://schemas.openxmlformats.org/officeDocument/2006/math" xmlns:v="urn:schemas-microsoft-com:vml" xmlns:wp14="http://schemas.microsoft.com/office/word/2010/wordprocessingDrawing" xmlns:wp="http://schemas.openxmlformats.org/drawingml/2006/wordprocessingDrawing" xmlns:w10="urn:schemas-microsoft-com:office:word" xmlns:w="http://schemas.openxmlformats.org/wordprocessingml/2006/main" xmlns:w14="http://schemas.microsoft.com/office/word/2010/wordml" xmlns:w15="http://schemas.microsoft.com/office/word/2012/wordml" xmlns:w16cex="http://schemas.microsoft.com/office/word/2018/wordml/cex" xmlns:w16cid="http://schemas.microsoft.com/office/word/2016/wordml/cid" xmlns:w16="http://schemas.microsoft.com/office/word/2018/wordml" xmlns:w16du="http://schemas.microsoft.com/office/word/2023/wordml/word16du" xmlns:w16sdtdh="http://schemas.microsoft.com/office/word/2020/wordml/sdtdatahash" xmlns:w16sdtfl="http://schemas.microsoft.com/office/word/2024/wordml/sdtformatlock" xmlns:w16se="http://schemas.microsoft.com/office/word/2015/wordml/symex" xmlns:wpg="http://schemas.microsoft.com/office/word/2010/wordprocessingGroup" xmlns:wpi="http://schemas.microsoft.com/office/word/2010/wordprocessingInk" xmlns:wne="http://schemas.microsoft.com/office/word/2006/wordml" xmlns:wps="http://schemas.microsoft.com/office/word/2010/wordprocessingShape" mc:Ignorable="w14 w15 w16se w16cid w16 w16cex w16sdtdh w16sdtfl w16du wp14">
   <w:endnote w:type="separator" w:id="-1">
     <w:p>
       <w:pPr>
@@ -5907,7 +3404,7 @@
 </file>
 
 <file path=word/footer1.xml><?xml version="1.0" encoding="utf-8"?>
-<w:ftr xmlns:wpc="http://schemas.microsoft.com/office/word/2010/wordprocessingCanvas" xmlns:cx="http://schemas.microsoft.com/office/drawing/2014/chartex" xmlns:cx1="http://schemas.microsoft.com/office/drawing/2015/9/8/chartex" xmlns:cx2="http://schemas.microsoft.com/office/drawing/2015/10/21/chartex" xmlns:cx3="http://schemas.microsoft.com/office/drawing/2016/5/9/chartex" xmlns:cx4="http://schemas.microsoft.com/office/drawing/2016/5/10/chartex" xmlns:cx5="http://schemas.microsoft.com/office/drawing/2016/5/11/chartex" xmlns:cx6="http://schemas.microsoft.com/office/drawing/2016/5/12/chartex" xmlns:cx7="http://schemas.microsoft.com/office/drawing/2016/5/13/chartex" xmlns:cx8="http://schemas.microsoft.com/office/drawing/2016/5/14/chartex" xmlns:mc="http://schemas.openxmlformats.org/markup-compatibility/2006" xmlns:aink="http://schemas.microsoft.com/office/drawing/2016/ink" xmlns:am3d="http://schemas.microsoft.com/office/drawing/2017/model3d" xmlns:o="urn:schemas-microsoft-com:office:office" xmlns:oel="http://schemas.microsoft.com/office/2019/extlst" xmlns:r="http://schemas.openxmlformats.org/officeDocument/2006/relationships" xmlns:m="http://schemas.openxmlformats.org/officeDocument/2006/math" xmlns:v="urn:schemas-microsoft-com:vml" xmlns:wp14="http://schemas.microsoft.com/office/word/2010/wordprocessingDrawing" xmlns:wp="http://schemas.openxmlformats.org/drawingml/2006/wordprocessingDrawing" xmlns:w10="urn:schemas-microsoft-com:office:word" xmlns:w="http://schemas.openxmlformats.org/wordprocessingml/2006/main" xmlns:w14="http://schemas.microsoft.com/office/word/2010/wordml" xmlns:w15="http://schemas.microsoft.com/office/word/2012/wordml" xmlns:w16cex="http://schemas.microsoft.com/office/word/2018/wordml/cex" xmlns:w16cid="http://schemas.microsoft.com/office/word/2016/wordml/cid" xmlns:w16="http://schemas.microsoft.com/office/word/2018/wordml" xmlns:w16sdtdh="http://schemas.microsoft.com/office/word/2020/wordml/sdtdatahash" xmlns:w16se="http://schemas.microsoft.com/office/word/2015/wordml/symex" xmlns:wpg="http://schemas.microsoft.com/office/word/2010/wordprocessingGroup" xmlns:wpi="http://schemas.microsoft.com/office/word/2010/wordprocessingInk" xmlns:wne="http://schemas.microsoft.com/office/word/2006/wordml" xmlns:wps="http://schemas.microsoft.com/office/word/2010/wordprocessingShape" mc:Ignorable="w14 w15 w16se w16cid w16 w16cex w16sdtdh wp14">
+<w:ftr xmlns:wpc="http://schemas.microsoft.com/office/word/2010/wordprocessingCanvas" xmlns:cx="http://schemas.microsoft.com/office/drawing/2014/chartex" xmlns:cx1="http://schemas.microsoft.com/office/drawing/2015/9/8/chartex" xmlns:cx2="http://schemas.microsoft.com/office/drawing/2015/10/21/chartex" xmlns:cx3="http://schemas.microsoft.com/office/drawing/2016/5/9/chartex" xmlns:cx4="http://schemas.microsoft.com/office/drawing/2016/5/10/chartex" xmlns:cx5="http://schemas.microsoft.com/office/drawing/2016/5/11/chartex" xmlns:cx6="http://schemas.microsoft.com/office/drawing/2016/5/12/chartex" xmlns:cx7="http://schemas.microsoft.com/office/drawing/2016/5/13/chartex" xmlns:cx8="http://schemas.microsoft.com/office/drawing/2016/5/14/chartex" xmlns:mc="http://schemas.openxmlformats.org/markup-compatibility/2006" xmlns:aink="http://schemas.microsoft.com/office/drawing/2016/ink" xmlns:am3d="http://schemas.microsoft.com/office/drawing/2017/model3d" xmlns:o="urn:schemas-microsoft-com:office:office" xmlns:oel="http://schemas.microsoft.com/office/2019/extlst" xmlns:r="http://schemas.openxmlformats.org/officeDocument/2006/relationships" xmlns:m="http://schemas.openxmlformats.org/officeDocument/2006/math" xmlns:v="urn:schemas-microsoft-com:vml" xmlns:wp14="http://schemas.microsoft.com/office/word/2010/wordprocessingDrawing" xmlns:wp="http://schemas.openxmlformats.org/drawingml/2006/wordprocessingDrawing" xmlns:w10="urn:schemas-microsoft-com:office:word" xmlns:w="http://schemas.openxmlformats.org/wordprocessingml/2006/main" xmlns:w14="http://schemas.microsoft.com/office/word/2010/wordml" xmlns:w15="http://schemas.microsoft.com/office/word/2012/wordml" xmlns:w16cex="http://schemas.microsoft.com/office/word/2018/wordml/cex" xmlns:w16cid="http://schemas.microsoft.com/office/word/2016/wordml/cid" xmlns:w16="http://schemas.microsoft.com/office/word/2018/wordml" xmlns:w16du="http://schemas.microsoft.com/office/word/2023/wordml/word16du" xmlns:w16sdtdh="http://schemas.microsoft.com/office/word/2020/wordml/sdtdatahash" xmlns:w16sdtfl="http://schemas.microsoft.com/office/word/2024/wordml/sdtformatlock" xmlns:w16se="http://schemas.microsoft.com/office/word/2015/wordml/symex" xmlns:wpg="http://schemas.microsoft.com/office/word/2010/wordprocessingGroup" xmlns:wpi="http://schemas.microsoft.com/office/word/2010/wordprocessingInk" xmlns:wne="http://schemas.microsoft.com/office/word/2006/wordml" xmlns:wps="http://schemas.microsoft.com/office/word/2010/wordprocessingShape" mc:Ignorable="w14 w15 w16se w16cid w16 w16cex w16sdtdh w16sdtfl w16du wp14">
   <w:p>
     <w:pPr>
       <w:pStyle w:val="Stopka"/>
@@ -5918,7 +3415,7 @@
 </file>
 
 <file path=word/footnotes.xml><?xml version="1.0" encoding="utf-8"?>
-<w:footnotes xmlns:wpc="http://schemas.microsoft.com/office/word/2010/wordprocessingCanvas" xmlns:cx="http://schemas.microsoft.com/office/drawing/2014/chartex" xmlns:cx1="http://schemas.microsoft.com/office/drawing/2015/9/8/chartex" xmlns:cx2="http://schemas.microsoft.com/office/drawing/2015/10/21/chartex" xmlns:cx3="http://schemas.microsoft.com/office/drawing/2016/5/9/chartex" xmlns:cx4="http://schemas.microsoft.com/office/drawing/2016/5/10/chartex" xmlns:cx5="http://schemas.microsoft.com/office/drawing/2016/5/11/chartex" xmlns:cx6="http://schemas.microsoft.com/office/drawing/2016/5/12/chartex" xmlns:cx7="http://schemas.microsoft.com/office/drawing/2016/5/13/chartex" xmlns:cx8="http://schemas.microsoft.com/office/drawing/2016/5/14/chartex" xmlns:mc="http://schemas.openxmlformats.org/markup-compatibility/2006" xmlns:aink="http://schemas.microsoft.com/office/drawing/2016/ink" xmlns:am3d="http://schemas.microsoft.com/office/drawing/2017/model3d" xmlns:o="urn:schemas-microsoft-com:office:office" xmlns:oel="http://schemas.microsoft.com/office/2019/extlst" xmlns:r="http://schemas.openxmlformats.org/officeDocument/2006/relationships" xmlns:m="http://schemas.openxmlformats.org/officeDocument/2006/math" xmlns:v="urn:schemas-microsoft-com:vml" xmlns:wp14="http://schemas.microsoft.com/office/word/2010/wordprocessingDrawing" xmlns:wp="http://schemas.openxmlformats.org/drawingml/2006/wordprocessingDrawing" xmlns:w10="urn:schemas-microsoft-com:office:word" xmlns:w="http://schemas.openxmlformats.org/wordprocessingml/2006/main" xmlns:w14="http://schemas.microsoft.com/office/word/2010/wordml" xmlns:w15="http://schemas.microsoft.com/office/word/2012/wordml" xmlns:w16cex="http://schemas.microsoft.com/office/word/2018/wordml/cex" xmlns:w16cid="http://schemas.microsoft.com/office/word/2016/wordml/cid" xmlns:w16="http://schemas.microsoft.com/office/word/2018/wordml" xmlns:w16sdtdh="http://schemas.microsoft.com/office/word/2020/wordml/sdtdatahash" xmlns:w16se="http://schemas.microsoft.com/office/word/2015/wordml/symex" xmlns:wpg="http://schemas.microsoft.com/office/word/2010/wordprocessingGroup" xmlns:wpi="http://schemas.microsoft.com/office/word/2010/wordprocessingInk" xmlns:wne="http://schemas.microsoft.com/office/word/2006/wordml" xmlns:wps="http://schemas.microsoft.com/office/word/2010/wordprocessingShape" mc:Ignorable="w14 w15 w16se w16cid w16 w16cex w16sdtdh wp14">
+<w:footnotes xmlns:wpc="http://schemas.microsoft.com/office/word/2010/wordprocessingCanvas" xmlns:cx="http://schemas.microsoft.com/office/drawing/2014/chartex" xmlns:cx1="http://schemas.microsoft.com/office/drawing/2015/9/8/chartex" xmlns:cx2="http://schemas.microsoft.com/office/drawing/2015/10/21/chartex" xmlns:cx3="http://schemas.microsoft.com/office/drawing/2016/5/9/chartex" xmlns:cx4="http://schemas.microsoft.com/office/drawing/2016/5/10/chartex" xmlns:cx5="http://schemas.microsoft.com/office/drawing/2016/5/11/chartex" xmlns:cx6="http://schemas.microsoft.com/office/drawing/2016/5/12/chartex" xmlns:cx7="http://schemas.microsoft.com/office/drawing/2016/5/13/chartex" xmlns:cx8="http://schemas.microsoft.com/office/drawing/2016/5/14/chartex" xmlns:mc="http://schemas.openxmlformats.org/markup-compatibility/2006" xmlns:aink="http://schemas.microsoft.com/office/drawing/2016/ink" xmlns:am3d="http://schemas.microsoft.com/office/drawing/2017/model3d" xmlns:o="urn:schemas-microsoft-com:office:office" xmlns:oel="http://schemas.microsoft.com/office/2019/extlst" xmlns:r="http://schemas.openxmlformats.org/officeDocument/2006/relationships" xmlns:m="http://schemas.openxmlformats.org/officeDocument/2006/math" xmlns:v="urn:schemas-microsoft-com:vml" xmlns:wp14="http://schemas.microsoft.com/office/word/2010/wordprocessingDrawing" xmlns:wp="http://schemas.openxmlformats.org/drawingml/2006/wordprocessingDrawing" xmlns:w10="urn:schemas-microsoft-com:office:word" xmlns:w="http://schemas.openxmlformats.org/wordprocessingml/2006/main" xmlns:w14="http://schemas.microsoft.com/office/word/2010/wordml" xmlns:w15="http://schemas.microsoft.com/office/word/2012/wordml" xmlns:w16cex="http://schemas.microsoft.com/office/word/2018/wordml/cex" xmlns:w16cid="http://schemas.microsoft.com/office/word/2016/wordml/cid" xmlns:w16="http://schemas.microsoft.com/office/word/2018/wordml" xmlns:w16du="http://schemas.microsoft.com/office/word/2023/wordml/word16du" xmlns:w16sdtdh="http://schemas.microsoft.com/office/word/2020/wordml/sdtdatahash" xmlns:w16sdtfl="http://schemas.microsoft.com/office/word/2024/wordml/sdtformatlock" xmlns:w16se="http://schemas.microsoft.com/office/word/2015/wordml/symex" xmlns:wpg="http://schemas.microsoft.com/office/word/2010/wordprocessingGroup" xmlns:wpi="http://schemas.microsoft.com/office/word/2010/wordprocessingInk" xmlns:wne="http://schemas.microsoft.com/office/word/2006/wordml" xmlns:wps="http://schemas.microsoft.com/office/word/2010/wordprocessingShape" mc:Ignorable="w14 w15 w16se w16cid w16 w16cex w16sdtdh w16sdtfl w16du wp14">
   <w:footnote w:type="separator" w:id="-1">
     <w:p>
       <w:pPr>
@@ -5943,7 +3440,7 @@
 </file>
 
 <file path=word/numbering.xml><?xml version="1.0" encoding="utf-8"?>
-<w:numbering xmlns:wpc="http://schemas.microsoft.com/office/word/2010/wordprocessingCanvas" xmlns:cx="http://schemas.microsoft.com/office/drawing/2014/chartex" xmlns:cx1="http://schemas.microsoft.com/office/drawing/2015/9/8/chartex" xmlns:cx2="http://schemas.microsoft.com/office/drawing/2015/10/21/chartex" xmlns:cx3="http://schemas.microsoft.com/office/drawing/2016/5/9/chartex" xmlns:cx4="http://schemas.microsoft.com/office/drawing/2016/5/10/chartex" xmlns:cx5="http://schemas.microsoft.com/office/drawing/2016/5/11/chartex" xmlns:cx6="http://schemas.microsoft.com/office/drawing/2016/5/12/chartex" xmlns:cx7="http://schemas.microsoft.com/office/drawing/2016/5/13/chartex" xmlns:cx8="http://schemas.microsoft.com/office/drawing/2016/5/14/chartex" xmlns:mc="http://schemas.openxmlformats.org/markup-compatibility/2006" xmlns:aink="http://schemas.microsoft.com/office/drawing/2016/ink" xmlns:am3d="http://schemas.microsoft.com/office/drawing/2017/model3d" xmlns:o="urn:schemas-microsoft-com:office:office" xmlns:oel="http://schemas.microsoft.com/office/2019/extlst" xmlns:r="http://schemas.openxmlformats.org/officeDocument/2006/relationships" xmlns:m="http://schemas.openxmlformats.org/officeDocument/2006/math" xmlns:v="urn:schemas-microsoft-com:vml" xmlns:wp14="http://schemas.microsoft.com/office/word/2010/wordprocessingDrawing" xmlns:wp="http://schemas.openxmlformats.org/drawingml/2006/wordprocessingDrawing" xmlns:w10="urn:schemas-microsoft-com:office:word" xmlns:w="http://schemas.openxmlformats.org/wordprocessingml/2006/main" xmlns:w14="http://schemas.microsoft.com/office/word/2010/wordml" xmlns:w15="http://schemas.microsoft.com/office/word/2012/wordml" xmlns:w16cex="http://schemas.microsoft.com/office/word/2018/wordml/cex" xmlns:w16cid="http://schemas.microsoft.com/office/word/2016/wordml/cid" xmlns:w16="http://schemas.microsoft.com/office/word/2018/wordml" xmlns:w16sdtdh="http://schemas.microsoft.com/office/word/2020/wordml/sdtdatahash" xmlns:w16se="http://schemas.microsoft.com/office/word/2015/wordml/symex" xmlns:wpg="http://schemas.microsoft.com/office/word/2010/wordprocessingGroup" xmlns:wpi="http://schemas.microsoft.com/office/word/2010/wordprocessingInk" xmlns:wne="http://schemas.microsoft.com/office/word/2006/wordml" xmlns:wps="http://schemas.microsoft.com/office/word/2010/wordprocessingShape" mc:Ignorable="w14 w15 w16se w16cid w16 w16cex w16sdtdh wp14">
+<w:numbering xmlns:wpc="http://schemas.microsoft.com/office/word/2010/wordprocessingCanvas" xmlns:cx="http://schemas.microsoft.com/office/drawing/2014/chartex" xmlns:cx1="http://schemas.microsoft.com/office/drawing/2015/9/8/chartex" xmlns:cx2="http://schemas.microsoft.com/office/drawing/2015/10/21/chartex" xmlns:cx3="http://schemas.microsoft.com/office/drawing/2016/5/9/chartex" xmlns:cx4="http://schemas.microsoft.com/office/drawing/2016/5/10/chartex" xmlns:cx5="http://schemas.microsoft.com/office/drawing/2016/5/11/chartex" xmlns:cx6="http://schemas.microsoft.com/office/drawing/2016/5/12/chartex" xmlns:cx7="http://schemas.microsoft.com/office/drawing/2016/5/13/chartex" xmlns:cx8="http://schemas.microsoft.com/office/drawing/2016/5/14/chartex" xmlns:mc="http://schemas.openxmlformats.org/markup-compatibility/2006" xmlns:aink="http://schemas.microsoft.com/office/drawing/2016/ink" xmlns:am3d="http://schemas.microsoft.com/office/drawing/2017/model3d" xmlns:o="urn:schemas-microsoft-com:office:office" xmlns:oel="http://schemas.microsoft.com/office/2019/extlst" xmlns:r="http://schemas.openxmlformats.org/officeDocument/2006/relationships" xmlns:m="http://schemas.openxmlformats.org/officeDocument/2006/math" xmlns:v="urn:schemas-microsoft-com:vml" xmlns:wp14="http://schemas.microsoft.com/office/word/2010/wordprocessingDrawing" xmlns:wp="http://schemas.openxmlformats.org/drawingml/2006/wordprocessingDrawing" xmlns:w10="urn:schemas-microsoft-com:office:word" xmlns:w="http://schemas.openxmlformats.org/wordprocessingml/2006/main" xmlns:w14="http://schemas.microsoft.com/office/word/2010/wordml" xmlns:w15="http://schemas.microsoft.com/office/word/2012/wordml" xmlns:w16cex="http://schemas.microsoft.com/office/word/2018/wordml/cex" xmlns:w16cid="http://schemas.microsoft.com/office/word/2016/wordml/cid" xmlns:w16="http://schemas.microsoft.com/office/word/2018/wordml" xmlns:w16du="http://schemas.microsoft.com/office/word/2023/wordml/word16du" xmlns:w16sdtdh="http://schemas.microsoft.com/office/word/2020/wordml/sdtdatahash" xmlns:w16sdtfl="http://schemas.microsoft.com/office/word/2024/wordml/sdtformatlock" xmlns:w16se="http://schemas.microsoft.com/office/word/2015/wordml/symex" xmlns:wpg="http://schemas.microsoft.com/office/word/2010/wordprocessingGroup" xmlns:wpi="http://schemas.microsoft.com/office/word/2010/wordprocessingInk" xmlns:wne="http://schemas.microsoft.com/office/word/2006/wordml" xmlns:wps="http://schemas.microsoft.com/office/word/2010/wordprocessingShape" mc:Ignorable="w14 w15 w16se w16cid w16 w16cex w16sdtdh w16sdtfl w16du wp14">
   <w:abstractNum w:abstractNumId="0" w15:restartNumberingAfterBreak="0">
     <w:nsid w:val="FFFFFF7C"/>
     <w:multiLevelType w:val="singleLevel"/>
@@ -6266,7 +3763,7 @@
 </file>
 
 <file path=word/styles.xml><?xml version="1.0" encoding="utf-8"?>
-<w:styles xmlns:mc="http://schemas.openxmlformats.org/markup-compatibility/2006" xmlns:r="http://schemas.openxmlformats.org/officeDocument/2006/relationships" xmlns:w="http://schemas.openxmlformats.org/wordprocessingml/2006/main" xmlns:w14="http://schemas.microsoft.com/office/word/2010/wordml" xmlns:w15="http://schemas.microsoft.com/office/word/2012/wordml" xmlns:w16cex="http://schemas.microsoft.com/office/word/2018/wordml/cex" xmlns:w16cid="http://schemas.microsoft.com/office/word/2016/wordml/cid" xmlns:w16="http://schemas.microsoft.com/office/word/2018/wordml" xmlns:w16sdtdh="http://schemas.microsoft.com/office/word/2020/wordml/sdtdatahash" xmlns:w16se="http://schemas.microsoft.com/office/word/2015/wordml/symex" mc:Ignorable="w14 w15 w16se w16cid w16 w16cex w16sdtdh">
+<w:styles xmlns:mc="http://schemas.openxmlformats.org/markup-compatibility/2006" xmlns:r="http://schemas.openxmlformats.org/officeDocument/2006/relationships" xmlns:w="http://schemas.openxmlformats.org/wordprocessingml/2006/main" xmlns:w14="http://schemas.microsoft.com/office/word/2010/wordml" xmlns:w15="http://schemas.microsoft.com/office/word/2012/wordml" xmlns:w16cex="http://schemas.microsoft.com/office/word/2018/wordml/cex" xmlns:w16cid="http://schemas.microsoft.com/office/word/2016/wordml/cid" xmlns:w16="http://schemas.microsoft.com/office/word/2018/wordml" xmlns:w16du="http://schemas.microsoft.com/office/word/2023/wordml/word16du" xmlns:w16sdtdh="http://schemas.microsoft.com/office/word/2020/wordml/sdtdatahash" xmlns:w16sdtfl="http://schemas.microsoft.com/office/word/2024/wordml/sdtformatlock" xmlns:w16se="http://schemas.microsoft.com/office/word/2015/wordml/symex" mc:Ignorable="w14 w15 w16se w16cid w16 w16cex w16sdtdh w16sdtfl w16du">
   <w:docDefaults>
     <w:rPrDefault>
       <w:rPr>

</xml_diff>

<commit_message>
raport wstepny - wersja ostateczna
</commit_message>
<xml_diff>
--- a/raport_wstepny.docx
+++ b/raport_wstepny.docx
@@ -246,41 +246,13 @@
           <w:szCs w:val="20"/>
         </w:rPr>
       </w:pPr>
-      <w:proofErr w:type="spellStart"/>
       <w:r>
         <w:rPr>
           <w:rFonts w:ascii="Arial Narrow" w:hAnsi="Arial Narrow" w:cs="Arial"/>
           <w:sz w:val="20"/>
           <w:szCs w:val="20"/>
         </w:rPr>
-        <w:t>semestr</w:t>
-      </w:r>
-      <w:proofErr w:type="spellEnd"/>
-      <w:r>
-        <w:rPr>
-          <w:rFonts w:ascii="Arial Narrow" w:hAnsi="Arial Narrow" w:cs="Arial"/>
-          <w:sz w:val="20"/>
-          <w:szCs w:val="20"/>
-        </w:rPr>
-        <w:t xml:space="preserve"> </w:t>
-      </w:r>
-      <w:proofErr w:type="spellStart"/>
-      <w:r>
-        <w:rPr>
-          <w:rFonts w:ascii="Arial Narrow" w:hAnsi="Arial Narrow" w:cs="Arial"/>
-          <w:sz w:val="20"/>
-          <w:szCs w:val="20"/>
-        </w:rPr>
-        <w:t>letni</w:t>
-      </w:r>
-      <w:proofErr w:type="spellEnd"/>
-      <w:r>
-        <w:rPr>
-          <w:rFonts w:ascii="Arial Narrow" w:hAnsi="Arial Narrow" w:cs="Arial"/>
-          <w:sz w:val="20"/>
-          <w:szCs w:val="20"/>
-        </w:rPr>
-        <w:t xml:space="preserve"> 2025/26</w:t>
+        <w:t>semestr letni 2025/26</w:t>
       </w:r>
     </w:p>
     <w:p>
@@ -361,25 +333,7 @@
           <w:sz w:val="32"/>
           <w:szCs w:val="32"/>
         </w:rPr>
-        <w:t xml:space="preserve">Temat </w:t>
-      </w:r>
-      <w:proofErr w:type="spellStart"/>
-      <w:r>
-        <w:rPr>
-          <w:rFonts w:ascii="Arial Narrow" w:hAnsi="Arial Narrow" w:cs="Arial"/>
-          <w:sz w:val="32"/>
-          <w:szCs w:val="32"/>
-        </w:rPr>
-        <w:t>projektu</w:t>
-      </w:r>
-      <w:proofErr w:type="spellEnd"/>
-      <w:r>
-        <w:rPr>
-          <w:rFonts w:ascii="Arial Narrow" w:hAnsi="Arial Narrow" w:cs="Arial"/>
-          <w:sz w:val="32"/>
-          <w:szCs w:val="32"/>
-        </w:rPr>
-        <w:t>:</w:t>
+        <w:t>Temat projektu:</w:t>
       </w:r>
     </w:p>
     <w:p>
@@ -392,7 +346,6 @@
           <w:szCs w:val="32"/>
         </w:rPr>
       </w:pPr>
-      <w:proofErr w:type="spellStart"/>
       <w:r>
         <w:rPr>
           <w:rFonts w:ascii="Arial Narrow" w:hAnsi="Arial Narrow" w:cs="Arial"/>
@@ -400,157 +353,7 @@
           <w:sz w:val="32"/>
           <w:szCs w:val="32"/>
         </w:rPr>
-        <w:t>Porównanie</w:t>
-      </w:r>
-      <w:proofErr w:type="spellEnd"/>
-      <w:r>
-        <w:rPr>
-          <w:rFonts w:ascii="Arial Narrow" w:hAnsi="Arial Narrow" w:cs="Arial"/>
-          <w:i/>
-          <w:sz w:val="32"/>
-          <w:szCs w:val="32"/>
-        </w:rPr>
-        <w:t xml:space="preserve"> </w:t>
-      </w:r>
-      <w:proofErr w:type="spellStart"/>
-      <w:r>
-        <w:rPr>
-          <w:rFonts w:ascii="Arial Narrow" w:hAnsi="Arial Narrow" w:cs="Arial"/>
-          <w:i/>
-          <w:sz w:val="32"/>
-          <w:szCs w:val="32"/>
-        </w:rPr>
-        <w:t>efektywności</w:t>
-      </w:r>
-      <w:proofErr w:type="spellEnd"/>
-      <w:r>
-        <w:rPr>
-          <w:rFonts w:ascii="Arial Narrow" w:hAnsi="Arial Narrow" w:cs="Arial"/>
-          <w:i/>
-          <w:sz w:val="32"/>
-          <w:szCs w:val="32"/>
-        </w:rPr>
-        <w:t xml:space="preserve"> </w:t>
-      </w:r>
-      <w:proofErr w:type="spellStart"/>
-      <w:r>
-        <w:rPr>
-          <w:rFonts w:ascii="Arial Narrow" w:hAnsi="Arial Narrow" w:cs="Arial"/>
-          <w:i/>
-          <w:sz w:val="32"/>
-          <w:szCs w:val="32"/>
-        </w:rPr>
-        <w:t>algorytmów</w:t>
-      </w:r>
-      <w:proofErr w:type="spellEnd"/>
-      <w:r>
-        <w:rPr>
-          <w:rFonts w:ascii="Arial Narrow" w:hAnsi="Arial Narrow" w:cs="Arial"/>
-          <w:i/>
-          <w:sz w:val="32"/>
-          <w:szCs w:val="32"/>
-        </w:rPr>
-        <w:t xml:space="preserve"> </w:t>
-      </w:r>
-      <w:proofErr w:type="spellStart"/>
-      <w:r>
-        <w:rPr>
-          <w:rFonts w:ascii="Arial Narrow" w:hAnsi="Arial Narrow" w:cs="Arial"/>
-          <w:i/>
-          <w:sz w:val="32"/>
-          <w:szCs w:val="32"/>
-        </w:rPr>
-        <w:t>doboru</w:t>
-      </w:r>
-      <w:proofErr w:type="spellEnd"/>
-      <w:r>
-        <w:rPr>
-          <w:rFonts w:ascii="Arial Narrow" w:hAnsi="Arial Narrow" w:cs="Arial"/>
-          <w:i/>
-          <w:sz w:val="32"/>
-          <w:szCs w:val="32"/>
-        </w:rPr>
-        <w:t xml:space="preserve"> </w:t>
-      </w:r>
-      <w:proofErr w:type="spellStart"/>
-      <w:r>
-        <w:rPr>
-          <w:rFonts w:ascii="Arial Narrow" w:hAnsi="Arial Narrow" w:cs="Arial"/>
-          <w:i/>
-          <w:sz w:val="32"/>
-          <w:szCs w:val="32"/>
-        </w:rPr>
-        <w:t>tras</w:t>
-      </w:r>
-      <w:proofErr w:type="spellEnd"/>
-      <w:r>
-        <w:rPr>
-          <w:rFonts w:ascii="Arial Narrow" w:hAnsi="Arial Narrow" w:cs="Arial"/>
-          <w:i/>
-          <w:sz w:val="32"/>
-          <w:szCs w:val="32"/>
-        </w:rPr>
-        <w:t xml:space="preserve"> </w:t>
-      </w:r>
-      <w:proofErr w:type="spellStart"/>
-      <w:r>
-        <w:rPr>
-          <w:rFonts w:ascii="Arial Narrow" w:hAnsi="Arial Narrow" w:cs="Arial"/>
-          <w:i/>
-          <w:sz w:val="32"/>
-          <w:szCs w:val="32"/>
-        </w:rPr>
-        <w:t>rozłącznych</w:t>
-      </w:r>
-      <w:proofErr w:type="spellEnd"/>
-      <w:r>
-        <w:rPr>
-          <w:rFonts w:ascii="Arial Narrow" w:hAnsi="Arial Narrow" w:cs="Arial"/>
-          <w:i/>
-          <w:sz w:val="32"/>
-          <w:szCs w:val="32"/>
-        </w:rPr>
-        <w:t xml:space="preserve">: </w:t>
-      </w:r>
-      <w:proofErr w:type="spellStart"/>
-      <w:r>
-        <w:rPr>
-          <w:rFonts w:ascii="Arial Narrow" w:hAnsi="Arial Narrow" w:cs="Arial"/>
-          <w:i/>
-          <w:sz w:val="32"/>
-          <w:szCs w:val="32"/>
-        </w:rPr>
-        <w:t>naiwnego</w:t>
-      </w:r>
-      <w:proofErr w:type="spellEnd"/>
-      <w:r>
-        <w:rPr>
-          <w:rFonts w:ascii="Arial Narrow" w:hAnsi="Arial Narrow" w:cs="Arial"/>
-          <w:i/>
-          <w:sz w:val="32"/>
-          <w:szCs w:val="32"/>
-        </w:rPr>
-        <w:t xml:space="preserve"> </w:t>
-      </w:r>
-      <w:proofErr w:type="spellStart"/>
-      <w:r>
-        <w:rPr>
-          <w:rFonts w:ascii="Arial Narrow" w:hAnsi="Arial Narrow" w:cs="Arial"/>
-          <w:i/>
-          <w:sz w:val="32"/>
-          <w:szCs w:val="32"/>
-        </w:rPr>
-        <w:t>i</w:t>
-      </w:r>
-      <w:proofErr w:type="spellEnd"/>
-      <w:r>
-        <w:rPr>
-          <w:rFonts w:ascii="Arial Narrow" w:hAnsi="Arial Narrow" w:cs="Arial"/>
-          <w:i/>
-          <w:sz w:val="32"/>
-          <w:szCs w:val="32"/>
-        </w:rPr>
-        <w:t xml:space="preserve"> Suurballe</w:t>
+        <w:t>Porównanie efektywności algorytmów doboru tras rozłącznych: naiwnego i Suurballe</w:t>
       </w:r>
     </w:p>
     <w:p>
@@ -598,7 +401,6 @@
                 <w:u w:val="single"/>
               </w:rPr>
             </w:pPr>
-            <w:proofErr w:type="spellStart"/>
             <w:r>
               <w:rPr>
                 <w:rFonts w:ascii="Arial Narrow" w:hAnsi="Arial Narrow" w:cs="Arial"/>
@@ -606,17 +408,7 @@
                 <w:szCs w:val="24"/>
                 <w:u w:val="single"/>
               </w:rPr>
-              <w:t>Prowadzący</w:t>
-            </w:r>
-            <w:proofErr w:type="spellEnd"/>
-            <w:r>
-              <w:rPr>
-                <w:rFonts w:ascii="Arial Narrow" w:hAnsi="Arial Narrow" w:cs="Arial"/>
-                <w:sz w:val="24"/>
-                <w:szCs w:val="24"/>
-                <w:u w:val="single"/>
-              </w:rPr>
-              <w:t>:</w:t>
+              <w:t>Prowadzący:</w:t>
             </w:r>
           </w:p>
           <w:p>
@@ -634,25 +426,7 @@
                 <w:sz w:val="24"/>
                 <w:szCs w:val="24"/>
               </w:rPr>
-              <w:t xml:space="preserve">Dr hab. </w:t>
-            </w:r>
-            <w:proofErr w:type="spellStart"/>
-            <w:r>
-              <w:rPr>
-                <w:rFonts w:ascii="Arial Narrow" w:hAnsi="Arial Narrow" w:cs="Arial"/>
-                <w:sz w:val="24"/>
-                <w:szCs w:val="24"/>
-              </w:rPr>
-              <w:t>inż</w:t>
-            </w:r>
-            <w:proofErr w:type="spellEnd"/>
-            <w:r>
-              <w:rPr>
-                <w:rFonts w:ascii="Arial Narrow" w:hAnsi="Arial Narrow" w:cs="Arial"/>
-                <w:sz w:val="24"/>
-                <w:szCs w:val="24"/>
-              </w:rPr>
-              <w:t>. Jacek Rak, prof. PG</w:t>
+              <w:t>Dr hab. inż. Jacek Rak, prof. PG</w:t>
             </w:r>
           </w:p>
           <w:p>
@@ -681,7 +455,6 @@
                 <w:u w:val="single"/>
               </w:rPr>
             </w:pPr>
-            <w:proofErr w:type="spellStart"/>
             <w:r>
               <w:rPr>
                 <w:rFonts w:ascii="Arial Narrow" w:hAnsi="Arial Narrow" w:cs="Arial"/>
@@ -689,37 +462,7 @@
                 <w:szCs w:val="24"/>
                 <w:u w:val="single"/>
               </w:rPr>
-              <w:t>Skład</w:t>
-            </w:r>
-            <w:proofErr w:type="spellEnd"/>
-            <w:r>
-              <w:rPr>
-                <w:rFonts w:ascii="Arial Narrow" w:hAnsi="Arial Narrow" w:cs="Arial"/>
-                <w:sz w:val="24"/>
-                <w:szCs w:val="24"/>
-                <w:u w:val="single"/>
-              </w:rPr>
-              <w:t xml:space="preserve"> </w:t>
-            </w:r>
-            <w:proofErr w:type="spellStart"/>
-            <w:r>
-              <w:rPr>
-                <w:rFonts w:ascii="Arial Narrow" w:hAnsi="Arial Narrow" w:cs="Arial"/>
-                <w:sz w:val="24"/>
-                <w:szCs w:val="24"/>
-                <w:u w:val="single"/>
-              </w:rPr>
-              <w:t>grupy</w:t>
-            </w:r>
-            <w:proofErr w:type="spellEnd"/>
-            <w:r>
-              <w:rPr>
-                <w:rFonts w:ascii="Arial Narrow" w:hAnsi="Arial Narrow" w:cs="Arial"/>
-                <w:sz w:val="24"/>
-                <w:szCs w:val="24"/>
-                <w:u w:val="single"/>
-              </w:rPr>
-              <w:t>:</w:t>
+              <w:t>Skład grupy:</w:t>
             </w:r>
           </w:p>
           <w:p>
@@ -737,18 +480,8 @@
                 <w:sz w:val="24"/>
                 <w:szCs w:val="24"/>
               </w:rPr>
-              <w:t xml:space="preserve">189024 Jakub </w:t>
+              <w:t>189024 Jakub Gawędzki</w:t>
             </w:r>
-            <w:proofErr w:type="spellStart"/>
-            <w:r>
-              <w:rPr>
-                <w:rFonts w:ascii="Arial Narrow" w:hAnsi="Arial Narrow" w:cs="Arial"/>
-                <w:sz w:val="24"/>
-                <w:szCs w:val="24"/>
-              </w:rPr>
-              <w:t>Gawędzki</w:t>
-            </w:r>
-            <w:proofErr w:type="spellEnd"/>
           </w:p>
           <w:p>
             <w:pPr>
@@ -868,19 +601,11 @@
           <w:rFonts w:ascii="Arial Narrow" w:hAnsi="Arial Narrow" w:cs="Arial"/>
         </w:rPr>
       </w:pPr>
-      <w:proofErr w:type="spellStart"/>
       <w:r>
         <w:rPr>
           <w:rFonts w:ascii="Arial Narrow" w:hAnsi="Arial Narrow" w:cs="Arial"/>
         </w:rPr>
-        <w:t>Gdańsk</w:t>
-      </w:r>
-      <w:proofErr w:type="spellEnd"/>
-      <w:r>
-        <w:rPr>
-          <w:rFonts w:ascii="Arial Narrow" w:hAnsi="Arial Narrow" w:cs="Arial"/>
-        </w:rPr>
-        <w:t xml:space="preserve">, </w:t>
+        <w:t xml:space="preserve">Gdańsk, </w:t>
       </w:r>
       <w:r>
         <w:rPr>
@@ -1273,46 +998,9 @@
       <w:bookmarkStart w:id="0" w:name="_Toc228201679"/>
       <w:r>
         <w:lastRenderedPageBreak/>
-        <w:t xml:space="preserve">1. </w:t>
-      </w:r>
-      <w:proofErr w:type="spellStart"/>
-      <w:r>
-        <w:t>Charakterystyka</w:t>
-      </w:r>
-      <w:proofErr w:type="spellEnd"/>
-      <w:r>
-        <w:t xml:space="preserve"> </w:t>
-      </w:r>
-      <w:proofErr w:type="spellStart"/>
-      <w:r>
-        <w:t>zagadnienia</w:t>
-      </w:r>
-      <w:proofErr w:type="spellEnd"/>
-      <w:r>
-        <w:t xml:space="preserve"> </w:t>
-      </w:r>
-      <w:proofErr w:type="spellStart"/>
-      <w:r>
-        <w:t>i</w:t>
-      </w:r>
-      <w:proofErr w:type="spellEnd"/>
-      <w:r>
-        <w:t xml:space="preserve"> </w:t>
-      </w:r>
-      <w:proofErr w:type="spellStart"/>
-      <w:r>
-        <w:t>opis</w:t>
-      </w:r>
-      <w:proofErr w:type="spellEnd"/>
-      <w:r>
-        <w:t xml:space="preserve"> </w:t>
-      </w:r>
-      <w:proofErr w:type="spellStart"/>
-      <w:r>
-        <w:t>problemu</w:t>
+        <w:t>1. Charakterystyka zagadnienia i opis problemu</w:t>
       </w:r>
       <w:bookmarkEnd w:id="0"/>
-      <w:proofErr w:type="spellEnd"/>
     </w:p>
     <w:p>
       <w:pPr>
@@ -1330,13 +1018,43 @@
         <w:rPr>
           <w:lang w:val="pl-PL"/>
         </w:rPr>
-        <w:t xml:space="preserve"> [7]</w:t>
+        <w:t xml:space="preserve"> [</w:t>
       </w:r>
       <w:r>
         <w:rPr>
           <w:lang w:val="pl-PL"/>
         </w:rPr>
-        <w:t>. Oznacza to, że trasy te nie mogą korzystać z tych samych łączy. Dzięki temu awaria pojedynczego łącza nie powinna spowodować jednoczesnego przerwania trasy podstawowej oraz trasy zapasowej.</w:t>
+        <w:t>1</w:t>
+      </w:r>
+      <w:r>
+        <w:rPr>
+          <w:lang w:val="pl-PL"/>
+        </w:rPr>
+        <w:t>]</w:t>
+      </w:r>
+      <w:r>
+        <w:rPr>
+          <w:lang w:val="pl-PL"/>
+        </w:rPr>
+        <w:t xml:space="preserve">. Oznacza to, że trasy te nie mogą korzystać z tych samych łączy. Dzięki temu awaria pojedynczego łącza nie </w:t>
+      </w:r>
+      <w:r>
+        <w:rPr>
+          <w:lang w:val="pl-PL"/>
+        </w:rPr>
+        <w:t>spowoduje</w:t>
+      </w:r>
+      <w:r>
+        <w:rPr>
+          <w:lang w:val="pl-PL"/>
+        </w:rPr>
+        <w:t xml:space="preserve"> </w:t>
+      </w:r>
+      <w:r>
+        <w:rPr>
+          <w:lang w:val="pl-PL"/>
+        </w:rPr>
+        <w:t xml:space="preserve"> jednoczesnego przerwania trasy podstawowej oraz trasy zapasowej.</w:t>
       </w:r>
     </w:p>
     <w:p>
@@ -1355,27 +1073,55 @@
         <w:rPr>
           <w:lang w:val="pl-PL"/>
         </w:rPr>
-        <w:t xml:space="preserve"> [4]</w:t>
+        <w:t xml:space="preserve"> [</w:t>
       </w:r>
       <w:r>
         <w:rPr>
           <w:lang w:val="pl-PL"/>
         </w:rPr>
-        <w:t xml:space="preserve">, usunięciu użytych przez nią łączy, a następnie ponownym uruchomieniu algorytmu w celu znalezienia drugiej trasy. Drugim podejściem jest algorytm </w:t>
+        <w:t>2</w:t>
       </w:r>
-      <w:proofErr w:type="spellStart"/>
       <w:r>
         <w:rPr>
           <w:lang w:val="pl-PL"/>
         </w:rPr>
-        <w:t>Suurballe’a</w:t>
+        <w:t>]</w:t>
       </w:r>
-      <w:proofErr w:type="spellEnd"/>
       <w:r>
         <w:rPr>
           <w:lang w:val="pl-PL"/>
         </w:rPr>
-        <w:t xml:space="preserve"> [2,3]</w:t>
+        <w:t>, usunięciu użytych przez nią łączy, a następnie ponownym uruchomieniu algorytmu w celu znalezienia drugiej trasy. Drugim podejściem jest algorytm Suurballe’a</w:t>
+      </w:r>
+      <w:r>
+        <w:rPr>
+          <w:lang w:val="pl-PL"/>
+        </w:rPr>
+        <w:t xml:space="preserve"> [</w:t>
+      </w:r>
+      <w:r>
+        <w:rPr>
+          <w:lang w:val="pl-PL"/>
+        </w:rPr>
+        <w:t>3</w:t>
+      </w:r>
+      <w:r>
+        <w:rPr>
+          <w:lang w:val="pl-PL"/>
+        </w:rPr>
+        <w:t>,</w:t>
+      </w:r>
+      <w:r>
+        <w:rPr>
+          <w:lang w:val="pl-PL"/>
+        </w:rPr>
+        <w:t>4</w:t>
+      </w:r>
+      <w:r>
+        <w:rPr>
+          <w:lang w:val="pl-PL"/>
+        </w:rPr>
+        <w:t>]</w:t>
       </w:r>
       <w:r>
         <w:rPr>
@@ -1408,7 +1154,6 @@
             <w:pPr>
               <w:spacing w:after="0"/>
             </w:pPr>
-            <w:proofErr w:type="spellStart"/>
             <w:r>
               <w:rPr>
                 <w:b/>
@@ -1417,7 +1162,6 @@
               </w:rPr>
               <w:t>Cecha</w:t>
             </w:r>
-            <w:proofErr w:type="spellEnd"/>
           </w:p>
         </w:tc>
         <w:tc>
@@ -1430,7 +1174,6 @@
             <w:pPr>
               <w:spacing w:after="0"/>
             </w:pPr>
-            <w:proofErr w:type="spellStart"/>
             <w:r>
               <w:rPr>
                 <w:b/>
@@ -1439,7 +1182,6 @@
               </w:rPr>
               <w:t>Wartość</w:t>
             </w:r>
-            <w:proofErr w:type="spellEnd"/>
           </w:p>
         </w:tc>
       </w:tr>
@@ -1454,28 +1196,12 @@
             <w:pPr>
               <w:spacing w:after="0"/>
             </w:pPr>
-            <w:proofErr w:type="spellStart"/>
             <w:r>
               <w:rPr>
                 <w:sz w:val="17"/>
               </w:rPr>
-              <w:t>Liczba</w:t>
+              <w:t>Liczba węzłów</w:t>
             </w:r>
-            <w:proofErr w:type="spellEnd"/>
-            <w:r>
-              <w:rPr>
-                <w:sz w:val="17"/>
-              </w:rPr>
-              <w:t xml:space="preserve"> </w:t>
-            </w:r>
-            <w:proofErr w:type="spellStart"/>
-            <w:r>
-              <w:rPr>
-                <w:sz w:val="17"/>
-              </w:rPr>
-              <w:t>węzłów</w:t>
-            </w:r>
-            <w:proofErr w:type="spellEnd"/>
           </w:p>
         </w:tc>
         <w:tc>
@@ -1507,28 +1233,12 @@
             <w:pPr>
               <w:spacing w:after="0"/>
             </w:pPr>
-            <w:proofErr w:type="spellStart"/>
             <w:r>
               <w:rPr>
                 <w:sz w:val="17"/>
               </w:rPr>
-              <w:t>Liczba</w:t>
+              <w:t>Liczba łączy</w:t>
             </w:r>
-            <w:proofErr w:type="spellEnd"/>
-            <w:r>
-              <w:rPr>
-                <w:sz w:val="17"/>
-              </w:rPr>
-              <w:t xml:space="preserve"> </w:t>
-            </w:r>
-            <w:proofErr w:type="spellStart"/>
-            <w:r>
-              <w:rPr>
-                <w:sz w:val="17"/>
-              </w:rPr>
-              <w:t>łączy</w:t>
-            </w:r>
-            <w:proofErr w:type="spellEnd"/>
           </w:p>
         </w:tc>
         <w:tc>
@@ -1564,16 +1274,8 @@
               <w:rPr>
                 <w:sz w:val="17"/>
               </w:rPr>
-              <w:t xml:space="preserve">Graf </w:t>
+              <w:t>Graf spójny</w:t>
             </w:r>
-            <w:proofErr w:type="spellStart"/>
-            <w:r>
-              <w:rPr>
-                <w:sz w:val="17"/>
-              </w:rPr>
-              <w:t>spójny</w:t>
-            </w:r>
-            <w:proofErr w:type="spellEnd"/>
           </w:p>
         </w:tc>
         <w:tc>
@@ -1586,14 +1288,12 @@
             <w:pPr>
               <w:spacing w:after="0"/>
             </w:pPr>
-            <w:proofErr w:type="spellStart"/>
             <w:r>
               <w:rPr>
                 <w:sz w:val="17"/>
               </w:rPr>
               <w:t>tak</w:t>
             </w:r>
-            <w:proofErr w:type="spellEnd"/>
           </w:p>
         </w:tc>
       </w:tr>
@@ -1607,28 +1307,12 @@
             <w:pPr>
               <w:spacing w:after="0"/>
             </w:pPr>
-            <w:proofErr w:type="spellStart"/>
             <w:r>
               <w:rPr>
                 <w:sz w:val="17"/>
               </w:rPr>
-              <w:t>Spójność</w:t>
+              <w:t>Spójność krawędziowa</w:t>
             </w:r>
-            <w:proofErr w:type="spellEnd"/>
-            <w:r>
-              <w:rPr>
-                <w:sz w:val="17"/>
-              </w:rPr>
-              <w:t xml:space="preserve"> </w:t>
-            </w:r>
-            <w:proofErr w:type="spellStart"/>
-            <w:r>
-              <w:rPr>
-                <w:sz w:val="17"/>
-              </w:rPr>
-              <w:t>krawędziowa</w:t>
-            </w:r>
-            <w:proofErr w:type="spellEnd"/>
           </w:p>
         </w:tc>
         <w:tc>
@@ -1660,33 +1344,11 @@
             <w:pPr>
               <w:spacing w:after="0"/>
             </w:pPr>
-            <w:proofErr w:type="spellStart"/>
             <w:r>
               <w:rPr>
                 <w:sz w:val="17"/>
               </w:rPr>
-              <w:t>Liczba</w:t>
-            </w:r>
-            <w:proofErr w:type="spellEnd"/>
-            <w:r>
-              <w:rPr>
-                <w:sz w:val="17"/>
-              </w:rPr>
-              <w:t xml:space="preserve"> </w:t>
-            </w:r>
-            <w:proofErr w:type="spellStart"/>
-            <w:r>
-              <w:rPr>
-                <w:sz w:val="17"/>
-              </w:rPr>
-              <w:t>badanych</w:t>
-            </w:r>
-            <w:proofErr w:type="spellEnd"/>
-            <w:r>
-              <w:rPr>
-                <w:sz w:val="17"/>
-              </w:rPr>
-              <w:t xml:space="preserve"> par s-t</w:t>
+              <w:t>Liczba badanych par s-t</w:t>
             </w:r>
           </w:p>
         </w:tc>
@@ -1761,182 +1423,12 @@
       </w:pPr>
       <w:r>
         <w:lastRenderedPageBreak/>
-        <w:t xml:space="preserve">Lista </w:t>
+        <w:t>Lista sąsiedztwa topologii</w:t>
       </w:r>
-      <w:proofErr w:type="spellStart"/>
-      <w:r>
-        <w:t>sąsiedztwa</w:t>
-      </w:r>
-      <w:proofErr w:type="spellEnd"/>
-      <w:r>
-        <w:t xml:space="preserve"> </w:t>
-      </w:r>
-      <w:proofErr w:type="spellStart"/>
-      <w:r>
-        <w:t>topologii</w:t>
-      </w:r>
-      <w:proofErr w:type="spellEnd"/>
     </w:p>
     <w:p>
-      <w:proofErr w:type="spellStart"/>
       <w:r>
-        <w:t>Tabela</w:t>
-      </w:r>
-      <w:proofErr w:type="spellEnd"/>
-      <w:r>
-        <w:t xml:space="preserve"> </w:t>
-      </w:r>
-      <w:proofErr w:type="spellStart"/>
-      <w:r>
-        <w:t>pokazuje</w:t>
-      </w:r>
-      <w:proofErr w:type="spellEnd"/>
-      <w:r>
-        <w:t xml:space="preserve">, z </w:t>
-      </w:r>
-      <w:proofErr w:type="spellStart"/>
-      <w:r>
-        <w:t>jakimi</w:t>
-      </w:r>
-      <w:proofErr w:type="spellEnd"/>
-      <w:r>
-        <w:t xml:space="preserve"> </w:t>
-      </w:r>
-      <w:proofErr w:type="spellStart"/>
-      <w:r>
-        <w:t>węzłami</w:t>
-      </w:r>
-      <w:proofErr w:type="spellEnd"/>
-      <w:r>
-        <w:t xml:space="preserve"> </w:t>
-      </w:r>
-      <w:proofErr w:type="spellStart"/>
-      <w:r>
-        <w:t>bezpośrednio</w:t>
-      </w:r>
-      <w:proofErr w:type="spellEnd"/>
-      <w:r>
-        <w:t xml:space="preserve"> </w:t>
-      </w:r>
-      <w:proofErr w:type="spellStart"/>
-      <w:r>
-        <w:t>połączony</w:t>
-      </w:r>
-      <w:proofErr w:type="spellEnd"/>
-      <w:r>
-        <w:t xml:space="preserve"> jest </w:t>
-      </w:r>
-      <w:proofErr w:type="spellStart"/>
-      <w:r>
-        <w:t>dany</w:t>
-      </w:r>
-      <w:proofErr w:type="spellEnd"/>
-      <w:r>
-        <w:t xml:space="preserve"> </w:t>
-      </w:r>
-      <w:proofErr w:type="spellStart"/>
-      <w:r>
-        <w:t>węzeł</w:t>
-      </w:r>
-      <w:proofErr w:type="spellEnd"/>
-      <w:r>
-        <w:t xml:space="preserve">. </w:t>
-      </w:r>
-      <w:proofErr w:type="spellStart"/>
-      <w:r>
-        <w:t>Ponieważ</w:t>
-      </w:r>
-      <w:proofErr w:type="spellEnd"/>
-      <w:r>
-        <w:t xml:space="preserve"> </w:t>
-      </w:r>
-      <w:proofErr w:type="spellStart"/>
-      <w:r>
-        <w:t>wszystkie</w:t>
-      </w:r>
-      <w:proofErr w:type="spellEnd"/>
-      <w:r>
-        <w:t xml:space="preserve"> </w:t>
-      </w:r>
-      <w:proofErr w:type="spellStart"/>
-      <w:r>
-        <w:t>łącza</w:t>
-      </w:r>
-      <w:proofErr w:type="spellEnd"/>
-      <w:r>
-        <w:t xml:space="preserve"> </w:t>
-      </w:r>
-      <w:proofErr w:type="spellStart"/>
-      <w:r>
-        <w:t>mają</w:t>
-      </w:r>
-      <w:proofErr w:type="spellEnd"/>
-      <w:r>
-        <w:t xml:space="preserve"> </w:t>
-      </w:r>
-      <w:proofErr w:type="spellStart"/>
-      <w:r>
-        <w:t>koszt</w:t>
-      </w:r>
-      <w:proofErr w:type="spellEnd"/>
-      <w:r>
-        <w:t xml:space="preserve"> 1, </w:t>
-      </w:r>
-      <w:proofErr w:type="spellStart"/>
-      <w:r>
-        <w:t>lista</w:t>
-      </w:r>
-      <w:proofErr w:type="spellEnd"/>
-      <w:r>
-        <w:t xml:space="preserve"> </w:t>
-      </w:r>
-      <w:proofErr w:type="spellStart"/>
-      <w:r>
-        <w:t>sąsiadów</w:t>
-      </w:r>
-      <w:proofErr w:type="spellEnd"/>
-      <w:r>
-        <w:t xml:space="preserve"> jest </w:t>
-      </w:r>
-      <w:proofErr w:type="spellStart"/>
-      <w:r>
-        <w:t>równoważna</w:t>
-      </w:r>
-      <w:proofErr w:type="spellEnd"/>
-      <w:r>
-        <w:t xml:space="preserve"> </w:t>
-      </w:r>
-      <w:proofErr w:type="spellStart"/>
-      <w:r>
-        <w:t>opisowi</w:t>
-      </w:r>
-      <w:proofErr w:type="spellEnd"/>
-      <w:r>
-        <w:t xml:space="preserve"> </w:t>
-      </w:r>
-      <w:proofErr w:type="spellStart"/>
-      <w:r>
-        <w:t>bezpośrednich</w:t>
-      </w:r>
-      <w:proofErr w:type="spellEnd"/>
-      <w:r>
-        <w:t xml:space="preserve"> </w:t>
-      </w:r>
-      <w:proofErr w:type="spellStart"/>
-      <w:r>
-        <w:t>połączeń</w:t>
-      </w:r>
-      <w:proofErr w:type="spellEnd"/>
-      <w:r>
-        <w:t xml:space="preserve"> w </w:t>
-      </w:r>
-      <w:proofErr w:type="spellStart"/>
-      <w:r>
-        <w:t>grafie</w:t>
-      </w:r>
-      <w:proofErr w:type="spellEnd"/>
-      <w:r>
-        <w:t>.</w:t>
+        <w:t>Tabela pokazuje, z jakimi węzłami bezpośrednio połączony jest dany węzeł. Ponieważ wszystkie łącza mają koszt 1, lista sąsiadów jest równoważna opisowi bezpośrednich połączeń w grafie.</w:t>
       </w:r>
     </w:p>
     <w:tbl>
@@ -1965,7 +1457,6 @@
             <w:pPr>
               <w:spacing w:after="0"/>
             </w:pPr>
-            <w:proofErr w:type="spellStart"/>
             <w:r>
               <w:rPr>
                 <w:b/>
@@ -1974,7 +1465,6 @@
               </w:rPr>
               <w:t>Węzeł</w:t>
             </w:r>
-            <w:proofErr w:type="spellEnd"/>
           </w:p>
         </w:tc>
         <w:tc>
@@ -1987,7 +1477,6 @@
             <w:pPr>
               <w:spacing w:after="0"/>
             </w:pPr>
-            <w:proofErr w:type="spellStart"/>
             <w:r>
               <w:rPr>
                 <w:b/>
@@ -1996,7 +1485,6 @@
               </w:rPr>
               <w:t>Sąsiedzi</w:t>
             </w:r>
-            <w:proofErr w:type="spellEnd"/>
           </w:p>
         </w:tc>
         <w:tc>
@@ -2009,7 +1497,6 @@
             <w:pPr>
               <w:spacing w:after="0"/>
             </w:pPr>
-            <w:proofErr w:type="spellStart"/>
             <w:r>
               <w:rPr>
                 <w:b/>
@@ -2018,7 +1505,6 @@
               </w:rPr>
               <w:t>Stopień</w:t>
             </w:r>
-            <w:proofErr w:type="spellEnd"/>
           </w:p>
         </w:tc>
       </w:tr>
@@ -3238,252 +2724,41 @@
       </w:pPr>
       <w:bookmarkStart w:id="1" w:name="_Toc228201680"/>
       <w:r>
-        <w:t xml:space="preserve">2. </w:t>
-      </w:r>
-      <w:proofErr w:type="spellStart"/>
-      <w:r>
-        <w:t>Opis</w:t>
-      </w:r>
-      <w:proofErr w:type="spellEnd"/>
-      <w:r>
-        <w:t xml:space="preserve"> </w:t>
-      </w:r>
-      <w:proofErr w:type="spellStart"/>
-      <w:r>
-        <w:t>proponowanej</w:t>
-      </w:r>
-      <w:proofErr w:type="spellEnd"/>
-      <w:r>
-        <w:t xml:space="preserve"> </w:t>
-      </w:r>
-      <w:proofErr w:type="spellStart"/>
-      <w:r>
-        <w:t>metody</w:t>
-      </w:r>
-      <w:proofErr w:type="spellEnd"/>
-      <w:r>
-        <w:t xml:space="preserve"> </w:t>
-      </w:r>
-      <w:proofErr w:type="spellStart"/>
-      <w:r>
-        <w:t>rozwiązania</w:t>
-      </w:r>
-      <w:proofErr w:type="spellEnd"/>
-      <w:r>
-        <w:t xml:space="preserve"> </w:t>
-      </w:r>
-      <w:proofErr w:type="spellStart"/>
-      <w:r>
-        <w:t>problemu</w:t>
+        <w:t>2. Opis proponowanej metody rozwiązania problemu</w:t>
       </w:r>
       <w:bookmarkEnd w:id="1"/>
-      <w:proofErr w:type="spellEnd"/>
     </w:p>
     <w:p>
       <w:pPr>
         <w:pStyle w:val="Nagwek2"/>
       </w:pPr>
-      <w:proofErr w:type="spellStart"/>
       <w:r>
-        <w:t>Podejście</w:t>
+        <w:t>Podejście naiwne</w:t>
       </w:r>
-      <w:proofErr w:type="spellEnd"/>
-      <w:r>
-        <w:t xml:space="preserve"> </w:t>
-      </w:r>
-      <w:proofErr w:type="spellStart"/>
-      <w:r>
-        <w:t>naiwne</w:t>
-      </w:r>
-      <w:proofErr w:type="spellEnd"/>
     </w:p>
     <w:p>
-      <w:proofErr w:type="spellStart"/>
       <w:r>
-        <w:t>Metoda</w:t>
-      </w:r>
-      <w:proofErr w:type="spellEnd"/>
-      <w:r>
-        <w:t xml:space="preserve"> </w:t>
-      </w:r>
-      <w:proofErr w:type="spellStart"/>
-      <w:r>
-        <w:t>naiwna</w:t>
-      </w:r>
-      <w:proofErr w:type="spellEnd"/>
-      <w:r>
-        <w:t xml:space="preserve"> </w:t>
-      </w:r>
-      <w:proofErr w:type="spellStart"/>
-      <w:r>
-        <w:t>wyznacza</w:t>
-      </w:r>
-      <w:proofErr w:type="spellEnd"/>
-      <w:r>
-        <w:t xml:space="preserve"> </w:t>
-      </w:r>
-      <w:proofErr w:type="spellStart"/>
-      <w:r>
-        <w:t>najkrótszą</w:t>
-      </w:r>
-      <w:proofErr w:type="spellEnd"/>
-      <w:r>
-        <w:t xml:space="preserve"> </w:t>
-      </w:r>
-      <w:proofErr w:type="spellStart"/>
-      <w:r>
-        <w:t>ścieżkę</w:t>
-      </w:r>
-      <w:proofErr w:type="spellEnd"/>
-      <w:r>
-        <w:t xml:space="preserve"> P1 </w:t>
-      </w:r>
-      <w:proofErr w:type="spellStart"/>
-      <w:r>
-        <w:t>algorytmem</w:t>
-      </w:r>
-      <w:proofErr w:type="spellEnd"/>
-      <w:r>
-        <w:t xml:space="preserve"> </w:t>
-      </w:r>
-      <w:proofErr w:type="spellStart"/>
-      <w:r>
-        <w:t>Dijkstry</w:t>
-      </w:r>
-      <w:proofErr w:type="spellEnd"/>
-      <w:r>
-        <w:t xml:space="preserve">, </w:t>
-      </w:r>
-      <w:proofErr w:type="spellStart"/>
-      <w:r>
-        <w:t>usuwa</w:t>
-      </w:r>
-      <w:proofErr w:type="spellEnd"/>
-      <w:r>
-        <w:t xml:space="preserve"> z </w:t>
-      </w:r>
-      <w:proofErr w:type="spellStart"/>
-      <w:r>
-        <w:t>kopii</w:t>
-      </w:r>
-      <w:proofErr w:type="spellEnd"/>
-      <w:r>
-        <w:t xml:space="preserve"> </w:t>
-      </w:r>
-      <w:proofErr w:type="spellStart"/>
-      <w:r>
-        <w:t>grafu</w:t>
-      </w:r>
-      <w:proofErr w:type="spellEnd"/>
-      <w:r>
-        <w:t xml:space="preserve"> </w:t>
-      </w:r>
-      <w:proofErr w:type="spellStart"/>
-      <w:r>
-        <w:t>wszystkie</w:t>
-      </w:r>
-      <w:proofErr w:type="spellEnd"/>
-      <w:r>
-        <w:t xml:space="preserve"> </w:t>
-      </w:r>
-      <w:proofErr w:type="spellStart"/>
-      <w:r>
-        <w:t>łącza</w:t>
-      </w:r>
-      <w:proofErr w:type="spellEnd"/>
-      <w:r>
-        <w:t xml:space="preserve"> </w:t>
-      </w:r>
-      <w:proofErr w:type="spellStart"/>
-      <w:r>
-        <w:t>należące</w:t>
-      </w:r>
-      <w:proofErr w:type="spellEnd"/>
-      <w:r>
-        <w:t xml:space="preserve"> do P1, a </w:t>
-      </w:r>
-      <w:proofErr w:type="spellStart"/>
-      <w:r>
-        <w:t>następnie</w:t>
-      </w:r>
-      <w:proofErr w:type="spellEnd"/>
-      <w:r>
-        <w:t xml:space="preserve"> </w:t>
-      </w:r>
-      <w:proofErr w:type="spellStart"/>
-      <w:r>
-        <w:t>ponownie</w:t>
-      </w:r>
-      <w:proofErr w:type="spellEnd"/>
-      <w:r>
-        <w:t xml:space="preserve"> </w:t>
-      </w:r>
-      <w:proofErr w:type="spellStart"/>
-      <w:r>
-        <w:t>uruchamia</w:t>
-      </w:r>
-      <w:proofErr w:type="spellEnd"/>
-      <w:r>
-        <w:t xml:space="preserve"> </w:t>
-      </w:r>
-      <w:proofErr w:type="spellStart"/>
-      <w:r>
-        <w:t>Dijkstrę</w:t>
-      </w:r>
-      <w:proofErr w:type="spellEnd"/>
-      <w:r>
-        <w:t xml:space="preserve"> w </w:t>
-      </w:r>
-      <w:proofErr w:type="spellStart"/>
-      <w:r>
-        <w:t>celu</w:t>
-      </w:r>
-      <w:proofErr w:type="spellEnd"/>
-      <w:r>
-        <w:t xml:space="preserve"> </w:t>
-      </w:r>
-      <w:proofErr w:type="spellStart"/>
-      <w:r>
-        <w:t>znalezienia</w:t>
-      </w:r>
-      <w:proofErr w:type="spellEnd"/>
-      <w:r>
-        <w:t xml:space="preserve"> P2.</w:t>
+        <w:t>Metoda naiwna wyznacza najkrótszą ścieżkę P1 algorytmem Dijkstry, usuwa z kopii grafu wszystkie łącza należące do P1, a następnie ponownie uruchamia Dijkstrę w celu znalezienia P2.</w:t>
       </w:r>
     </w:p>
     <w:p>
       <w:pPr>
         <w:pStyle w:val="Listanumerowana"/>
       </w:pPr>
-      <w:proofErr w:type="spellStart"/>
       <w:r>
-        <w:t>Utworzyć</w:t>
+        <w:t>Utworzyć kopię grafu wejściowego.</w:t>
       </w:r>
-      <w:proofErr w:type="spellEnd"/>
+    </w:p>
+    <w:p>
+      <w:pPr>
+        <w:pStyle w:val="Listanumerowana"/>
+      </w:pPr>
       <w:r>
-        <w:t xml:space="preserve"> </w:t>
+        <w:t>Wyznaczyć najkrótszą trasę P1 między s i t</w:t>
       </w:r>
-      <w:proofErr w:type="spellStart"/>
       <w:r>
-        <w:t>kopię</w:t>
+        <w:t xml:space="preserve"> na oryginalnym grafie wykorzystując algorytm Dijkstry</w:t>
       </w:r>
-      <w:proofErr w:type="spellEnd"/>
-      <w:r>
-        <w:t xml:space="preserve"> </w:t>
-      </w:r>
-      <w:proofErr w:type="spellStart"/>
-      <w:r>
-        <w:t>grafu</w:t>
-      </w:r>
-      <w:proofErr w:type="spellEnd"/>
-      <w:r>
-        <w:t xml:space="preserve"> </w:t>
-      </w:r>
-      <w:proofErr w:type="spellStart"/>
-      <w:r>
-        <w:t>wejściowego</w:t>
-      </w:r>
-      <w:proofErr w:type="spellEnd"/>
       <w:r>
         <w:t>.</w:t>
       </w:r>
@@ -3492,401 +2767,45 @@
       <w:pPr>
         <w:pStyle w:val="Listanumerowana"/>
       </w:pPr>
-      <w:proofErr w:type="spellStart"/>
       <w:r>
-        <w:t>Wyznaczyć</w:t>
-      </w:r>
-      <w:proofErr w:type="spellEnd"/>
-      <w:r>
-        <w:t xml:space="preserve"> </w:t>
-      </w:r>
-      <w:proofErr w:type="spellStart"/>
-      <w:r>
-        <w:t>najkrótszą</w:t>
-      </w:r>
-      <w:proofErr w:type="spellEnd"/>
-      <w:r>
-        <w:t xml:space="preserve"> </w:t>
-      </w:r>
-      <w:proofErr w:type="spellStart"/>
-      <w:r>
-        <w:t>trasę</w:t>
-      </w:r>
-      <w:proofErr w:type="spellEnd"/>
-      <w:r>
-        <w:t xml:space="preserve"> P1 </w:t>
-      </w:r>
-      <w:proofErr w:type="spellStart"/>
-      <w:r>
-        <w:t>między</w:t>
-      </w:r>
-      <w:proofErr w:type="spellEnd"/>
-      <w:r>
-        <w:t xml:space="preserve"> s </w:t>
-      </w:r>
-      <w:proofErr w:type="spellStart"/>
-      <w:r>
-        <w:t>i</w:t>
-      </w:r>
-      <w:proofErr w:type="spellEnd"/>
-      <w:r>
-        <w:t xml:space="preserve"> t.</w:t>
+        <w:t>Usunąć z roboczej kopii grafu wszystkie krawędzie (łącza), które zostały użyte w trasie P1.</w:t>
       </w:r>
     </w:p>
     <w:p>
       <w:pPr>
         <w:pStyle w:val="Listanumerowana"/>
       </w:pPr>
-      <w:proofErr w:type="spellStart"/>
       <w:r>
-        <w:t>Usunąć</w:t>
-      </w:r>
-      <w:proofErr w:type="spellEnd"/>
-      <w:r>
-        <w:t xml:space="preserve"> z </w:t>
-      </w:r>
-      <w:proofErr w:type="spellStart"/>
-      <w:r>
-        <w:t>kopii</w:t>
-      </w:r>
-      <w:proofErr w:type="spellEnd"/>
-      <w:r>
-        <w:t xml:space="preserve"> </w:t>
-      </w:r>
-      <w:proofErr w:type="spellStart"/>
-      <w:r>
-        <w:t>grafu</w:t>
-      </w:r>
-      <w:proofErr w:type="spellEnd"/>
-      <w:r>
-        <w:t xml:space="preserve"> </w:t>
-      </w:r>
-      <w:proofErr w:type="spellStart"/>
-      <w:r>
-        <w:t>łącza</w:t>
-      </w:r>
-      <w:proofErr w:type="spellEnd"/>
-      <w:r>
-        <w:t xml:space="preserve"> </w:t>
-      </w:r>
-      <w:proofErr w:type="spellStart"/>
-      <w:r>
-        <w:t>użyte</w:t>
-      </w:r>
-      <w:proofErr w:type="spellEnd"/>
-      <w:r>
-        <w:t xml:space="preserve"> w P1.</w:t>
+        <w:t>Wyznaczyć trasę P2 między s i t na zmodyfikowanej kopii grafu, ponownie za pomocą algorytmu Dijkstry.</w:t>
       </w:r>
     </w:p>
     <w:p>
       <w:pPr>
         <w:pStyle w:val="Listanumerowana"/>
       </w:pPr>
-      <w:proofErr w:type="spellStart"/>
       <w:r>
-        <w:t>Wyznaczyć</w:t>
-      </w:r>
-      <w:proofErr w:type="spellEnd"/>
-      <w:r>
-        <w:t xml:space="preserve"> </w:t>
-      </w:r>
-      <w:proofErr w:type="spellStart"/>
-      <w:r>
-        <w:t>trasę</w:t>
-      </w:r>
-      <w:proofErr w:type="spellEnd"/>
-      <w:r>
-        <w:t xml:space="preserve"> P2 w </w:t>
-      </w:r>
-      <w:proofErr w:type="spellStart"/>
-      <w:r>
-        <w:t>grafie</w:t>
-      </w:r>
-      <w:proofErr w:type="spellEnd"/>
-      <w:r>
-        <w:t xml:space="preserve"> po </w:t>
-      </w:r>
-      <w:proofErr w:type="spellStart"/>
-      <w:r>
-        <w:t>usunięciu</w:t>
-      </w:r>
-      <w:proofErr w:type="spellEnd"/>
-      <w:r>
-        <w:t xml:space="preserve"> </w:t>
-      </w:r>
-      <w:proofErr w:type="spellStart"/>
-      <w:r>
-        <w:t>łączy</w:t>
-      </w:r>
-      <w:proofErr w:type="spellEnd"/>
-      <w:r>
-        <w:t>.</w:t>
+        <w:t>Odrzucić żądanie, jeżeli krok 4 zakończył się niepowodzeniem (brak ścieżki).</w:t>
       </w:r>
     </w:p>
     <w:p>
-      <w:pPr>
-        <w:pStyle w:val="Listanumerowana"/>
-      </w:pPr>
-      <w:proofErr w:type="spellStart"/>
-      <w:r>
-        <w:t>Odrzucić</w:t>
-      </w:r>
-      <w:proofErr w:type="spellEnd"/>
-      <w:r>
-        <w:t xml:space="preserve"> </w:t>
-      </w:r>
-      <w:proofErr w:type="spellStart"/>
-      <w:r>
-        <w:t>żądanie</w:t>
-      </w:r>
-      <w:proofErr w:type="spellEnd"/>
-      <w:r>
-        <w:t xml:space="preserve">, </w:t>
-      </w:r>
-      <w:proofErr w:type="spellStart"/>
-      <w:r>
-        <w:t>jeżeli</w:t>
-      </w:r>
-      <w:proofErr w:type="spellEnd"/>
-      <w:r>
-        <w:t xml:space="preserve"> </w:t>
-      </w:r>
-      <w:proofErr w:type="spellStart"/>
-      <w:r>
-        <w:t>nie</w:t>
-      </w:r>
-      <w:proofErr w:type="spellEnd"/>
-      <w:r>
-        <w:t xml:space="preserve"> </w:t>
-      </w:r>
-      <w:proofErr w:type="spellStart"/>
-      <w:r>
-        <w:t>udało</w:t>
-      </w:r>
-      <w:proofErr w:type="spellEnd"/>
-      <w:r>
-        <w:t xml:space="preserve"> </w:t>
-      </w:r>
-      <w:proofErr w:type="spellStart"/>
-      <w:r>
-        <w:t>się</w:t>
-      </w:r>
-      <w:proofErr w:type="spellEnd"/>
-      <w:r>
-        <w:t xml:space="preserve"> </w:t>
-      </w:r>
-      <w:proofErr w:type="spellStart"/>
-      <w:r>
-        <w:t>uzyskać</w:t>
-      </w:r>
-      <w:proofErr w:type="spellEnd"/>
-      <w:r>
-        <w:t xml:space="preserve"> </w:t>
-      </w:r>
-      <w:proofErr w:type="spellStart"/>
-      <w:r>
-        <w:t>dwóch</w:t>
-      </w:r>
-      <w:proofErr w:type="spellEnd"/>
-      <w:r>
-        <w:t xml:space="preserve"> </w:t>
-      </w:r>
-      <w:proofErr w:type="spellStart"/>
-      <w:r>
-        <w:t>tras</w:t>
-      </w:r>
-      <w:proofErr w:type="spellEnd"/>
-      <w:r>
-        <w:t>.</w:t>
-      </w:r>
-    </w:p>
-    <w:p>
-      <w:proofErr w:type="spellStart"/>
       <w:r>
         <w:rPr>
           <w:b/>
           <w:color w:val="1F4E79"/>
         </w:rPr>
-        <w:t>Ograniczenie</w:t>
-      </w:r>
-      <w:proofErr w:type="spellEnd"/>
-      <w:r>
-        <w:rPr>
-          <w:b/>
-          <w:color w:val="1F4E79"/>
-        </w:rPr>
-        <w:t>:</w:t>
+        <w:t>Ograniczenie:</w:t>
       </w:r>
       <w:r>
         <w:t xml:space="preserve"> </w:t>
       </w:r>
-      <w:proofErr w:type="spellStart"/>
       <w:r>
-        <w:t>zachłanny</w:t>
+        <w:t>zachłanny wybór pierwszej trasy (metoda sekwencyjna) może wpaść w pułapkę topologiczną i uniemożliwić znalezienie drugiej rozłącznej trasy, nawet jeśli obiektywnie istnieje w sieci taka para [</w:t>
       </w:r>
-      <w:proofErr w:type="spellEnd"/>
       <w:r>
-        <w:t xml:space="preserve"> </w:t>
+        <w:t>5</w:t>
       </w:r>
-      <w:proofErr w:type="spellStart"/>
       <w:r>
-        <w:t>wybór</w:t>
-      </w:r>
-      <w:proofErr w:type="spellEnd"/>
-      <w:r>
-        <w:t xml:space="preserve"> </w:t>
-      </w:r>
-      <w:proofErr w:type="spellStart"/>
-      <w:r>
-        <w:t>pierwszej</w:t>
-      </w:r>
-      <w:proofErr w:type="spellEnd"/>
-      <w:r>
-        <w:t xml:space="preserve"> </w:t>
-      </w:r>
-      <w:proofErr w:type="spellStart"/>
-      <w:r>
-        <w:t>trasy</w:t>
-      </w:r>
-      <w:proofErr w:type="spellEnd"/>
-      <w:r>
-        <w:t xml:space="preserve"> (</w:t>
-      </w:r>
-      <w:proofErr w:type="spellStart"/>
-      <w:r>
-        <w:t>metoda</w:t>
-      </w:r>
-      <w:proofErr w:type="spellEnd"/>
-      <w:r>
-        <w:t xml:space="preserve"> </w:t>
-      </w:r>
-      <w:proofErr w:type="spellStart"/>
-      <w:r>
-        <w:t>sekwencyjna</w:t>
-      </w:r>
-      <w:proofErr w:type="spellEnd"/>
-      <w:r>
-        <w:t xml:space="preserve">) </w:t>
-      </w:r>
-      <w:proofErr w:type="spellStart"/>
-      <w:r>
-        <w:t>może</w:t>
-      </w:r>
-      <w:proofErr w:type="spellEnd"/>
-      <w:r>
-        <w:t xml:space="preserve"> </w:t>
-      </w:r>
-      <w:proofErr w:type="spellStart"/>
-      <w:r>
-        <w:t>wpaść</w:t>
-      </w:r>
-      <w:proofErr w:type="spellEnd"/>
-      <w:r>
-        <w:t xml:space="preserve"> w </w:t>
-      </w:r>
-      <w:proofErr w:type="spellStart"/>
-      <w:r>
-        <w:t>pułapkę</w:t>
-      </w:r>
-      <w:proofErr w:type="spellEnd"/>
-      <w:r>
-        <w:t xml:space="preserve"> </w:t>
-      </w:r>
-      <w:proofErr w:type="spellStart"/>
-      <w:r>
-        <w:t>topologiczną</w:t>
-      </w:r>
-      <w:proofErr w:type="spellEnd"/>
-      <w:r>
-        <w:t xml:space="preserve"> </w:t>
-      </w:r>
-      <w:proofErr w:type="spellStart"/>
-      <w:r>
-        <w:t>i</w:t>
-      </w:r>
-      <w:proofErr w:type="spellEnd"/>
-      <w:r>
-        <w:t xml:space="preserve"> </w:t>
-      </w:r>
-      <w:proofErr w:type="spellStart"/>
-      <w:r>
-        <w:t>uniemożliwić</w:t>
-      </w:r>
-      <w:proofErr w:type="spellEnd"/>
-      <w:r>
-        <w:t xml:space="preserve"> </w:t>
-      </w:r>
-      <w:proofErr w:type="spellStart"/>
-      <w:r>
-        <w:t>znalezienie</w:t>
-      </w:r>
-      <w:proofErr w:type="spellEnd"/>
-      <w:r>
-        <w:t xml:space="preserve"> </w:t>
-      </w:r>
-      <w:proofErr w:type="spellStart"/>
-      <w:r>
-        <w:t>drugiej</w:t>
-      </w:r>
-      <w:proofErr w:type="spellEnd"/>
-      <w:r>
-        <w:t xml:space="preserve"> </w:t>
-      </w:r>
-      <w:proofErr w:type="spellStart"/>
-      <w:r>
-        <w:t>rozłącznej</w:t>
-      </w:r>
-      <w:proofErr w:type="spellEnd"/>
-      <w:r>
-        <w:t xml:space="preserve"> </w:t>
-      </w:r>
-      <w:proofErr w:type="spellStart"/>
-      <w:r>
-        <w:t>trasy</w:t>
-      </w:r>
-      <w:proofErr w:type="spellEnd"/>
-      <w:r>
-        <w:t xml:space="preserve">, </w:t>
-      </w:r>
-      <w:proofErr w:type="spellStart"/>
-      <w:r>
-        <w:t>nawet</w:t>
-      </w:r>
-      <w:proofErr w:type="spellEnd"/>
-      <w:r>
-        <w:t xml:space="preserve"> </w:t>
-      </w:r>
-      <w:proofErr w:type="spellStart"/>
-      <w:r>
-        <w:t>jeśli</w:t>
-      </w:r>
-      <w:proofErr w:type="spellEnd"/>
-      <w:r>
-        <w:t xml:space="preserve"> </w:t>
-      </w:r>
-      <w:proofErr w:type="spellStart"/>
-      <w:r>
-        <w:t>obiektywnie</w:t>
-      </w:r>
-      <w:proofErr w:type="spellEnd"/>
-      <w:r>
-        <w:t xml:space="preserve"> </w:t>
-      </w:r>
-      <w:proofErr w:type="spellStart"/>
-      <w:r>
-        <w:t>istnieje</w:t>
-      </w:r>
-      <w:proofErr w:type="spellEnd"/>
-      <w:r>
-        <w:t xml:space="preserve"> w </w:t>
-      </w:r>
-      <w:proofErr w:type="spellStart"/>
-      <w:r>
-        <w:t>sieci</w:t>
-      </w:r>
-      <w:proofErr w:type="spellEnd"/>
-      <w:r>
-        <w:t xml:space="preserve"> taka para [8].</w:t>
+        <w:t>].</w:t>
       </w:r>
     </w:p>
     <w:p>
@@ -3899,197 +2818,12 @@
       </w:r>
       <w:r>
         <w:br/>
+        <w:t>Algorytm Suurballe’a</w:t>
       </w:r>
-      <w:proofErr w:type="spellStart"/>
-      <w:r>
-        <w:t>Algorytm</w:t>
-      </w:r>
-      <w:proofErr w:type="spellEnd"/>
-      <w:r>
-        <w:t xml:space="preserve"> </w:t>
-      </w:r>
-      <w:proofErr w:type="spellStart"/>
-      <w:r>
-        <w:t>Suurballe’a</w:t>
-      </w:r>
-      <w:proofErr w:type="spellEnd"/>
     </w:p>
     <w:p>
-      <w:proofErr w:type="spellStart"/>
       <w:r>
-        <w:t>Algorytm</w:t>
-      </w:r>
-      <w:proofErr w:type="spellEnd"/>
-      <w:r>
-        <w:t xml:space="preserve"> </w:t>
-      </w:r>
-      <w:proofErr w:type="spellStart"/>
-      <w:r>
-        <w:t>Suurballe’a</w:t>
-      </w:r>
-      <w:proofErr w:type="spellEnd"/>
-      <w:r>
-        <w:t xml:space="preserve"> </w:t>
-      </w:r>
-      <w:proofErr w:type="spellStart"/>
-      <w:r>
-        <w:t>wyznacza</w:t>
-      </w:r>
-      <w:proofErr w:type="spellEnd"/>
-      <w:r>
-        <w:t xml:space="preserve"> </w:t>
-      </w:r>
-      <w:proofErr w:type="spellStart"/>
-      <w:r>
-        <w:t>parę</w:t>
-      </w:r>
-      <w:proofErr w:type="spellEnd"/>
-      <w:r>
-        <w:t xml:space="preserve"> </w:t>
-      </w:r>
-      <w:proofErr w:type="spellStart"/>
-      <w:r>
-        <w:t>tras</w:t>
-      </w:r>
-      <w:proofErr w:type="spellEnd"/>
-      <w:r>
-        <w:t xml:space="preserve"> </w:t>
-      </w:r>
-      <w:proofErr w:type="spellStart"/>
-      <w:r>
-        <w:t>łączowo</w:t>
-      </w:r>
-      <w:proofErr w:type="spellEnd"/>
-      <w:r>
-        <w:t xml:space="preserve"> </w:t>
-      </w:r>
-      <w:proofErr w:type="spellStart"/>
-      <w:r>
-        <w:t>rozłącznych</w:t>
-      </w:r>
-      <w:proofErr w:type="spellEnd"/>
-      <w:r>
-        <w:t xml:space="preserve"> o </w:t>
-      </w:r>
-      <w:proofErr w:type="spellStart"/>
-      <w:r>
-        <w:t>minimalnym</w:t>
-      </w:r>
-      <w:proofErr w:type="spellEnd"/>
-      <w:r>
-        <w:t xml:space="preserve"> </w:t>
-      </w:r>
-      <w:proofErr w:type="spellStart"/>
-      <w:r>
-        <w:t>łącznym</w:t>
-      </w:r>
-      <w:proofErr w:type="spellEnd"/>
-      <w:r>
-        <w:t xml:space="preserve"> </w:t>
-      </w:r>
-      <w:proofErr w:type="spellStart"/>
-      <w:r>
-        <w:t>koszcie</w:t>
-      </w:r>
-      <w:proofErr w:type="spellEnd"/>
-      <w:r>
-        <w:t xml:space="preserve">. </w:t>
-      </w:r>
-      <w:proofErr w:type="spellStart"/>
-      <w:r>
-        <w:t>Dla</w:t>
-      </w:r>
-      <w:proofErr w:type="spellEnd"/>
-      <w:r>
-        <w:t xml:space="preserve"> </w:t>
-      </w:r>
-      <w:proofErr w:type="spellStart"/>
-      <w:r>
-        <w:t>grafu</w:t>
-      </w:r>
-      <w:proofErr w:type="spellEnd"/>
-      <w:r>
-        <w:t xml:space="preserve"> </w:t>
-      </w:r>
-      <w:proofErr w:type="spellStart"/>
-      <w:r>
-        <w:t>nieskierowanego</w:t>
-      </w:r>
-      <w:proofErr w:type="spellEnd"/>
-      <w:r>
-        <w:t xml:space="preserve"> </w:t>
-      </w:r>
-      <w:proofErr w:type="spellStart"/>
-      <w:r>
-        <w:t>każde</w:t>
-      </w:r>
-      <w:proofErr w:type="spellEnd"/>
-      <w:r>
-        <w:t xml:space="preserve"> </w:t>
-      </w:r>
-      <w:proofErr w:type="spellStart"/>
-      <w:r>
-        <w:t>łącze</w:t>
-      </w:r>
-      <w:proofErr w:type="spellEnd"/>
-      <w:r>
-        <w:t xml:space="preserve"> </w:t>
-      </w:r>
-      <w:proofErr w:type="spellStart"/>
-      <w:r>
-        <w:t>reprezentowane</w:t>
-      </w:r>
-      <w:proofErr w:type="spellEnd"/>
-      <w:r>
-        <w:t xml:space="preserve"> jest </w:t>
-      </w:r>
-      <w:proofErr w:type="spellStart"/>
-      <w:r>
-        <w:t>pomocniczo</w:t>
-      </w:r>
-      <w:proofErr w:type="spellEnd"/>
-      <w:r>
-        <w:t xml:space="preserve"> </w:t>
-      </w:r>
-      <w:proofErr w:type="spellStart"/>
-      <w:r>
-        <w:t>przez</w:t>
-      </w:r>
-      <w:proofErr w:type="spellEnd"/>
-      <w:r>
-        <w:t xml:space="preserve"> </w:t>
-      </w:r>
-      <w:proofErr w:type="spellStart"/>
-      <w:r>
-        <w:t>dwa</w:t>
-      </w:r>
-      <w:proofErr w:type="spellEnd"/>
-      <w:r>
-        <w:t xml:space="preserve"> </w:t>
-      </w:r>
-      <w:proofErr w:type="spellStart"/>
-      <w:r>
-        <w:t>łuki</w:t>
-      </w:r>
-      <w:proofErr w:type="spellEnd"/>
-      <w:r>
-        <w:t xml:space="preserve"> </w:t>
-      </w:r>
-      <w:proofErr w:type="spellStart"/>
-      <w:r>
-        <w:t>przeciwnych</w:t>
-      </w:r>
-      <w:proofErr w:type="spellEnd"/>
-      <w:r>
-        <w:t xml:space="preserve"> </w:t>
-      </w:r>
-      <w:proofErr w:type="spellStart"/>
-      <w:r>
-        <w:t>kierunków</w:t>
-      </w:r>
-      <w:proofErr w:type="spellEnd"/>
-      <w:r>
-        <w:t>.</w:t>
+        <w:t>Algorytm Suurballe’a wyznacza parę tras łączowo rozłącznych o minimalnym łącznym koszcie. Dla grafu nieskierowanego każde łącze reprezentowane jest pomocniczo przez dwa łuki przeciwnych kierunków.</w:t>
       </w:r>
     </w:p>
     <w:p>
@@ -4100,305 +2834,40 @@
           <w:numId w:val="12"/>
         </w:numPr>
       </w:pPr>
-      <w:proofErr w:type="spellStart"/>
       <w:r>
-        <w:t>Wyznaczyć</w:t>
-      </w:r>
-      <w:proofErr w:type="spellEnd"/>
-      <w:r>
-        <w:t xml:space="preserve"> </w:t>
-      </w:r>
-      <w:proofErr w:type="spellStart"/>
-      <w:r>
-        <w:t>najkrótszą</w:t>
-      </w:r>
-      <w:proofErr w:type="spellEnd"/>
-      <w:r>
-        <w:t xml:space="preserve"> </w:t>
-      </w:r>
-      <w:proofErr w:type="spellStart"/>
-      <w:r>
-        <w:t>ścieżkę</w:t>
-      </w:r>
-      <w:proofErr w:type="spellEnd"/>
-      <w:r>
-        <w:t xml:space="preserve"> P1 </w:t>
-      </w:r>
-      <w:proofErr w:type="spellStart"/>
-      <w:r>
-        <w:t>i</w:t>
-      </w:r>
-      <w:proofErr w:type="spellEnd"/>
-      <w:r>
-        <w:t xml:space="preserve"> </w:t>
-      </w:r>
-      <w:proofErr w:type="spellStart"/>
-      <w:r>
-        <w:t>odległości</w:t>
-      </w:r>
-      <w:proofErr w:type="spellEnd"/>
-      <w:r>
-        <w:t xml:space="preserve"> d(v) od </w:t>
-      </w:r>
-      <w:proofErr w:type="spellStart"/>
-      <w:r>
-        <w:t>źródła</w:t>
-      </w:r>
-      <w:proofErr w:type="spellEnd"/>
-      <w:r>
-        <w:t>.</w:t>
+        <w:t>Wyznaczyć najkrótszą ścieżkę P1 i odległości d(v) od źródła.</w:t>
       </w:r>
     </w:p>
     <w:p>
       <w:pPr>
         <w:pStyle w:val="Listanumerowana"/>
       </w:pPr>
-      <w:proofErr w:type="spellStart"/>
       <w:r>
-        <w:t>Przeważyć</w:t>
-      </w:r>
-      <w:proofErr w:type="spellEnd"/>
-      <w:r>
-        <w:t xml:space="preserve"> </w:t>
-      </w:r>
-      <w:proofErr w:type="spellStart"/>
-      <w:r>
-        <w:t>łuki</w:t>
-      </w:r>
-      <w:proofErr w:type="spellEnd"/>
-      <w:r>
-        <w:t xml:space="preserve"> </w:t>
-      </w:r>
-      <w:proofErr w:type="spellStart"/>
-      <w:r>
-        <w:t>wzorem</w:t>
-      </w:r>
-      <w:proofErr w:type="spellEnd"/>
-      <w:r>
-        <w:t xml:space="preserve"> c'(</w:t>
-      </w:r>
-      <w:proofErr w:type="spellStart"/>
-      <w:r>
-        <w:t>u,v</w:t>
-      </w:r>
-      <w:proofErr w:type="spellEnd"/>
-      <w:r>
-        <w:t>)=c(</w:t>
-      </w:r>
-      <w:proofErr w:type="spellStart"/>
-      <w:r>
-        <w:t>u,v</w:t>
-      </w:r>
-      <w:proofErr w:type="spellEnd"/>
-      <w:r>
-        <w:t>)+d(u)-d(v).</w:t>
+        <w:t>Przeważyć łuki wzorem c'(u,v)=c(u,v)+d(u)-d(v).</w:t>
       </w:r>
     </w:p>
     <w:p>
       <w:pPr>
         <w:pStyle w:val="Listanumerowana"/>
       </w:pPr>
-      <w:proofErr w:type="spellStart"/>
       <w:r>
-        <w:t>Usunąć</w:t>
-      </w:r>
-      <w:proofErr w:type="spellEnd"/>
-      <w:r>
-        <w:t xml:space="preserve"> </w:t>
-      </w:r>
-      <w:proofErr w:type="spellStart"/>
-      <w:r>
-        <w:t>łuki</w:t>
-      </w:r>
-      <w:proofErr w:type="spellEnd"/>
-      <w:r>
-        <w:t xml:space="preserve"> P1 w </w:t>
-      </w:r>
-      <w:proofErr w:type="spellStart"/>
-      <w:r>
-        <w:t>kierunku</w:t>
-      </w:r>
-      <w:proofErr w:type="spellEnd"/>
-      <w:r>
-        <w:t xml:space="preserve"> </w:t>
-      </w:r>
-      <w:proofErr w:type="spellStart"/>
-      <w:r>
-        <w:t>s→t</w:t>
-      </w:r>
-      <w:proofErr w:type="spellEnd"/>
-      <w:r>
-        <w:t xml:space="preserve"> </w:t>
-      </w:r>
-      <w:proofErr w:type="spellStart"/>
-      <w:r>
-        <w:t>i</w:t>
-      </w:r>
-      <w:proofErr w:type="spellEnd"/>
-      <w:r>
-        <w:t xml:space="preserve"> </w:t>
-      </w:r>
-      <w:proofErr w:type="spellStart"/>
-      <w:r>
-        <w:t>dodać</w:t>
-      </w:r>
-      <w:proofErr w:type="spellEnd"/>
-      <w:r>
-        <w:t xml:space="preserve"> </w:t>
-      </w:r>
-      <w:proofErr w:type="spellStart"/>
-      <w:r>
-        <w:t>łuki</w:t>
-      </w:r>
-      <w:proofErr w:type="spellEnd"/>
-      <w:r>
-        <w:t xml:space="preserve"> </w:t>
-      </w:r>
-      <w:proofErr w:type="spellStart"/>
-      <w:r>
-        <w:t>odwrotne</w:t>
-      </w:r>
-      <w:proofErr w:type="spellEnd"/>
-      <w:r>
-        <w:t xml:space="preserve"> o </w:t>
-      </w:r>
-      <w:proofErr w:type="spellStart"/>
-      <w:r>
-        <w:t>koszcie</w:t>
-      </w:r>
-      <w:proofErr w:type="spellEnd"/>
-      <w:r>
-        <w:t xml:space="preserve"> 0.</w:t>
+        <w:t>Usunąć łuki P1 w kierunku s→t i dodać łuki odwrotne o koszcie 0.</w:t>
       </w:r>
     </w:p>
     <w:p>
       <w:pPr>
         <w:pStyle w:val="Listanumerowana"/>
       </w:pPr>
-      <w:proofErr w:type="spellStart"/>
       <w:r>
-        <w:t>Wyznaczyć</w:t>
-      </w:r>
-      <w:proofErr w:type="spellEnd"/>
-      <w:r>
-        <w:t xml:space="preserve"> </w:t>
-      </w:r>
-      <w:proofErr w:type="spellStart"/>
-      <w:r>
-        <w:t>drugą</w:t>
-      </w:r>
-      <w:proofErr w:type="spellEnd"/>
-      <w:r>
-        <w:t xml:space="preserve"> </w:t>
-      </w:r>
-      <w:proofErr w:type="spellStart"/>
-      <w:r>
-        <w:t>ścieżkę</w:t>
-      </w:r>
-      <w:proofErr w:type="spellEnd"/>
-      <w:r>
-        <w:t xml:space="preserve"> P2 w </w:t>
-      </w:r>
-      <w:proofErr w:type="spellStart"/>
-      <w:r>
-        <w:t>grafie</w:t>
-      </w:r>
-      <w:proofErr w:type="spellEnd"/>
-      <w:r>
-        <w:t xml:space="preserve"> </w:t>
-      </w:r>
-      <w:proofErr w:type="spellStart"/>
-      <w:r>
-        <w:t>pomocniczym</w:t>
-      </w:r>
-      <w:proofErr w:type="spellEnd"/>
-      <w:r>
-        <w:t>.</w:t>
+        <w:t>Wyznaczyć drugą ścieżkę P2 w grafie pomocniczym.</w:t>
       </w:r>
     </w:p>
     <w:p>
       <w:pPr>
         <w:pStyle w:val="Listanumerowana"/>
       </w:pPr>
-      <w:proofErr w:type="spellStart"/>
       <w:r>
-        <w:t>Usunąć</w:t>
-      </w:r>
-      <w:proofErr w:type="spellEnd"/>
-      <w:r>
-        <w:t xml:space="preserve"> </w:t>
-      </w:r>
-      <w:proofErr w:type="spellStart"/>
-      <w:r>
-        <w:t>przeciwne</w:t>
-      </w:r>
-      <w:proofErr w:type="spellEnd"/>
-      <w:r>
-        <w:t xml:space="preserve"> </w:t>
-      </w:r>
-      <w:proofErr w:type="spellStart"/>
-      <w:r>
-        <w:t>wspólne</w:t>
-      </w:r>
-      <w:proofErr w:type="spellEnd"/>
-      <w:r>
-        <w:t xml:space="preserve"> </w:t>
-      </w:r>
-      <w:proofErr w:type="spellStart"/>
-      <w:r>
-        <w:t>łuki</w:t>
-      </w:r>
-      <w:proofErr w:type="spellEnd"/>
-      <w:r>
-        <w:t xml:space="preserve"> </w:t>
-      </w:r>
-      <w:proofErr w:type="spellStart"/>
-      <w:r>
-        <w:t>i</w:t>
-      </w:r>
-      <w:proofErr w:type="spellEnd"/>
-      <w:r>
-        <w:t xml:space="preserve"> </w:t>
-      </w:r>
-      <w:proofErr w:type="spellStart"/>
-      <w:r>
-        <w:t>rozłożyć</w:t>
-      </w:r>
-      <w:proofErr w:type="spellEnd"/>
-      <w:r>
-        <w:t xml:space="preserve"> </w:t>
-      </w:r>
-      <w:proofErr w:type="spellStart"/>
-      <w:r>
-        <w:t>wynik</w:t>
-      </w:r>
-      <w:proofErr w:type="spellEnd"/>
-      <w:r>
-        <w:t xml:space="preserve"> </w:t>
-      </w:r>
-      <w:proofErr w:type="spellStart"/>
-      <w:r>
-        <w:t>na</w:t>
-      </w:r>
-      <w:proofErr w:type="spellEnd"/>
-      <w:r>
-        <w:t xml:space="preserve"> </w:t>
-      </w:r>
-      <w:proofErr w:type="spellStart"/>
-      <w:r>
-        <w:t>dwie</w:t>
-      </w:r>
-      <w:proofErr w:type="spellEnd"/>
-      <w:r>
-        <w:t xml:space="preserve"> </w:t>
-      </w:r>
-      <w:proofErr w:type="spellStart"/>
-      <w:r>
-        <w:t>trasy</w:t>
-      </w:r>
-      <w:proofErr w:type="spellEnd"/>
-      <w:r>
-        <w:t xml:space="preserve"> s-t.</w:t>
+        <w:t>Usunąć przeciwne wspólne łuki i rozłożyć wynik na dwie trasy s-t.</w:t>
       </w:r>
     </w:p>
     <w:p>
@@ -4412,308 +2881,63 @@
       </w:pPr>
     </w:p>
     <w:p>
-      <w:proofErr w:type="spellStart"/>
       <w:r>
         <w:rPr>
           <w:b/>
           <w:color w:val="1F4E79"/>
         </w:rPr>
-        <w:t>Ograniczenie</w:t>
-      </w:r>
-      <w:proofErr w:type="spellEnd"/>
-      <w:r>
-        <w:rPr>
-          <w:b/>
-          <w:color w:val="1F4E79"/>
-        </w:rPr>
-        <w:t>:</w:t>
+        <w:t>Ograniczenie:</w:t>
       </w:r>
       <w:r>
         <w:t xml:space="preserve"> </w:t>
       </w:r>
-      <w:proofErr w:type="spellStart"/>
       <w:r>
-        <w:t>algorytm</w:t>
-      </w:r>
-      <w:proofErr w:type="spellEnd"/>
-      <w:r>
-        <w:t xml:space="preserve"> </w:t>
-      </w:r>
-      <w:proofErr w:type="spellStart"/>
-      <w:r>
-        <w:t>Suurballe’a</w:t>
-      </w:r>
-      <w:proofErr w:type="spellEnd"/>
-      <w:r>
-        <w:t xml:space="preserve"> </w:t>
+        <w:t xml:space="preserve">algorytm Suurballe’a </w:t>
       </w:r>
       <w:r>
-        <w:t xml:space="preserve">[2,3] </w:t>
-      </w:r>
-      <w:proofErr w:type="spellStart"/>
-      <w:r>
-        <w:t>zakłada</w:t>
-      </w:r>
-      <w:proofErr w:type="spellEnd"/>
-      <w:r>
-        <w:t xml:space="preserve"> </w:t>
-      </w:r>
-      <w:proofErr w:type="spellStart"/>
-      <w:r>
-        <w:t>stosowanie</w:t>
-      </w:r>
-      <w:proofErr w:type="spellEnd"/>
-      <w:r>
-        <w:t xml:space="preserve"> </w:t>
-      </w:r>
-      <w:proofErr w:type="spellStart"/>
-      <w:r>
-        <w:t>tej</w:t>
-      </w:r>
-      <w:proofErr w:type="spellEnd"/>
-      <w:r>
-        <w:t xml:space="preserve"> </w:t>
-      </w:r>
-      <w:proofErr w:type="spellStart"/>
-      <w:r>
-        <w:t>samej</w:t>
-      </w:r>
-      <w:proofErr w:type="spellEnd"/>
-      <w:r>
-        <w:t xml:space="preserve"> </w:t>
-      </w:r>
-      <w:proofErr w:type="spellStart"/>
-      <w:r>
-        <w:t>metryki</w:t>
-      </w:r>
-      <w:proofErr w:type="spellEnd"/>
-      <w:r>
-        <w:t xml:space="preserve"> </w:t>
-      </w:r>
-      <w:proofErr w:type="spellStart"/>
-      <w:r>
-        <w:t>kosztu</w:t>
-      </w:r>
-      <w:proofErr w:type="spellEnd"/>
-      <w:r>
-        <w:t xml:space="preserve"> </w:t>
-      </w:r>
-      <w:proofErr w:type="spellStart"/>
-      <w:r>
-        <w:t>dla</w:t>
-      </w:r>
-      <w:proofErr w:type="spellEnd"/>
-      <w:r>
-        <w:t xml:space="preserve"> </w:t>
-      </w:r>
-      <w:proofErr w:type="spellStart"/>
-      <w:r>
-        <w:t>obu</w:t>
-      </w:r>
-      <w:proofErr w:type="spellEnd"/>
-      <w:r>
-        <w:t xml:space="preserve"> </w:t>
-      </w:r>
-      <w:proofErr w:type="spellStart"/>
-      <w:r>
-        <w:t>tras</w:t>
-      </w:r>
-      <w:proofErr w:type="spellEnd"/>
-      <w:r>
-        <w:t xml:space="preserve">. </w:t>
-      </w:r>
-      <w:proofErr w:type="spellStart"/>
-      <w:r>
-        <w:t>Jeśli</w:t>
-      </w:r>
-      <w:proofErr w:type="spellEnd"/>
-      <w:r>
-        <w:t xml:space="preserve"> </w:t>
-      </w:r>
-      <w:proofErr w:type="spellStart"/>
-      <w:r>
-        <w:t>trasa</w:t>
-      </w:r>
-      <w:proofErr w:type="spellEnd"/>
-      <w:r>
-        <w:t xml:space="preserve"> </w:t>
-      </w:r>
-      <w:proofErr w:type="spellStart"/>
-      <w:r>
-        <w:t>podstawowa</w:t>
-      </w:r>
-      <w:proofErr w:type="spellEnd"/>
-      <w:r>
-        <w:t xml:space="preserve"> </w:t>
-      </w:r>
-      <w:proofErr w:type="spellStart"/>
-      <w:r>
-        <w:t>i</w:t>
-      </w:r>
-      <w:proofErr w:type="spellEnd"/>
-      <w:r>
-        <w:t xml:space="preserve"> </w:t>
-      </w:r>
-      <w:proofErr w:type="spellStart"/>
-      <w:r>
-        <w:t>zabezpieczająca</w:t>
-      </w:r>
-      <w:proofErr w:type="spellEnd"/>
-      <w:r>
-        <w:t xml:space="preserve"> </w:t>
-      </w:r>
-      <w:proofErr w:type="spellStart"/>
-      <w:r>
-        <w:t>powinny</w:t>
-      </w:r>
-      <w:proofErr w:type="spellEnd"/>
-      <w:r>
-        <w:t xml:space="preserve"> </w:t>
-      </w:r>
-      <w:proofErr w:type="spellStart"/>
-      <w:r>
-        <w:t>być</w:t>
-      </w:r>
-      <w:proofErr w:type="spellEnd"/>
-      <w:r>
-        <w:t xml:space="preserve"> </w:t>
-      </w:r>
-      <w:proofErr w:type="spellStart"/>
-      <w:r>
-        <w:t>oceniane</w:t>
-      </w:r>
-      <w:proofErr w:type="spellEnd"/>
-      <w:r>
-        <w:t xml:space="preserve"> </w:t>
-      </w:r>
-      <w:proofErr w:type="spellStart"/>
-      <w:r>
-        <w:t>według</w:t>
-      </w:r>
-      <w:proofErr w:type="spellEnd"/>
-      <w:r>
-        <w:t xml:space="preserve"> </w:t>
-      </w:r>
-      <w:proofErr w:type="spellStart"/>
-      <w:r>
-        <w:t>różnych</w:t>
-      </w:r>
-      <w:proofErr w:type="spellEnd"/>
-      <w:r>
-        <w:t xml:space="preserve"> </w:t>
-      </w:r>
-      <w:proofErr w:type="spellStart"/>
-      <w:r>
-        <w:t>kryteriów</w:t>
-      </w:r>
-      <w:proofErr w:type="spellEnd"/>
-      <w:r>
-        <w:t xml:space="preserve">, problem </w:t>
-      </w:r>
-      <w:proofErr w:type="spellStart"/>
-      <w:r>
-        <w:t>przechodzi</w:t>
-      </w:r>
-      <w:proofErr w:type="spellEnd"/>
-      <w:r>
-        <w:t xml:space="preserve"> w </w:t>
-      </w:r>
-      <w:proofErr w:type="spellStart"/>
-      <w:r>
-        <w:t>przypadek</w:t>
-      </w:r>
-      <w:proofErr w:type="spellEnd"/>
-      <w:r>
-        <w:t xml:space="preserve"> multi-cost, </w:t>
-      </w:r>
-      <w:proofErr w:type="spellStart"/>
-      <w:r>
-        <w:t>który</w:t>
-      </w:r>
-      <w:proofErr w:type="spellEnd"/>
-      <w:r>
-        <w:t xml:space="preserve"> jest </w:t>
-      </w:r>
-      <w:proofErr w:type="spellStart"/>
-      <w:r>
-        <w:t>znacznie</w:t>
-      </w:r>
-      <w:proofErr w:type="spellEnd"/>
-      <w:r>
-        <w:t xml:space="preserve"> </w:t>
-      </w:r>
-      <w:proofErr w:type="spellStart"/>
-      <w:r>
-        <w:t>trudniejszy</w:t>
-      </w:r>
-      <w:proofErr w:type="spellEnd"/>
-      <w:r>
-        <w:t xml:space="preserve"> </w:t>
-      </w:r>
-      <w:proofErr w:type="spellStart"/>
-      <w:r>
-        <w:t>obliczeniowo</w:t>
-      </w:r>
-      <w:proofErr w:type="spellEnd"/>
-      <w:r>
-        <w:t xml:space="preserve"> </w:t>
-      </w:r>
-      <w:proofErr w:type="spellStart"/>
-      <w:r>
-        <w:t>i</w:t>
-      </w:r>
-      <w:proofErr w:type="spellEnd"/>
-      <w:r>
-        <w:t xml:space="preserve"> </w:t>
+        <w:t>[</w:t>
       </w:r>
       <w:r>
-        <w:t xml:space="preserve">z </w:t>
+        <w:t>3</w:t>
       </w:r>
-      <w:proofErr w:type="spellStart"/>
       <w:r>
-        <w:t>dużym</w:t>
+        <w:t>,</w:t>
       </w:r>
-      <w:proofErr w:type="spellEnd"/>
       <w:r>
-        <w:t xml:space="preserve"> </w:t>
+        <w:t>4</w:t>
       </w:r>
-      <w:proofErr w:type="spellStart"/>
       <w:r>
-        <w:t>prawdopodobieńst</w:t>
+        <w:t xml:space="preserve">] </w:t>
+      </w:r>
+      <w:r>
+        <w:t xml:space="preserve">zakłada stosowanie tej samej metryki kosztu dla obu tras. Jeśli trasa podstawowa i zabezpieczająca powinny być oceniane według różnych kryteriów, problem przechodzi w przypadek multi-cost, który jest znacznie trudniejszy obliczeniowo i </w:t>
+      </w:r>
+      <w:r>
+        <w:t>z dużym prawdopodobieńst</w:t>
       </w:r>
       <w:r>
         <w:t>w</w:t>
       </w:r>
       <w:r>
-        <w:t>em</w:t>
+        <w:t xml:space="preserve">em </w:t>
       </w:r>
-      <w:proofErr w:type="spellEnd"/>
       <w:r>
-        <w:t xml:space="preserve"> </w:t>
+        <w:t>może być NP-trudny</w:t>
       </w:r>
-      <w:proofErr w:type="spellStart"/>
       <w:r>
-        <w:t>może</w:t>
+        <w:t xml:space="preserve"> [</w:t>
       </w:r>
-      <w:proofErr w:type="spellEnd"/>
       <w:r>
-        <w:t xml:space="preserve"> </w:t>
+        <w:t>6</w:t>
       </w:r>
-      <w:proofErr w:type="spellStart"/>
       <w:r>
-        <w:t>być</w:t>
+        <w:t>,</w:t>
       </w:r>
-      <w:proofErr w:type="spellEnd"/>
       <w:r>
-        <w:t xml:space="preserve"> NP-</w:t>
+        <w:t>7</w:t>
       </w:r>
-      <w:proofErr w:type="spellStart"/>
       <w:r>
-        <w:t>trudny</w:t>
-      </w:r>
-      <w:proofErr w:type="spellEnd"/>
-      <w:r>
-        <w:t xml:space="preserve"> [1,6].</w:t>
+        <w:t>].</w:t>
       </w:r>
     </w:p>
     <w:p>
@@ -4729,50 +2953,12 @@
       </w:pPr>
       <w:bookmarkStart w:id="2" w:name="_Toc228201681"/>
       <w:r>
-        <w:t xml:space="preserve">3. </w:t>
-      </w:r>
-      <w:proofErr w:type="spellStart"/>
-      <w:r>
-        <w:t>Funkcje</w:t>
-      </w:r>
-      <w:proofErr w:type="spellEnd"/>
-      <w:r>
-        <w:t xml:space="preserve"> </w:t>
-      </w:r>
-      <w:proofErr w:type="spellStart"/>
-      <w:r>
-        <w:t>biblioteki</w:t>
-      </w:r>
-      <w:proofErr w:type="spellEnd"/>
-      <w:r>
-        <w:t xml:space="preserve"> </w:t>
-      </w:r>
-      <w:proofErr w:type="spellStart"/>
-      <w:r>
-        <w:t>NetworkX</w:t>
-      </w:r>
-      <w:proofErr w:type="spellEnd"/>
-      <w:r>
-        <w:t xml:space="preserve"> </w:t>
-      </w:r>
-      <w:proofErr w:type="spellStart"/>
-      <w:r>
-        <w:t>użyte</w:t>
-      </w:r>
-      <w:proofErr w:type="spellEnd"/>
-      <w:r>
-        <w:t xml:space="preserve"> w </w:t>
-      </w:r>
-      <w:proofErr w:type="spellStart"/>
-      <w:r>
-        <w:t>rozwiązaniu</w:t>
+        <w:t>3. Funkcje biblioteki NetworkX użyte w rozwiązaniu</w:t>
       </w:r>
       <w:bookmarkEnd w:id="2"/>
-      <w:proofErr w:type="spellEnd"/>
       <w:r>
         <w:br/>
       </w:r>
-      <w:proofErr w:type="spellStart"/>
       <w:r>
         <w:rPr>
           <w:rFonts w:cstheme="majorHAnsi"/>
@@ -4782,9 +2968,8 @@
           <w:sz w:val="21"/>
           <w:szCs w:val="21"/>
         </w:rPr>
-        <w:t>Wszystkie</w:t>
+        <w:t>Wszystkie operacje na grafach oraz wyznaczanie ścieżek zrealizowano przy wykorzystaniu funkcji wbudowanych w bibliotekę NetworkX [</w:t>
       </w:r>
-      <w:proofErr w:type="spellEnd"/>
       <w:r>
         <w:rPr>
           <w:rFonts w:cstheme="majorHAnsi"/>
@@ -4794,9 +2979,8 @@
           <w:sz w:val="21"/>
           <w:szCs w:val="21"/>
         </w:rPr>
-        <w:t xml:space="preserve"> </w:t>
+        <w:t>8</w:t>
       </w:r>
-      <w:proofErr w:type="spellStart"/>
       <w:r>
         <w:rPr>
           <w:rFonts w:cstheme="majorHAnsi"/>
@@ -4806,307 +2990,7 @@
           <w:sz w:val="21"/>
           <w:szCs w:val="21"/>
         </w:rPr>
-        <w:t>operacje</w:t>
-      </w:r>
-      <w:proofErr w:type="spellEnd"/>
-      <w:r>
-        <w:rPr>
-          <w:rFonts w:cstheme="majorHAnsi"/>
-          <w:b w:val="0"/>
-          <w:bCs w:val="0"/>
-          <w:color w:val="auto"/>
-          <w:sz w:val="21"/>
-          <w:szCs w:val="21"/>
-        </w:rPr>
-        <w:t xml:space="preserve"> </w:t>
-      </w:r>
-      <w:proofErr w:type="spellStart"/>
-      <w:r>
-        <w:rPr>
-          <w:rFonts w:cstheme="majorHAnsi"/>
-          <w:b w:val="0"/>
-          <w:bCs w:val="0"/>
-          <w:color w:val="auto"/>
-          <w:sz w:val="21"/>
-          <w:szCs w:val="21"/>
-        </w:rPr>
-        <w:t>na</w:t>
-      </w:r>
-      <w:proofErr w:type="spellEnd"/>
-      <w:r>
-        <w:rPr>
-          <w:rFonts w:cstheme="majorHAnsi"/>
-          <w:b w:val="0"/>
-          <w:bCs w:val="0"/>
-          <w:color w:val="auto"/>
-          <w:sz w:val="21"/>
-          <w:szCs w:val="21"/>
-        </w:rPr>
-        <w:t xml:space="preserve"> </w:t>
-      </w:r>
-      <w:proofErr w:type="spellStart"/>
-      <w:r>
-        <w:rPr>
-          <w:rFonts w:cstheme="majorHAnsi"/>
-          <w:b w:val="0"/>
-          <w:bCs w:val="0"/>
-          <w:color w:val="auto"/>
-          <w:sz w:val="21"/>
-          <w:szCs w:val="21"/>
-        </w:rPr>
-        <w:t>grafach</w:t>
-      </w:r>
-      <w:proofErr w:type="spellEnd"/>
-      <w:r>
-        <w:rPr>
-          <w:rFonts w:cstheme="majorHAnsi"/>
-          <w:b w:val="0"/>
-          <w:bCs w:val="0"/>
-          <w:color w:val="auto"/>
-          <w:sz w:val="21"/>
-          <w:szCs w:val="21"/>
-        </w:rPr>
-        <w:t xml:space="preserve"> </w:t>
-      </w:r>
-      <w:proofErr w:type="spellStart"/>
-      <w:r>
-        <w:rPr>
-          <w:rFonts w:cstheme="majorHAnsi"/>
-          <w:b w:val="0"/>
-          <w:bCs w:val="0"/>
-          <w:color w:val="auto"/>
-          <w:sz w:val="21"/>
-          <w:szCs w:val="21"/>
-        </w:rPr>
-        <w:t>oraz</w:t>
-      </w:r>
-      <w:proofErr w:type="spellEnd"/>
-      <w:r>
-        <w:rPr>
-          <w:rFonts w:cstheme="majorHAnsi"/>
-          <w:b w:val="0"/>
-          <w:bCs w:val="0"/>
-          <w:color w:val="auto"/>
-          <w:sz w:val="21"/>
-          <w:szCs w:val="21"/>
-        </w:rPr>
-        <w:t xml:space="preserve"> </w:t>
-      </w:r>
-      <w:proofErr w:type="spellStart"/>
-      <w:r>
-        <w:rPr>
-          <w:rFonts w:cstheme="majorHAnsi"/>
-          <w:b w:val="0"/>
-          <w:bCs w:val="0"/>
-          <w:color w:val="auto"/>
-          <w:sz w:val="21"/>
-          <w:szCs w:val="21"/>
-        </w:rPr>
-        <w:t>wyznaczanie</w:t>
-      </w:r>
-      <w:proofErr w:type="spellEnd"/>
-      <w:r>
-        <w:rPr>
-          <w:rFonts w:cstheme="majorHAnsi"/>
-          <w:b w:val="0"/>
-          <w:bCs w:val="0"/>
-          <w:color w:val="auto"/>
-          <w:sz w:val="21"/>
-          <w:szCs w:val="21"/>
-        </w:rPr>
-        <w:t xml:space="preserve"> </w:t>
-      </w:r>
-      <w:proofErr w:type="spellStart"/>
-      <w:r>
-        <w:rPr>
-          <w:rFonts w:cstheme="majorHAnsi"/>
-          <w:b w:val="0"/>
-          <w:bCs w:val="0"/>
-          <w:color w:val="auto"/>
-          <w:sz w:val="21"/>
-          <w:szCs w:val="21"/>
-        </w:rPr>
-        <w:t>ścieżek</w:t>
-      </w:r>
-      <w:proofErr w:type="spellEnd"/>
-      <w:r>
-        <w:rPr>
-          <w:rFonts w:cstheme="majorHAnsi"/>
-          <w:b w:val="0"/>
-          <w:bCs w:val="0"/>
-          <w:color w:val="auto"/>
-          <w:sz w:val="21"/>
-          <w:szCs w:val="21"/>
-        </w:rPr>
-        <w:t xml:space="preserve"> </w:t>
-      </w:r>
-      <w:proofErr w:type="spellStart"/>
-      <w:r>
-        <w:rPr>
-          <w:rFonts w:cstheme="majorHAnsi"/>
-          <w:b w:val="0"/>
-          <w:bCs w:val="0"/>
-          <w:color w:val="auto"/>
-          <w:sz w:val="21"/>
-          <w:szCs w:val="21"/>
-        </w:rPr>
-        <w:t>zrealizowano</w:t>
-      </w:r>
-      <w:proofErr w:type="spellEnd"/>
-      <w:r>
-        <w:rPr>
-          <w:rFonts w:cstheme="majorHAnsi"/>
-          <w:b w:val="0"/>
-          <w:bCs w:val="0"/>
-          <w:color w:val="auto"/>
-          <w:sz w:val="21"/>
-          <w:szCs w:val="21"/>
-        </w:rPr>
-        <w:t xml:space="preserve"> </w:t>
-      </w:r>
-      <w:proofErr w:type="spellStart"/>
-      <w:r>
-        <w:rPr>
-          <w:rFonts w:cstheme="majorHAnsi"/>
-          <w:b w:val="0"/>
-          <w:bCs w:val="0"/>
-          <w:color w:val="auto"/>
-          <w:sz w:val="21"/>
-          <w:szCs w:val="21"/>
-        </w:rPr>
-        <w:t>przy</w:t>
-      </w:r>
-      <w:proofErr w:type="spellEnd"/>
-      <w:r>
-        <w:rPr>
-          <w:rFonts w:cstheme="majorHAnsi"/>
-          <w:b w:val="0"/>
-          <w:bCs w:val="0"/>
-          <w:color w:val="auto"/>
-          <w:sz w:val="21"/>
-          <w:szCs w:val="21"/>
-        </w:rPr>
-        <w:t xml:space="preserve"> </w:t>
-      </w:r>
-      <w:proofErr w:type="spellStart"/>
-      <w:r>
-        <w:rPr>
-          <w:rFonts w:cstheme="majorHAnsi"/>
-          <w:b w:val="0"/>
-          <w:bCs w:val="0"/>
-          <w:color w:val="auto"/>
-          <w:sz w:val="21"/>
-          <w:szCs w:val="21"/>
-        </w:rPr>
-        <w:t>wykorzystaniu</w:t>
-      </w:r>
-      <w:proofErr w:type="spellEnd"/>
-      <w:r>
-        <w:rPr>
-          <w:rFonts w:cstheme="majorHAnsi"/>
-          <w:b w:val="0"/>
-          <w:bCs w:val="0"/>
-          <w:color w:val="auto"/>
-          <w:sz w:val="21"/>
-          <w:szCs w:val="21"/>
-        </w:rPr>
-        <w:t xml:space="preserve"> </w:t>
-      </w:r>
-      <w:proofErr w:type="spellStart"/>
-      <w:r>
-        <w:rPr>
-          <w:rFonts w:cstheme="majorHAnsi"/>
-          <w:b w:val="0"/>
-          <w:bCs w:val="0"/>
-          <w:color w:val="auto"/>
-          <w:sz w:val="21"/>
-          <w:szCs w:val="21"/>
-        </w:rPr>
-        <w:t>funkcji</w:t>
-      </w:r>
-      <w:proofErr w:type="spellEnd"/>
-      <w:r>
-        <w:rPr>
-          <w:rFonts w:cstheme="majorHAnsi"/>
-          <w:b w:val="0"/>
-          <w:bCs w:val="0"/>
-          <w:color w:val="auto"/>
-          <w:sz w:val="21"/>
-          <w:szCs w:val="21"/>
-        </w:rPr>
-        <w:t xml:space="preserve"> </w:t>
-      </w:r>
-      <w:proofErr w:type="spellStart"/>
-      <w:r>
-        <w:rPr>
-          <w:rFonts w:cstheme="majorHAnsi"/>
-          <w:b w:val="0"/>
-          <w:bCs w:val="0"/>
-          <w:color w:val="auto"/>
-          <w:sz w:val="21"/>
-          <w:szCs w:val="21"/>
-        </w:rPr>
-        <w:t>wbudowanych</w:t>
-      </w:r>
-      <w:proofErr w:type="spellEnd"/>
-      <w:r>
-        <w:rPr>
-          <w:rFonts w:cstheme="majorHAnsi"/>
-          <w:b w:val="0"/>
-          <w:bCs w:val="0"/>
-          <w:color w:val="auto"/>
-          <w:sz w:val="21"/>
-          <w:szCs w:val="21"/>
-        </w:rPr>
-        <w:t xml:space="preserve"> w </w:t>
-      </w:r>
-      <w:proofErr w:type="spellStart"/>
-      <w:r>
-        <w:rPr>
-          <w:rFonts w:cstheme="majorHAnsi"/>
-          <w:b w:val="0"/>
-          <w:bCs w:val="0"/>
-          <w:color w:val="auto"/>
-          <w:sz w:val="21"/>
-          <w:szCs w:val="21"/>
-        </w:rPr>
-        <w:t>bibliotekę</w:t>
-      </w:r>
-      <w:proofErr w:type="spellEnd"/>
-      <w:r>
-        <w:rPr>
-          <w:rFonts w:cstheme="majorHAnsi"/>
-          <w:b w:val="0"/>
-          <w:bCs w:val="0"/>
-          <w:color w:val="auto"/>
-          <w:sz w:val="21"/>
-          <w:szCs w:val="21"/>
-        </w:rPr>
-        <w:t xml:space="preserve"> </w:t>
-      </w:r>
-      <w:proofErr w:type="spellStart"/>
-      <w:r>
-        <w:rPr>
-          <w:rFonts w:cstheme="majorHAnsi"/>
-          <w:b w:val="0"/>
-          <w:bCs w:val="0"/>
-          <w:color w:val="auto"/>
-          <w:sz w:val="21"/>
-          <w:szCs w:val="21"/>
-        </w:rPr>
-        <w:t>NetworkX</w:t>
-      </w:r>
-      <w:proofErr w:type="spellEnd"/>
-      <w:r>
-        <w:rPr>
-          <w:rFonts w:cstheme="majorHAnsi"/>
-          <w:b w:val="0"/>
-          <w:bCs w:val="0"/>
-          <w:color w:val="auto"/>
-          <w:sz w:val="21"/>
-          <w:szCs w:val="21"/>
-        </w:rPr>
-        <w:t xml:space="preserve"> [5].</w:t>
+        <w:t>].</w:t>
       </w:r>
     </w:p>
     <w:tbl>
@@ -5133,7 +3017,6 @@
             <w:pPr>
               <w:spacing w:after="0"/>
             </w:pPr>
-            <w:proofErr w:type="spellStart"/>
             <w:r>
               <w:rPr>
                 <w:b/>
@@ -5142,7 +3025,6 @@
               </w:rPr>
               <w:t>Funkcja</w:t>
             </w:r>
-            <w:proofErr w:type="spellEnd"/>
           </w:p>
         </w:tc>
         <w:tc>
@@ -5155,7 +3037,6 @@
             <w:pPr>
               <w:spacing w:after="0"/>
             </w:pPr>
-            <w:proofErr w:type="spellStart"/>
             <w:r>
               <w:rPr>
                 <w:b/>
@@ -5164,7 +3045,6 @@
               </w:rPr>
               <w:t>Zastosowanie</w:t>
             </w:r>
-            <w:proofErr w:type="spellEnd"/>
           </w:p>
         </w:tc>
       </w:tr>
@@ -5179,19 +3059,11 @@
             <w:pPr>
               <w:spacing w:after="0"/>
             </w:pPr>
-            <w:proofErr w:type="spellStart"/>
             <w:r>
               <w:rPr>
                 <w:sz w:val="17"/>
               </w:rPr>
-              <w:t>nx.Graph</w:t>
-            </w:r>
-            <w:proofErr w:type="spellEnd"/>
-            <w:r>
-              <w:rPr>
-                <w:sz w:val="17"/>
-              </w:rPr>
-              <w:t>()</w:t>
+              <w:t>nx.Graph()</w:t>
             </w:r>
           </w:p>
         </w:tc>
@@ -5205,42 +3077,12 @@
             <w:pPr>
               <w:spacing w:after="0"/>
             </w:pPr>
-            <w:proofErr w:type="spellStart"/>
             <w:r>
               <w:rPr>
                 <w:sz w:val="17"/>
               </w:rPr>
-              <w:t>utworzenie</w:t>
+              <w:t>utworzenie grafu nieskierowanego</w:t>
             </w:r>
-            <w:proofErr w:type="spellEnd"/>
-            <w:r>
-              <w:rPr>
-                <w:sz w:val="17"/>
-              </w:rPr>
-              <w:t xml:space="preserve"> </w:t>
-            </w:r>
-            <w:proofErr w:type="spellStart"/>
-            <w:r>
-              <w:rPr>
-                <w:sz w:val="17"/>
-              </w:rPr>
-              <w:t>grafu</w:t>
-            </w:r>
-            <w:proofErr w:type="spellEnd"/>
-            <w:r>
-              <w:rPr>
-                <w:sz w:val="17"/>
-              </w:rPr>
-              <w:t xml:space="preserve"> </w:t>
-            </w:r>
-            <w:proofErr w:type="spellStart"/>
-            <w:r>
-              <w:rPr>
-                <w:sz w:val="17"/>
-              </w:rPr>
-              <w:t>nieskierowanego</w:t>
-            </w:r>
-            <w:proofErr w:type="spellEnd"/>
           </w:p>
         </w:tc>
       </w:tr>
@@ -5254,19 +3096,11 @@
             <w:pPr>
               <w:spacing w:after="0"/>
             </w:pPr>
-            <w:proofErr w:type="spellStart"/>
             <w:r>
               <w:rPr>
                 <w:sz w:val="17"/>
               </w:rPr>
-              <w:t>Graph.add_nodes_from</w:t>
-            </w:r>
-            <w:proofErr w:type="spellEnd"/>
-            <w:r>
-              <w:rPr>
-                <w:sz w:val="17"/>
-              </w:rPr>
-              <w:t>()</w:t>
+              <w:t>Graph.add_nodes_from()</w:t>
             </w:r>
           </w:p>
         </w:tc>
@@ -5279,42 +3113,12 @@
             <w:pPr>
               <w:spacing w:after="0"/>
             </w:pPr>
-            <w:proofErr w:type="spellStart"/>
             <w:r>
               <w:rPr>
                 <w:sz w:val="17"/>
               </w:rPr>
-              <w:t>dodanie</w:t>
+              <w:t>dodanie węzłów topologii</w:t>
             </w:r>
-            <w:proofErr w:type="spellEnd"/>
-            <w:r>
-              <w:rPr>
-                <w:sz w:val="17"/>
-              </w:rPr>
-              <w:t xml:space="preserve"> </w:t>
-            </w:r>
-            <w:proofErr w:type="spellStart"/>
-            <w:r>
-              <w:rPr>
-                <w:sz w:val="17"/>
-              </w:rPr>
-              <w:t>węzłów</w:t>
-            </w:r>
-            <w:proofErr w:type="spellEnd"/>
-            <w:r>
-              <w:rPr>
-                <w:sz w:val="17"/>
-              </w:rPr>
-              <w:t xml:space="preserve"> </w:t>
-            </w:r>
-            <w:proofErr w:type="spellStart"/>
-            <w:r>
-              <w:rPr>
-                <w:sz w:val="17"/>
-              </w:rPr>
-              <w:t>topologii</w:t>
-            </w:r>
-            <w:proofErr w:type="spellEnd"/>
           </w:p>
         </w:tc>
       </w:tr>
@@ -5329,19 +3133,11 @@
             <w:pPr>
               <w:spacing w:after="0"/>
             </w:pPr>
-            <w:proofErr w:type="spellStart"/>
             <w:r>
               <w:rPr>
                 <w:sz w:val="17"/>
               </w:rPr>
-              <w:t>Graph.add_edges_from</w:t>
-            </w:r>
-            <w:proofErr w:type="spellEnd"/>
-            <w:r>
-              <w:rPr>
-                <w:sz w:val="17"/>
-              </w:rPr>
-              <w:t>()</w:t>
+              <w:t>Graph.add_edges_from()</w:t>
             </w:r>
           </w:p>
         </w:tc>
@@ -5355,56 +3151,12 @@
             <w:pPr>
               <w:spacing w:after="0"/>
             </w:pPr>
-            <w:proofErr w:type="spellStart"/>
             <w:r>
               <w:rPr>
                 <w:sz w:val="17"/>
               </w:rPr>
-              <w:t>dodanie</w:t>
+              <w:t>dodanie łączy z wagą jednostkową</w:t>
             </w:r>
-            <w:proofErr w:type="spellEnd"/>
-            <w:r>
-              <w:rPr>
-                <w:sz w:val="17"/>
-              </w:rPr>
-              <w:t xml:space="preserve"> </w:t>
-            </w:r>
-            <w:proofErr w:type="spellStart"/>
-            <w:r>
-              <w:rPr>
-                <w:sz w:val="17"/>
-              </w:rPr>
-              <w:t>łączy</w:t>
-            </w:r>
-            <w:proofErr w:type="spellEnd"/>
-            <w:r>
-              <w:rPr>
-                <w:sz w:val="17"/>
-              </w:rPr>
-              <w:t xml:space="preserve"> z </w:t>
-            </w:r>
-            <w:proofErr w:type="spellStart"/>
-            <w:r>
-              <w:rPr>
-                <w:sz w:val="17"/>
-              </w:rPr>
-              <w:t>wagą</w:t>
-            </w:r>
-            <w:proofErr w:type="spellEnd"/>
-            <w:r>
-              <w:rPr>
-                <w:sz w:val="17"/>
-              </w:rPr>
-              <w:t xml:space="preserve"> </w:t>
-            </w:r>
-            <w:proofErr w:type="spellStart"/>
-            <w:r>
-              <w:rPr>
-                <w:sz w:val="17"/>
-              </w:rPr>
-              <w:t>jednostkową</w:t>
-            </w:r>
-            <w:proofErr w:type="spellEnd"/>
           </w:p>
         </w:tc>
       </w:tr>
@@ -5418,19 +3170,11 @@
             <w:pPr>
               <w:spacing w:after="0"/>
             </w:pPr>
-            <w:proofErr w:type="spellStart"/>
             <w:r>
               <w:rPr>
                 <w:sz w:val="17"/>
               </w:rPr>
-              <w:t>nx.dijkstra_path</w:t>
-            </w:r>
-            <w:proofErr w:type="spellEnd"/>
-            <w:r>
-              <w:rPr>
-                <w:sz w:val="17"/>
-              </w:rPr>
-              <w:t>()</w:t>
+              <w:t>nx.dijkstra_path()</w:t>
             </w:r>
           </w:p>
         </w:tc>
@@ -5443,42 +3187,12 @@
             <w:pPr>
               <w:spacing w:after="0"/>
             </w:pPr>
-            <w:proofErr w:type="spellStart"/>
             <w:r>
               <w:rPr>
                 <w:sz w:val="17"/>
               </w:rPr>
-              <w:t>wyznaczanie</w:t>
+              <w:t>wyznaczanie najkrótszych ścieżek</w:t>
             </w:r>
-            <w:proofErr w:type="spellEnd"/>
-            <w:r>
-              <w:rPr>
-                <w:sz w:val="17"/>
-              </w:rPr>
-              <w:t xml:space="preserve"> </w:t>
-            </w:r>
-            <w:proofErr w:type="spellStart"/>
-            <w:r>
-              <w:rPr>
-                <w:sz w:val="17"/>
-              </w:rPr>
-              <w:t>najkrótszych</w:t>
-            </w:r>
-            <w:proofErr w:type="spellEnd"/>
-            <w:r>
-              <w:rPr>
-                <w:sz w:val="17"/>
-              </w:rPr>
-              <w:t xml:space="preserve"> </w:t>
-            </w:r>
-            <w:proofErr w:type="spellStart"/>
-            <w:r>
-              <w:rPr>
-                <w:sz w:val="17"/>
-              </w:rPr>
-              <w:t>ścieżek</w:t>
-            </w:r>
-            <w:proofErr w:type="spellEnd"/>
           </w:p>
         </w:tc>
       </w:tr>
@@ -5493,19 +3207,11 @@
             <w:pPr>
               <w:spacing w:after="0"/>
             </w:pPr>
-            <w:proofErr w:type="spellStart"/>
             <w:r>
               <w:rPr>
                 <w:sz w:val="17"/>
               </w:rPr>
-              <w:t>nx.single_source_dijkstra_path_length</w:t>
-            </w:r>
-            <w:proofErr w:type="spellEnd"/>
-            <w:r>
-              <w:rPr>
-                <w:sz w:val="17"/>
-              </w:rPr>
-              <w:t>()</w:t>
+              <w:t>nx.single_source_dijkstra_path_length()</w:t>
             </w:r>
           </w:p>
         </w:tc>
@@ -5519,42 +3225,12 @@
             <w:pPr>
               <w:spacing w:after="0"/>
             </w:pPr>
-            <w:proofErr w:type="spellStart"/>
             <w:r>
               <w:rPr>
                 <w:sz w:val="17"/>
               </w:rPr>
-              <w:t>odległości</w:t>
+              <w:t>odległości d(v) użyte w Suurballe’u</w:t>
             </w:r>
-            <w:proofErr w:type="spellEnd"/>
-            <w:r>
-              <w:rPr>
-                <w:sz w:val="17"/>
-              </w:rPr>
-              <w:t xml:space="preserve"> d(v) </w:t>
-            </w:r>
-            <w:proofErr w:type="spellStart"/>
-            <w:r>
-              <w:rPr>
-                <w:sz w:val="17"/>
-              </w:rPr>
-              <w:t>użyte</w:t>
-            </w:r>
-            <w:proofErr w:type="spellEnd"/>
-            <w:r>
-              <w:rPr>
-                <w:sz w:val="17"/>
-              </w:rPr>
-              <w:t xml:space="preserve"> w </w:t>
-            </w:r>
-            <w:proofErr w:type="spellStart"/>
-            <w:r>
-              <w:rPr>
-                <w:sz w:val="17"/>
-              </w:rPr>
-              <w:t>Suurballe’u</w:t>
-            </w:r>
-            <w:proofErr w:type="spellEnd"/>
           </w:p>
         </w:tc>
       </w:tr>
@@ -5568,19 +3244,11 @@
             <w:pPr>
               <w:spacing w:after="0"/>
             </w:pPr>
-            <w:proofErr w:type="spellStart"/>
             <w:r>
               <w:rPr>
                 <w:sz w:val="17"/>
               </w:rPr>
-              <w:t>Graph.copy</w:t>
-            </w:r>
-            <w:proofErr w:type="spellEnd"/>
-            <w:r>
-              <w:rPr>
-                <w:sz w:val="17"/>
-              </w:rPr>
-              <w:t>()</w:t>
+              <w:t>Graph.copy()</w:t>
             </w:r>
           </w:p>
         </w:tc>
@@ -5593,84 +3261,12 @@
             <w:pPr>
               <w:spacing w:after="0"/>
             </w:pPr>
-            <w:proofErr w:type="spellStart"/>
             <w:r>
               <w:rPr>
                 <w:sz w:val="17"/>
               </w:rPr>
-              <w:t>modyfikacja</w:t>
+              <w:t>modyfikacja kopii grafu bez naruszania topologii bazowej</w:t>
             </w:r>
-            <w:proofErr w:type="spellEnd"/>
-            <w:r>
-              <w:rPr>
-                <w:sz w:val="17"/>
-              </w:rPr>
-              <w:t xml:space="preserve"> </w:t>
-            </w:r>
-            <w:proofErr w:type="spellStart"/>
-            <w:r>
-              <w:rPr>
-                <w:sz w:val="17"/>
-              </w:rPr>
-              <w:t>kopii</w:t>
-            </w:r>
-            <w:proofErr w:type="spellEnd"/>
-            <w:r>
-              <w:rPr>
-                <w:sz w:val="17"/>
-              </w:rPr>
-              <w:t xml:space="preserve"> </w:t>
-            </w:r>
-            <w:proofErr w:type="spellStart"/>
-            <w:r>
-              <w:rPr>
-                <w:sz w:val="17"/>
-              </w:rPr>
-              <w:t>grafu</w:t>
-            </w:r>
-            <w:proofErr w:type="spellEnd"/>
-            <w:r>
-              <w:rPr>
-                <w:sz w:val="17"/>
-              </w:rPr>
-              <w:t xml:space="preserve"> bez </w:t>
-            </w:r>
-            <w:proofErr w:type="spellStart"/>
-            <w:r>
-              <w:rPr>
-                <w:sz w:val="17"/>
-              </w:rPr>
-              <w:t>naruszania</w:t>
-            </w:r>
-            <w:proofErr w:type="spellEnd"/>
-            <w:r>
-              <w:rPr>
-                <w:sz w:val="17"/>
-              </w:rPr>
-              <w:t xml:space="preserve"> </w:t>
-            </w:r>
-            <w:proofErr w:type="spellStart"/>
-            <w:r>
-              <w:rPr>
-                <w:sz w:val="17"/>
-              </w:rPr>
-              <w:t>topologii</w:t>
-            </w:r>
-            <w:proofErr w:type="spellEnd"/>
-            <w:r>
-              <w:rPr>
-                <w:sz w:val="17"/>
-              </w:rPr>
-              <w:t xml:space="preserve"> </w:t>
-            </w:r>
-            <w:proofErr w:type="spellStart"/>
-            <w:r>
-              <w:rPr>
-                <w:sz w:val="17"/>
-              </w:rPr>
-              <w:t>bazowej</w:t>
-            </w:r>
-            <w:proofErr w:type="spellEnd"/>
           </w:p>
         </w:tc>
       </w:tr>
@@ -5685,19 +3281,11 @@
             <w:pPr>
               <w:spacing w:after="0"/>
             </w:pPr>
-            <w:proofErr w:type="spellStart"/>
             <w:r>
               <w:rPr>
                 <w:sz w:val="17"/>
               </w:rPr>
-              <w:t>Graph.remove_edges_from</w:t>
-            </w:r>
-            <w:proofErr w:type="spellEnd"/>
-            <w:r>
-              <w:rPr>
-                <w:sz w:val="17"/>
-              </w:rPr>
-              <w:t>()</w:t>
+              <w:t>Graph.remove_edges_from()</w:t>
             </w:r>
           </w:p>
         </w:tc>
@@ -5711,56 +3299,12 @@
             <w:pPr>
               <w:spacing w:after="0"/>
             </w:pPr>
-            <w:proofErr w:type="spellStart"/>
             <w:r>
               <w:rPr>
                 <w:sz w:val="17"/>
               </w:rPr>
-              <w:t>usuwanie</w:t>
+              <w:t>usuwanie łączy w metodzie naiwnej</w:t>
             </w:r>
-            <w:proofErr w:type="spellEnd"/>
-            <w:r>
-              <w:rPr>
-                <w:sz w:val="17"/>
-              </w:rPr>
-              <w:t xml:space="preserve"> </w:t>
-            </w:r>
-            <w:proofErr w:type="spellStart"/>
-            <w:r>
-              <w:rPr>
-                <w:sz w:val="17"/>
-              </w:rPr>
-              <w:t>łączy</w:t>
-            </w:r>
-            <w:proofErr w:type="spellEnd"/>
-            <w:r>
-              <w:rPr>
-                <w:sz w:val="17"/>
-              </w:rPr>
-              <w:t xml:space="preserve"> w </w:t>
-            </w:r>
-            <w:proofErr w:type="spellStart"/>
-            <w:r>
-              <w:rPr>
-                <w:sz w:val="17"/>
-              </w:rPr>
-              <w:t>metodzie</w:t>
-            </w:r>
-            <w:proofErr w:type="spellEnd"/>
-            <w:r>
-              <w:rPr>
-                <w:sz w:val="17"/>
-              </w:rPr>
-              <w:t xml:space="preserve"> </w:t>
-            </w:r>
-            <w:proofErr w:type="spellStart"/>
-            <w:r>
-              <w:rPr>
-                <w:sz w:val="17"/>
-              </w:rPr>
-              <w:t>naiwnej</w:t>
-            </w:r>
-            <w:proofErr w:type="spellEnd"/>
           </w:p>
         </w:tc>
       </w:tr>
@@ -5774,19 +3318,11 @@
             <w:pPr>
               <w:spacing w:after="0"/>
             </w:pPr>
-            <w:proofErr w:type="spellStart"/>
             <w:r>
               <w:rPr>
                 <w:sz w:val="17"/>
               </w:rPr>
-              <w:t>nx.min_cost_flow</w:t>
-            </w:r>
-            <w:proofErr w:type="spellEnd"/>
-            <w:r>
-              <w:rPr>
-                <w:sz w:val="17"/>
-              </w:rPr>
-              <w:t>()</w:t>
+              <w:t>nx.min_cost_flow()</w:t>
             </w:r>
           </w:p>
         </w:tc>
@@ -5799,56 +3335,12 @@
             <w:pPr>
               <w:spacing w:after="0"/>
             </w:pPr>
-            <w:proofErr w:type="spellStart"/>
             <w:r>
               <w:rPr>
                 <w:sz w:val="17"/>
               </w:rPr>
-              <w:t>niezależna</w:t>
+              <w:t>niezależna walidacja kosztu par tras</w:t>
             </w:r>
-            <w:proofErr w:type="spellEnd"/>
-            <w:r>
-              <w:rPr>
-                <w:sz w:val="17"/>
-              </w:rPr>
-              <w:t xml:space="preserve"> </w:t>
-            </w:r>
-            <w:proofErr w:type="spellStart"/>
-            <w:r>
-              <w:rPr>
-                <w:sz w:val="17"/>
-              </w:rPr>
-              <w:t>walidacja</w:t>
-            </w:r>
-            <w:proofErr w:type="spellEnd"/>
-            <w:r>
-              <w:rPr>
-                <w:sz w:val="17"/>
-              </w:rPr>
-              <w:t xml:space="preserve"> </w:t>
-            </w:r>
-            <w:proofErr w:type="spellStart"/>
-            <w:r>
-              <w:rPr>
-                <w:sz w:val="17"/>
-              </w:rPr>
-              <w:t>kosztu</w:t>
-            </w:r>
-            <w:proofErr w:type="spellEnd"/>
-            <w:r>
-              <w:rPr>
-                <w:sz w:val="17"/>
-              </w:rPr>
-              <w:t xml:space="preserve"> par </w:t>
-            </w:r>
-            <w:proofErr w:type="spellStart"/>
-            <w:r>
-              <w:rPr>
-                <w:sz w:val="17"/>
-              </w:rPr>
-              <w:t>tras</w:t>
-            </w:r>
-            <w:proofErr w:type="spellEnd"/>
           </w:p>
         </w:tc>
       </w:tr>
@@ -5863,19 +3355,11 @@
             <w:pPr>
               <w:spacing w:after="0"/>
             </w:pPr>
-            <w:proofErr w:type="spellStart"/>
             <w:r>
               <w:rPr>
                 <w:sz w:val="17"/>
               </w:rPr>
-              <w:t>nx.edge_connectivity</w:t>
-            </w:r>
-            <w:proofErr w:type="spellEnd"/>
-            <w:r>
-              <w:rPr>
-                <w:sz w:val="17"/>
-              </w:rPr>
-              <w:t>()</w:t>
+              <w:t>nx.edge_connectivity()</w:t>
             </w:r>
           </w:p>
         </w:tc>
@@ -5889,56 +3373,12 @@
             <w:pPr>
               <w:spacing w:after="0"/>
             </w:pPr>
-            <w:proofErr w:type="spellStart"/>
             <w:r>
               <w:rPr>
                 <w:sz w:val="17"/>
               </w:rPr>
-              <w:t>opis</w:t>
+              <w:t>opis spójności krawędziowej topologii</w:t>
             </w:r>
-            <w:proofErr w:type="spellEnd"/>
-            <w:r>
-              <w:rPr>
-                <w:sz w:val="17"/>
-              </w:rPr>
-              <w:t xml:space="preserve"> </w:t>
-            </w:r>
-            <w:proofErr w:type="spellStart"/>
-            <w:r>
-              <w:rPr>
-                <w:sz w:val="17"/>
-              </w:rPr>
-              <w:t>spójności</w:t>
-            </w:r>
-            <w:proofErr w:type="spellEnd"/>
-            <w:r>
-              <w:rPr>
-                <w:sz w:val="17"/>
-              </w:rPr>
-              <w:t xml:space="preserve"> </w:t>
-            </w:r>
-            <w:proofErr w:type="spellStart"/>
-            <w:r>
-              <w:rPr>
-                <w:sz w:val="17"/>
-              </w:rPr>
-              <w:t>krawędziowej</w:t>
-            </w:r>
-            <w:proofErr w:type="spellEnd"/>
-            <w:r>
-              <w:rPr>
-                <w:sz w:val="17"/>
-              </w:rPr>
-              <w:t xml:space="preserve"> </w:t>
-            </w:r>
-            <w:proofErr w:type="spellStart"/>
-            <w:r>
-              <w:rPr>
-                <w:sz w:val="17"/>
-              </w:rPr>
-              <w:t>topologii</w:t>
-            </w:r>
-            <w:proofErr w:type="spellEnd"/>
           </w:p>
         </w:tc>
       </w:tr>
@@ -5956,28 +3396,10 @@
         <w:t xml:space="preserve">. </w:t>
       </w:r>
       <w:bookmarkStart w:id="4" w:name="_Toc228201682"/>
-      <w:proofErr w:type="spellStart"/>
       <w:r>
-        <w:t>Główne</w:t>
-      </w:r>
-      <w:proofErr w:type="spellEnd"/>
-      <w:r>
-        <w:t xml:space="preserve"> </w:t>
-      </w:r>
-      <w:proofErr w:type="spellStart"/>
-      <w:r>
-        <w:t>pozycje</w:t>
-      </w:r>
-      <w:proofErr w:type="spellEnd"/>
-      <w:r>
-        <w:t xml:space="preserve"> </w:t>
-      </w:r>
-      <w:proofErr w:type="spellStart"/>
-      <w:r>
-        <w:t>literatury</w:t>
+        <w:t>Główne pozycje literatury</w:t>
       </w:r>
       <w:bookmarkEnd w:id="4"/>
-      <w:proofErr w:type="spellEnd"/>
     </w:p>
     <w:p>
       <w:pPr>
@@ -5989,40 +3411,13 @@
         <w:ind w:left="360" w:hanging="360"/>
       </w:pPr>
       <w:r>
-        <w:t>[1]</w:t>
+        <w:t>[</w:t>
       </w:r>
       <w:r>
-        <w:tab/>
+        <w:t>1</w:t>
       </w:r>
       <w:r>
-        <w:t xml:space="preserve">J. Rak: </w:t>
-      </w:r>
-      <w:proofErr w:type="spellStart"/>
-      <w:r>
-        <w:t>Niezawodność</w:t>
-      </w:r>
-      <w:proofErr w:type="spellEnd"/>
-      <w:r>
-        <w:t xml:space="preserve"> </w:t>
-      </w:r>
-      <w:proofErr w:type="spellStart"/>
-      <w:r>
-        <w:t>systemów</w:t>
-      </w:r>
-      <w:proofErr w:type="spellEnd"/>
-      <w:r>
-        <w:t xml:space="preserve"> </w:t>
-      </w:r>
-      <w:proofErr w:type="spellStart"/>
-      <w:r>
-        <w:t>sieciowych</w:t>
-      </w:r>
-      <w:proofErr w:type="spellEnd"/>
-      <w:r>
-        <w:t xml:space="preserve"> – WYKŁAD 4</w:t>
-      </w:r>
-      <w:r>
-        <w:t>.</w:t>
+        <w:t>] M. Pióro, D. Medhi: Routing, Flow, and Capacity Design in Communication and Computer Networks, Elsevier, 2004.</w:t>
       </w:r>
     </w:p>
     <w:p>
@@ -6036,6 +3431,29 @@
       </w:pPr>
       <w:r>
         <w:t>[2]</w:t>
+      </w:r>
+      <w:r>
+        <w:tab/>
+        <w:t>Dijkstra, E. W., A note on two problems in connexion with graphs, Numerische Mathematik, 1, 269-271, 1959.</w:t>
+      </w:r>
+    </w:p>
+    <w:p>
+      <w:pPr>
+        <w:pStyle w:val="Listanumerowana"/>
+        <w:numPr>
+          <w:ilvl w:val="0"/>
+          <w:numId w:val="0"/>
+        </w:numPr>
+        <w:ind w:left="360" w:hanging="360"/>
+      </w:pPr>
+      <w:r>
+        <w:t>[</w:t>
+      </w:r>
+      <w:r>
+        <w:t>3</w:t>
+      </w:r>
+      <w:r>
+        <w:t>]</w:t>
       </w:r>
       <w:r>
         <w:tab/>
@@ -6054,7 +3472,13 @@
         <w:ind w:left="360" w:hanging="360"/>
       </w:pPr>
       <w:r>
-        <w:t>[3]</w:t>
+        <w:t>[</w:t>
+      </w:r>
+      <w:r>
+        <w:t>4</w:t>
+      </w:r>
+      <w:r>
+        <w:t>]</w:t>
       </w:r>
       <w:r>
         <w:tab/>
@@ -6081,37 +3505,16 @@
         <w:ind w:left="360" w:hanging="360"/>
       </w:pPr>
       <w:r>
-        <w:t>[4]</w:t>
+        <w:t>[</w:t>
       </w:r>
       <w:r>
-        <w:tab/>
+        <w:t>5</w:t>
       </w:r>
       <w:r>
-        <w:t xml:space="preserve">Dijkstra, E. W., A note on two problems in </w:t>
+        <w:t xml:space="preserve">] </w:t>
       </w:r>
-      <w:proofErr w:type="spellStart"/>
       <w:r>
-        <w:t>connexion</w:t>
-      </w:r>
-      <w:proofErr w:type="spellEnd"/>
-      <w:r>
-        <w:t xml:space="preserve"> with graphs, </w:t>
-      </w:r>
-      <w:proofErr w:type="spellStart"/>
-      <w:r>
-        <w:t>Numerische</w:t>
-      </w:r>
-      <w:proofErr w:type="spellEnd"/>
-      <w:r>
-        <w:t xml:space="preserve"> </w:t>
-      </w:r>
-      <w:proofErr w:type="spellStart"/>
-      <w:r>
-        <w:t>Mathematik</w:t>
-      </w:r>
-      <w:proofErr w:type="spellEnd"/>
-      <w:r>
-        <w:t>, 1, 269-271, 1959.</w:t>
+        <w:t>R. Bhandari: Survivable Networks: Algorithms for Diverse Routing, Kluwer Academic Publishers, 1999.</w:t>
       </w:r>
     </w:p>
     <w:p>
@@ -6124,26 +3527,47 @@
         <w:ind w:left="360" w:hanging="360"/>
       </w:pPr>
       <w:r>
-        <w:t>[5]</w:t>
+        <w:t>[6]</w:t>
       </w:r>
       <w:r>
         <w:tab/>
+        <w:t>J. Rak: Niezawodność systemów sieciowych – WYKŁAD 4.</w:t>
       </w:r>
-      <w:proofErr w:type="spellStart"/>
+    </w:p>
+    <w:p>
+      <w:pPr>
+        <w:pStyle w:val="Listanumerowana"/>
+        <w:numPr>
+          <w:ilvl w:val="0"/>
+          <w:numId w:val="0"/>
+        </w:numPr>
+        <w:ind w:left="360" w:hanging="360"/>
+      </w:pPr>
       <w:r>
-        <w:t>NetworkX</w:t>
+        <w:t>[</w:t>
       </w:r>
-      <w:proofErr w:type="spellEnd"/>
       <w:r>
-        <w:t xml:space="preserve"> Developers, </w:t>
+        <w:t>7</w:t>
       </w:r>
-      <w:proofErr w:type="spellStart"/>
       <w:r>
-        <w:t>NetworkX</w:t>
+        <w:t>] J. Rak: Resilient Routing in Communication Networks - A Systems Perspective, Second Edition, Springer, 2024.</w:t>
       </w:r>
-      <w:proofErr w:type="spellEnd"/>
+    </w:p>
+    <w:p>
+      <w:pPr>
+        <w:pStyle w:val="Listanumerowana"/>
+        <w:numPr>
+          <w:ilvl w:val="0"/>
+          <w:numId w:val="0"/>
+        </w:numPr>
+        <w:ind w:left="360" w:hanging="360"/>
+      </w:pPr>
       <w:r>
-        <w:t xml:space="preserve"> documentation, </w:t>
+        <w:t>[8]</w:t>
+      </w:r>
+      <w:r>
+        <w:tab/>
+        <w:t xml:space="preserve">NetworkX Developers, NetworkX documentation, </w:t>
       </w:r>
       <w:hyperlink r:id="rId11" w:history="1">
         <w:r>
@@ -6166,9 +3590,6 @@
         </w:numPr>
         <w:ind w:left="360" w:hanging="360"/>
       </w:pPr>
-      <w:r>
-        <w:t>[6] J. Rak: Resilient Routing in Communication Networks - A Systems Perspective, Second Edition, Springer, 2024.</w:t>
-      </w:r>
     </w:p>
     <w:p>
       <w:pPr>
@@ -6179,17 +3600,6 @@
         </w:numPr>
         <w:ind w:left="360" w:hanging="360"/>
       </w:pPr>
-      <w:r>
-        <w:t xml:space="preserve">[7] M. </w:t>
-      </w:r>
-      <w:proofErr w:type="spellStart"/>
-      <w:r>
-        <w:t>Pióro</w:t>
-      </w:r>
-      <w:proofErr w:type="spellEnd"/>
-      <w:r>
-        <w:t>, D. Medhi: Routing, Flow, and Capacity Design in Communication and Computer Networks, Elsevier, 2004.</w:t>
-      </w:r>
     </w:p>
     <w:p>
       <w:pPr>
@@ -6200,12 +3610,6 @@
         </w:numPr>
         <w:ind w:left="360" w:hanging="360"/>
       </w:pPr>
-      <w:r>
-        <w:t xml:space="preserve">[8] </w:t>
-      </w:r>
-      <w:r>
-        <w:t>R. Bhandari: Survivable Networks: Algorithms for Diverse Routing, Kluwer Academic Publishers, 1999.</w:t>
-      </w:r>
     </w:p>
     <w:sectPr>
       <w:footerReference w:type="default" r:id="rId12"/>
@@ -6416,7 +3820,7 @@
   <w:abstractNum w:abstractNumId="7" w15:restartNumberingAfterBreak="0">
     <w:nsid w:val="FFFFFF88"/>
     <w:multiLevelType w:val="singleLevel"/>
-    <w:tmpl w:val="65B068D0"/>
+    <w:tmpl w:val="59767370"/>
     <w:lvl w:ilvl="0">
       <w:start w:val="1"/>
       <w:numFmt w:val="decimal"/>
@@ -6597,6 +4001,12 @@
     <w:abstractNumId w:val="7"/>
   </w:num>
   <w:num w:numId="17" w16cid:durableId="453721179">
+    <w:abstractNumId w:val="7"/>
+  </w:num>
+  <w:num w:numId="18" w16cid:durableId="508714223">
+    <w:abstractNumId w:val="7"/>
+  </w:num>
+  <w:num w:numId="19" w16cid:durableId="1147477621">
     <w:abstractNumId w:val="7"/>
   </w:num>
 </w:numbering>

</xml_diff>